<commit_message>
Enlace a repositorio github
</commit_message>
<xml_diff>
--- a/Reporte_Entrega2.docx
+++ b/Reporte_Entrega2.docx
@@ -3518,22 +3518,22 @@
     <w:p>
       <w:pPr>
         <w:pStyle w:val="Normal"/>
-        <w:spacing w:before="280" w:after="80"/>
-        <w:rPr>
-          <w:rFonts w:ascii="Calibri" w:hAnsi="Calibri"/>
-          <w:b/>
-          <w:i w:val="false"/>
-          <w:color w:val="1654A2"/>
-          <w:sz w:val="28"/>
-        </w:rPr>
+        <w:rPr/>
       </w:pPr>
       <w:r>
-        <w:rPr>
-          <w:b/>
-          <w:i w:val="false"/>
-          <w:color w:val="1654A2"/>
-          <w:sz w:val="28"/>
-        </w:rPr>
+        <w:rPr/>
+        <w:t>Repositorio github</w:t>
+      </w:r>
+    </w:p>
+    <w:p>
+      <w:pPr>
+        <w:pStyle w:val="Normal"/>
+        <w:spacing w:before="0" w:after="200"/>
+        <w:rPr/>
+      </w:pPr>
+      <w:r>
+        <w:rPr/>
+        <w:t>https://github.com/j-mauro-r/microproyecto-tema3.git</w:t>
       </w:r>
     </w:p>
     <w:sectPr>

</xml_diff>

<commit_message>
Ajuste punto 3 4 y 5, listo para revision equipo
</commit_message>
<xml_diff>
--- a/Reporte_Entrega2.docx
+++ b/Reporte_Entrega2.docx
@@ -1479,30 +1479,58 @@
     </w:p>
     <w:p>
       <w:pPr>
-        <w:pStyle w:val="Normal"/>
-        <w:spacing w:before="0" w:after="120"/>
-        <w:jc w:val="both"/>
-        <w:rPr>
-          <w:rFonts w:ascii="Calibri" w:hAnsi="Calibri"/>
-          <w:b w:val="false"/>
-          <w:i w:val="false"/>
-          <w:sz w:val="22"/>
-        </w:rPr>
+        <w:pStyle w:val="BodyText"/>
+        <w:rPr/>
       </w:pPr>
       <w:r>
-        <w:rPr>
-          <w:b w:val="false"/>
-          <w:i w:val="false"/>
-          <w:sz w:val="22"/>
-        </w:rPr>
-        <w:t>Todos los entrenamientos se registran en el experimento 'dengue-brote-clasico' de MLflow. El servidor está desplegado en una instancia EC2 de AWS, accesible para todos los integrantes del equipo mediante la variable de entorno MLFLOW_TRACKING_URI. Para cada corrida se registran hiperparámetros, métricas de validación y prueba, umbral óptimo y el modelo serializado como artefacto. Los modelos XGBoost y LightGBM se registran además en el Registro de Modelos de MLflow, lo que permite cargarlos desde el tablero de predicciones sin acceso al sistema de archivos local. El repositorio incluye un archivo MLproject que permite lanzar cualquier entrenamiento con: mlflow run . -e train_xgboost (o train_logistic, train_gam, train_rf, train_lgbm).</w:t>
+        <w:rPr/>
+        <w:t>Todos los entrenamientos se registran en el experimento dengue-brote-clasico de un servidor MLflow en EC2 (AWS), compartido por el equipo vía MLFLOW_TRACKING_URI.</w:t>
       </w:r>
     </w:p>
     <w:p>
       <w:pPr>
+        <w:pStyle w:val="BodyText"/>
+        <w:rPr/>
+      </w:pPr>
+      <w:r>
+        <w:rPr/>
+        <w:t>Cada corrida guarda hiperparámetros, métricas de validación y prueba, umbral óptimo y el modelo serializado como artefacto.</w:t>
+      </w:r>
+    </w:p>
+    <w:p>
+      <w:pPr>
+        <w:pStyle w:val="BodyText"/>
+        <w:rPr/>
+      </w:pPr>
+      <w:r>
+        <w:rPr/>
+        <w:t>XGBoost y LightGBM se publican además en el Model Registry, para cargarlos desde el tablero sin acceso al sistema de archivos local.</w:t>
+      </w:r>
+    </w:p>
+    <w:p>
+      <w:pPr>
+        <w:pStyle w:val="BodyText"/>
+        <w:rPr/>
+      </w:pPr>
+      <w:r>
+        <w:rPr/>
+        <w:t>El repo incluye un MLproject: mlflow run . -e train_xgboost (o train_logistic, train_gam, train_rf, train_lgbm).</w:t>
+      </w:r>
+    </w:p>
+    <w:p>
+      <w:pPr>
+        <w:pStyle w:val="BodyText"/>
+        <w:rPr/>
+      </w:pPr>
+      <w:r>
+        <w:rPr/>
+      </w:r>
+    </w:p>
+    <w:p>
+      <w:pPr>
         <w:pStyle w:val="Normal"/>
         <w:spacing w:before="0" w:after="120"/>
-        <w:jc w:val="both"/>
+        <w:jc w:val="center"/>
         <w:rPr>
           <w:rFonts w:ascii="Calibri" w:hAnsi="Calibri"/>
           <w:b w:val="false"/>
@@ -1573,7 +1601,7 @@
       <w:pPr>
         <w:pStyle w:val="Normal"/>
         <w:spacing w:before="0" w:after="120"/>
-        <w:jc w:val="both"/>
+        <w:jc w:val="center"/>
         <w:rPr>
           <w:rFonts w:ascii="Calibri" w:hAnsi="Calibri"/>
           <w:b w:val="false"/>
@@ -1675,7 +1703,7 @@
     <w:tbl>
       <w:tblPr>
         <w:tblStyle w:val="TableGrid"/>
-        <w:tblW w:w="8844" w:type="dxa"/>
+        <w:tblW w:w="8824" w:type="dxa"/>
         <w:jc w:val="center"/>
         <w:tblInd w:w="0" w:type="dxa"/>
         <w:tblLayout w:type="fixed"/>
@@ -1689,11 +1717,11 @@
       </w:tblPr>
       <w:tblGrid>
         <w:gridCol w:w="1474"/>
-        <w:gridCol w:w="1473"/>
-        <w:gridCol w:w="1475"/>
-        <w:gridCol w:w="1474"/>
-        <w:gridCol w:w="1473"/>
-        <w:gridCol w:w="1475"/>
+        <w:gridCol w:w="1226"/>
+        <w:gridCol w:w="1447"/>
+        <w:gridCol w:w="1341"/>
+        <w:gridCol w:w="1077"/>
+        <w:gridCol w:w="2259"/>
       </w:tblGrid>
       <w:tr>
         <w:trPr/>
@@ -1732,7 +1760,7 @@
         </w:tc>
         <w:tc>
           <w:tcPr>
-            <w:tcW w:w="1473" w:type="dxa"/>
+            <w:tcW w:w="1226" w:type="dxa"/>
             <w:tcBorders/>
             <w:shd w:fill="1654A2" w:val="clear"/>
           </w:tcPr>
@@ -1765,7 +1793,7 @@
         </w:tc>
         <w:tc>
           <w:tcPr>
-            <w:tcW w:w="1475" w:type="dxa"/>
+            <w:tcW w:w="1447" w:type="dxa"/>
             <w:tcBorders/>
             <w:shd w:fill="1654A2" w:val="clear"/>
           </w:tcPr>
@@ -1798,7 +1826,7 @@
         </w:tc>
         <w:tc>
           <w:tcPr>
-            <w:tcW w:w="1474" w:type="dxa"/>
+            <w:tcW w:w="1341" w:type="dxa"/>
             <w:tcBorders/>
             <w:shd w:fill="1654A2" w:val="clear"/>
           </w:tcPr>
@@ -1831,7 +1859,7 @@
         </w:tc>
         <w:tc>
           <w:tcPr>
-            <w:tcW w:w="1473" w:type="dxa"/>
+            <w:tcW w:w="1077" w:type="dxa"/>
             <w:tcBorders/>
             <w:shd w:fill="1654A2" w:val="clear"/>
           </w:tcPr>
@@ -1864,7 +1892,7 @@
         </w:tc>
         <w:tc>
           <w:tcPr>
-            <w:tcW w:w="1475" w:type="dxa"/>
+            <w:tcW w:w="2259" w:type="dxa"/>
             <w:tcBorders/>
             <w:shd w:fill="1654A2" w:val="clear"/>
           </w:tcPr>
@@ -1931,7 +1959,7 @@
         </w:tc>
         <w:tc>
           <w:tcPr>
-            <w:tcW w:w="1473" w:type="dxa"/>
+            <w:tcW w:w="1226" w:type="dxa"/>
             <w:tcBorders/>
             <w:shd w:fill="E8F0FB" w:val="clear"/>
           </w:tcPr>
@@ -1940,7 +1968,7 @@
               <w:pStyle w:val="Normal"/>
               <w:widowControl/>
               <w:spacing w:lineRule="auto" w:line="240" w:before="0" w:after="0"/>
-              <w:jc w:val="start"/>
+              <w:jc w:val="center"/>
               <w:rPr>
                 <w:rFonts w:eastAsia="ＭＳ 明朝" w:cs=""/>
                 <w:kern w:val="0"/>
@@ -1962,7 +1990,7 @@
         </w:tc>
         <w:tc>
           <w:tcPr>
-            <w:tcW w:w="1475" w:type="dxa"/>
+            <w:tcW w:w="1447" w:type="dxa"/>
             <w:tcBorders/>
             <w:shd w:fill="E8F0FB" w:val="clear"/>
           </w:tcPr>
@@ -1971,7 +1999,7 @@
               <w:pStyle w:val="Normal"/>
               <w:widowControl/>
               <w:spacing w:lineRule="auto" w:line="240" w:before="0" w:after="0"/>
-              <w:jc w:val="start"/>
+              <w:jc w:val="center"/>
               <w:rPr>
                 <w:rFonts w:eastAsia="ＭＳ 明朝" w:cs=""/>
                 <w:kern w:val="0"/>
@@ -1993,7 +2021,7 @@
         </w:tc>
         <w:tc>
           <w:tcPr>
-            <w:tcW w:w="1474" w:type="dxa"/>
+            <w:tcW w:w="1341" w:type="dxa"/>
             <w:tcBorders/>
             <w:shd w:fill="E8F0FB" w:val="clear"/>
           </w:tcPr>
@@ -2002,7 +2030,7 @@
               <w:pStyle w:val="Normal"/>
               <w:widowControl/>
               <w:spacing w:lineRule="auto" w:line="240" w:before="0" w:after="0"/>
-              <w:jc w:val="start"/>
+              <w:jc w:val="center"/>
               <w:rPr>
                 <w:rFonts w:eastAsia="ＭＳ 明朝" w:cs=""/>
                 <w:kern w:val="0"/>
@@ -2024,7 +2052,7 @@
         </w:tc>
         <w:tc>
           <w:tcPr>
-            <w:tcW w:w="1473" w:type="dxa"/>
+            <w:tcW w:w="1077" w:type="dxa"/>
             <w:tcBorders/>
             <w:shd w:fill="E8F0FB" w:val="clear"/>
           </w:tcPr>
@@ -2033,7 +2061,7 @@
               <w:pStyle w:val="Normal"/>
               <w:widowControl/>
               <w:spacing w:lineRule="auto" w:line="240" w:before="0" w:after="0"/>
-              <w:jc w:val="start"/>
+              <w:jc w:val="center"/>
               <w:rPr>
                 <w:rFonts w:eastAsia="ＭＳ 明朝" w:cs=""/>
                 <w:kern w:val="0"/>
@@ -2055,7 +2083,7 @@
         </w:tc>
         <w:tc>
           <w:tcPr>
-            <w:tcW w:w="1475" w:type="dxa"/>
+            <w:tcW w:w="2259" w:type="dxa"/>
             <w:tcBorders/>
             <w:shd w:fill="E8F0FB" w:val="clear"/>
           </w:tcPr>
@@ -2064,10 +2092,11 @@
               <w:pStyle w:val="Normal"/>
               <w:widowControl/>
               <w:spacing w:lineRule="auto" w:line="240" w:before="0" w:after="0"/>
-              <w:jc w:val="start"/>
+              <w:jc w:val="center"/>
               <w:rPr>
                 <w:rFonts w:eastAsia="ＭＳ 明朝" w:cs=""/>
                 <w:kern w:val="0"/>
+                <w:sz w:val="22"/>
                 <w:szCs w:val="22"/>
                 <w:lang w:val="en-US" w:eastAsia="en-US" w:bidi="ar-SA"/>
               </w:rPr>
@@ -2076,7 +2105,7 @@
               <w:rPr>
                 <w:rFonts w:eastAsia="ＭＳ 明朝" w:cs=""/>
                 <w:kern w:val="0"/>
-                <w:sz w:val="20"/>
+                <w:sz w:val="22"/>
                 <w:szCs w:val="22"/>
                 <w:lang w:val="en-US" w:eastAsia="en-US" w:bidi="ar-SA"/>
               </w:rPr>
@@ -2119,7 +2148,7 @@
         </w:tc>
         <w:tc>
           <w:tcPr>
-            <w:tcW w:w="1473" w:type="dxa"/>
+            <w:tcW w:w="1226" w:type="dxa"/>
             <w:tcBorders/>
           </w:tcPr>
           <w:p>
@@ -2127,7 +2156,7 @@
               <w:pStyle w:val="Normal"/>
               <w:widowControl/>
               <w:spacing w:lineRule="auto" w:line="240" w:before="0" w:after="0"/>
-              <w:jc w:val="start"/>
+              <w:jc w:val="center"/>
               <w:rPr>
                 <w:rFonts w:eastAsia="ＭＳ 明朝" w:cs=""/>
                 <w:kern w:val="0"/>
@@ -2149,7 +2178,7 @@
         </w:tc>
         <w:tc>
           <w:tcPr>
-            <w:tcW w:w="1475" w:type="dxa"/>
+            <w:tcW w:w="1447" w:type="dxa"/>
             <w:tcBorders/>
           </w:tcPr>
           <w:p>
@@ -2157,7 +2186,7 @@
               <w:pStyle w:val="Normal"/>
               <w:widowControl/>
               <w:spacing w:lineRule="auto" w:line="240" w:before="0" w:after="0"/>
-              <w:jc w:val="start"/>
+              <w:jc w:val="center"/>
               <w:rPr>
                 <w:rFonts w:eastAsia="ＭＳ 明朝" w:cs=""/>
                 <w:kern w:val="0"/>
@@ -2179,7 +2208,7 @@
         </w:tc>
         <w:tc>
           <w:tcPr>
-            <w:tcW w:w="1474" w:type="dxa"/>
+            <w:tcW w:w="1341" w:type="dxa"/>
             <w:tcBorders/>
           </w:tcPr>
           <w:p>
@@ -2187,7 +2216,7 @@
               <w:pStyle w:val="Normal"/>
               <w:widowControl/>
               <w:spacing w:lineRule="auto" w:line="240" w:before="0" w:after="0"/>
-              <w:jc w:val="start"/>
+              <w:jc w:val="center"/>
               <w:rPr>
                 <w:rFonts w:eastAsia="ＭＳ 明朝" w:cs=""/>
                 <w:kern w:val="0"/>
@@ -2209,7 +2238,7 @@
         </w:tc>
         <w:tc>
           <w:tcPr>
-            <w:tcW w:w="1473" w:type="dxa"/>
+            <w:tcW w:w="1077" w:type="dxa"/>
             <w:tcBorders/>
           </w:tcPr>
           <w:p>
@@ -2217,7 +2246,7 @@
               <w:pStyle w:val="Normal"/>
               <w:widowControl/>
               <w:spacing w:lineRule="auto" w:line="240" w:before="0" w:after="0"/>
-              <w:jc w:val="start"/>
+              <w:jc w:val="center"/>
               <w:rPr>
                 <w:rFonts w:eastAsia="ＭＳ 明朝" w:cs=""/>
                 <w:kern w:val="0"/>
@@ -2239,7 +2268,7 @@
         </w:tc>
         <w:tc>
           <w:tcPr>
-            <w:tcW w:w="1475" w:type="dxa"/>
+            <w:tcW w:w="2259" w:type="dxa"/>
             <w:tcBorders/>
           </w:tcPr>
           <w:p>
@@ -2247,10 +2276,11 @@
               <w:pStyle w:val="Normal"/>
               <w:widowControl/>
               <w:spacing w:lineRule="auto" w:line="240" w:before="0" w:after="0"/>
-              <w:jc w:val="start"/>
+              <w:jc w:val="center"/>
               <w:rPr>
                 <w:rFonts w:eastAsia="ＭＳ 明朝" w:cs=""/>
                 <w:kern w:val="0"/>
+                <w:sz w:val="22"/>
                 <w:szCs w:val="22"/>
                 <w:lang w:val="en-US" w:eastAsia="en-US" w:bidi="ar-SA"/>
               </w:rPr>
@@ -2259,7 +2289,7 @@
               <w:rPr>
                 <w:rFonts w:eastAsia="ＭＳ 明朝" w:cs=""/>
                 <w:kern w:val="0"/>
-                <w:sz w:val="20"/>
+                <w:sz w:val="22"/>
                 <w:szCs w:val="22"/>
                 <w:lang w:val="en-US" w:eastAsia="en-US" w:bidi="ar-SA"/>
               </w:rPr>
@@ -2302,7 +2332,7 @@
         </w:tc>
         <w:tc>
           <w:tcPr>
-            <w:tcW w:w="1473" w:type="dxa"/>
+            <w:tcW w:w="1226" w:type="dxa"/>
             <w:tcBorders/>
           </w:tcPr>
           <w:p>
@@ -2310,7 +2340,7 @@
               <w:pStyle w:val="Normal"/>
               <w:widowControl/>
               <w:spacing w:lineRule="auto" w:line="240" w:before="0" w:after="0"/>
-              <w:jc w:val="start"/>
+              <w:jc w:val="center"/>
               <w:rPr>
                 <w:rFonts w:eastAsia="ＭＳ 明朝" w:cs=""/>
                 <w:kern w:val="0"/>
@@ -2332,7 +2362,7 @@
         </w:tc>
         <w:tc>
           <w:tcPr>
-            <w:tcW w:w="1475" w:type="dxa"/>
+            <w:tcW w:w="1447" w:type="dxa"/>
             <w:tcBorders/>
           </w:tcPr>
           <w:p>
@@ -2340,7 +2370,7 @@
               <w:pStyle w:val="Normal"/>
               <w:widowControl/>
               <w:spacing w:lineRule="auto" w:line="240" w:before="0" w:after="0"/>
-              <w:jc w:val="start"/>
+              <w:jc w:val="center"/>
               <w:rPr>
                 <w:rFonts w:eastAsia="ＭＳ 明朝" w:cs=""/>
                 <w:kern w:val="0"/>
@@ -2362,7 +2392,7 @@
         </w:tc>
         <w:tc>
           <w:tcPr>
-            <w:tcW w:w="1474" w:type="dxa"/>
+            <w:tcW w:w="1341" w:type="dxa"/>
             <w:tcBorders/>
           </w:tcPr>
           <w:p>
@@ -2370,7 +2400,7 @@
               <w:pStyle w:val="Normal"/>
               <w:widowControl/>
               <w:spacing w:lineRule="auto" w:line="240" w:before="0" w:after="0"/>
-              <w:jc w:val="start"/>
+              <w:jc w:val="center"/>
               <w:rPr>
                 <w:rFonts w:eastAsia="ＭＳ 明朝" w:cs=""/>
                 <w:kern w:val="0"/>
@@ -2392,7 +2422,7 @@
         </w:tc>
         <w:tc>
           <w:tcPr>
-            <w:tcW w:w="1473" w:type="dxa"/>
+            <w:tcW w:w="1077" w:type="dxa"/>
             <w:tcBorders/>
           </w:tcPr>
           <w:p>
@@ -2400,7 +2430,7 @@
               <w:pStyle w:val="Normal"/>
               <w:widowControl/>
               <w:spacing w:lineRule="auto" w:line="240" w:before="0" w:after="0"/>
-              <w:jc w:val="start"/>
+              <w:jc w:val="center"/>
               <w:rPr>
                 <w:rFonts w:eastAsia="ＭＳ 明朝" w:cs=""/>
                 <w:kern w:val="0"/>
@@ -2422,7 +2452,7 @@
         </w:tc>
         <w:tc>
           <w:tcPr>
-            <w:tcW w:w="1475" w:type="dxa"/>
+            <w:tcW w:w="2259" w:type="dxa"/>
             <w:tcBorders/>
           </w:tcPr>
           <w:p>
@@ -2430,10 +2460,11 @@
               <w:pStyle w:val="Normal"/>
               <w:widowControl/>
               <w:spacing w:lineRule="auto" w:line="240" w:before="0" w:after="0"/>
-              <w:jc w:val="start"/>
+              <w:jc w:val="center"/>
               <w:rPr>
                 <w:rFonts w:eastAsia="ＭＳ 明朝" w:cs=""/>
                 <w:kern w:val="0"/>
+                <w:sz w:val="22"/>
                 <w:szCs w:val="22"/>
                 <w:lang w:val="en-US" w:eastAsia="en-US" w:bidi="ar-SA"/>
               </w:rPr>
@@ -2442,7 +2473,7 @@
               <w:rPr>
                 <w:rFonts w:eastAsia="ＭＳ 明朝" w:cs=""/>
                 <w:kern w:val="0"/>
-                <w:sz w:val="20"/>
+                <w:sz w:val="22"/>
                 <w:szCs w:val="22"/>
                 <w:lang w:val="en-US" w:eastAsia="en-US" w:bidi="ar-SA"/>
               </w:rPr>
@@ -2485,7 +2516,7 @@
         </w:tc>
         <w:tc>
           <w:tcPr>
-            <w:tcW w:w="1473" w:type="dxa"/>
+            <w:tcW w:w="1226" w:type="dxa"/>
             <w:tcBorders/>
           </w:tcPr>
           <w:p>
@@ -2493,7 +2524,7 @@
               <w:pStyle w:val="Normal"/>
               <w:widowControl/>
               <w:spacing w:lineRule="auto" w:line="240" w:before="0" w:after="0"/>
-              <w:jc w:val="start"/>
+              <w:jc w:val="center"/>
               <w:rPr>
                 <w:rFonts w:eastAsia="ＭＳ 明朝" w:cs=""/>
                 <w:kern w:val="0"/>
@@ -2515,7 +2546,7 @@
         </w:tc>
         <w:tc>
           <w:tcPr>
-            <w:tcW w:w="1475" w:type="dxa"/>
+            <w:tcW w:w="1447" w:type="dxa"/>
             <w:tcBorders/>
           </w:tcPr>
           <w:p>
@@ -2523,7 +2554,7 @@
               <w:pStyle w:val="Normal"/>
               <w:widowControl/>
               <w:spacing w:lineRule="auto" w:line="240" w:before="0" w:after="0"/>
-              <w:jc w:val="start"/>
+              <w:jc w:val="center"/>
               <w:rPr>
                 <w:rFonts w:eastAsia="ＭＳ 明朝" w:cs=""/>
                 <w:kern w:val="0"/>
@@ -2545,7 +2576,7 @@
         </w:tc>
         <w:tc>
           <w:tcPr>
-            <w:tcW w:w="1474" w:type="dxa"/>
+            <w:tcW w:w="1341" w:type="dxa"/>
             <w:tcBorders/>
           </w:tcPr>
           <w:p>
@@ -2553,7 +2584,7 @@
               <w:pStyle w:val="Normal"/>
               <w:widowControl/>
               <w:spacing w:lineRule="auto" w:line="240" w:before="0" w:after="0"/>
-              <w:jc w:val="start"/>
+              <w:jc w:val="center"/>
               <w:rPr>
                 <w:rFonts w:eastAsia="ＭＳ 明朝" w:cs=""/>
                 <w:kern w:val="0"/>
@@ -2575,7 +2606,7 @@
         </w:tc>
         <w:tc>
           <w:tcPr>
-            <w:tcW w:w="1473" w:type="dxa"/>
+            <w:tcW w:w="1077" w:type="dxa"/>
             <w:tcBorders/>
           </w:tcPr>
           <w:p>
@@ -2583,7 +2614,7 @@
               <w:pStyle w:val="Normal"/>
               <w:widowControl/>
               <w:spacing w:lineRule="auto" w:line="240" w:before="0" w:after="0"/>
-              <w:jc w:val="start"/>
+              <w:jc w:val="center"/>
               <w:rPr>
                 <w:rFonts w:eastAsia="ＭＳ 明朝" w:cs=""/>
                 <w:kern w:val="0"/>
@@ -2605,7 +2636,7 @@
         </w:tc>
         <w:tc>
           <w:tcPr>
-            <w:tcW w:w="1475" w:type="dxa"/>
+            <w:tcW w:w="2259" w:type="dxa"/>
             <w:tcBorders/>
           </w:tcPr>
           <w:p>
@@ -2613,10 +2644,11 @@
               <w:pStyle w:val="Normal"/>
               <w:widowControl/>
               <w:spacing w:lineRule="auto" w:line="240" w:before="0" w:after="0"/>
-              <w:jc w:val="start"/>
+              <w:jc w:val="center"/>
               <w:rPr>
                 <w:rFonts w:eastAsia="ＭＳ 明朝" w:cs=""/>
                 <w:kern w:val="0"/>
+                <w:sz w:val="22"/>
                 <w:szCs w:val="22"/>
                 <w:lang w:val="en-US" w:eastAsia="en-US" w:bidi="ar-SA"/>
               </w:rPr>
@@ -2625,7 +2657,7 @@
               <w:rPr>
                 <w:rFonts w:eastAsia="ＭＳ 明朝" w:cs=""/>
                 <w:kern w:val="0"/>
-                <w:sz w:val="20"/>
+                <w:sz w:val="22"/>
                 <w:szCs w:val="22"/>
                 <w:lang w:val="en-US" w:eastAsia="en-US" w:bidi="ar-SA"/>
               </w:rPr>
@@ -2668,7 +2700,7 @@
         </w:tc>
         <w:tc>
           <w:tcPr>
-            <w:tcW w:w="1473" w:type="dxa"/>
+            <w:tcW w:w="1226" w:type="dxa"/>
             <w:tcBorders/>
           </w:tcPr>
           <w:p>
@@ -2676,7 +2708,7 @@
               <w:pStyle w:val="Normal"/>
               <w:widowControl/>
               <w:spacing w:lineRule="auto" w:line="240" w:before="0" w:after="0"/>
-              <w:jc w:val="start"/>
+              <w:jc w:val="center"/>
               <w:rPr>
                 <w:rFonts w:eastAsia="ＭＳ 明朝" w:cs=""/>
                 <w:kern w:val="0"/>
@@ -2698,7 +2730,7 @@
         </w:tc>
         <w:tc>
           <w:tcPr>
-            <w:tcW w:w="1475" w:type="dxa"/>
+            <w:tcW w:w="1447" w:type="dxa"/>
             <w:tcBorders/>
           </w:tcPr>
           <w:p>
@@ -2706,7 +2738,7 @@
               <w:pStyle w:val="Normal"/>
               <w:widowControl/>
               <w:spacing w:lineRule="auto" w:line="240" w:before="0" w:after="0"/>
-              <w:jc w:val="start"/>
+              <w:jc w:val="center"/>
               <w:rPr>
                 <w:rFonts w:eastAsia="ＭＳ 明朝" w:cs=""/>
                 <w:kern w:val="0"/>
@@ -2728,7 +2760,7 @@
         </w:tc>
         <w:tc>
           <w:tcPr>
-            <w:tcW w:w="1474" w:type="dxa"/>
+            <w:tcW w:w="1341" w:type="dxa"/>
             <w:tcBorders/>
           </w:tcPr>
           <w:p>
@@ -2736,7 +2768,7 @@
               <w:pStyle w:val="Normal"/>
               <w:widowControl/>
               <w:spacing w:lineRule="auto" w:line="240" w:before="0" w:after="0"/>
-              <w:jc w:val="start"/>
+              <w:jc w:val="center"/>
               <w:rPr>
                 <w:rFonts w:eastAsia="ＭＳ 明朝" w:cs=""/>
                 <w:kern w:val="0"/>
@@ -2758,7 +2790,7 @@
         </w:tc>
         <w:tc>
           <w:tcPr>
-            <w:tcW w:w="1473" w:type="dxa"/>
+            <w:tcW w:w="1077" w:type="dxa"/>
             <w:tcBorders/>
           </w:tcPr>
           <w:p>
@@ -2766,7 +2798,7 @@
               <w:pStyle w:val="Normal"/>
               <w:widowControl/>
               <w:spacing w:lineRule="auto" w:line="240" w:before="0" w:after="0"/>
-              <w:jc w:val="start"/>
+              <w:jc w:val="center"/>
               <w:rPr>
                 <w:rFonts w:eastAsia="ＭＳ 明朝" w:cs=""/>
                 <w:kern w:val="0"/>
@@ -2788,7 +2820,7 @@
         </w:tc>
         <w:tc>
           <w:tcPr>
-            <w:tcW w:w="1475" w:type="dxa"/>
+            <w:tcW w:w="2259" w:type="dxa"/>
             <w:tcBorders/>
           </w:tcPr>
           <w:p>
@@ -2796,10 +2828,11 @@
               <w:pStyle w:val="Normal"/>
               <w:widowControl/>
               <w:spacing w:lineRule="auto" w:line="240" w:before="0" w:after="0"/>
-              <w:jc w:val="start"/>
+              <w:jc w:val="center"/>
               <w:rPr>
                 <w:rFonts w:eastAsia="ＭＳ 明朝" w:cs=""/>
                 <w:kern w:val="0"/>
+                <w:sz w:val="22"/>
                 <w:szCs w:val="22"/>
                 <w:lang w:val="en-US" w:eastAsia="en-US" w:bidi="ar-SA"/>
               </w:rPr>
@@ -2808,7 +2841,7 @@
               <w:rPr>
                 <w:rFonts w:eastAsia="ＭＳ 明朝" w:cs=""/>
                 <w:kern w:val="0"/>
-                <w:sz w:val="20"/>
+                <w:sz w:val="22"/>
                 <w:szCs w:val="22"/>
                 <w:lang w:val="en-US" w:eastAsia="en-US" w:bidi="ar-SA"/>
               </w:rPr>
@@ -2845,13 +2878,13 @@
                 <w:szCs w:val="22"/>
                 <w:lang w:val="en-US" w:eastAsia="en-US" w:bidi="ar-SA"/>
               </w:rPr>
-              <w:t>Canal endemico</w:t>
+              <w:t>C. endemico</w:t>
             </w:r>
           </w:p>
         </w:tc>
         <w:tc>
           <w:tcPr>
-            <w:tcW w:w="1473" w:type="dxa"/>
+            <w:tcW w:w="1226" w:type="dxa"/>
             <w:tcBorders/>
           </w:tcPr>
           <w:p>
@@ -2859,7 +2892,7 @@
               <w:pStyle w:val="Normal"/>
               <w:widowControl/>
               <w:spacing w:lineRule="auto" w:line="240" w:before="0" w:after="0"/>
-              <w:jc w:val="start"/>
+              <w:jc w:val="center"/>
               <w:rPr>
                 <w:rFonts w:eastAsia="ＭＳ 明朝" w:cs=""/>
                 <w:kern w:val="0"/>
@@ -2881,7 +2914,7 @@
         </w:tc>
         <w:tc>
           <w:tcPr>
-            <w:tcW w:w="1475" w:type="dxa"/>
+            <w:tcW w:w="1447" w:type="dxa"/>
             <w:tcBorders/>
           </w:tcPr>
           <w:p>
@@ -2889,7 +2922,7 @@
               <w:pStyle w:val="Normal"/>
               <w:widowControl/>
               <w:spacing w:lineRule="auto" w:line="240" w:before="0" w:after="0"/>
-              <w:jc w:val="start"/>
+              <w:jc w:val="center"/>
               <w:rPr>
                 <w:rFonts w:eastAsia="ＭＳ 明朝" w:cs=""/>
                 <w:kern w:val="0"/>
@@ -2911,7 +2944,7 @@
         </w:tc>
         <w:tc>
           <w:tcPr>
-            <w:tcW w:w="1474" w:type="dxa"/>
+            <w:tcW w:w="1341" w:type="dxa"/>
             <w:tcBorders/>
           </w:tcPr>
           <w:p>
@@ -2919,7 +2952,7 @@
               <w:pStyle w:val="Normal"/>
               <w:widowControl/>
               <w:spacing w:lineRule="auto" w:line="240" w:before="0" w:after="0"/>
-              <w:jc w:val="start"/>
+              <w:jc w:val="center"/>
               <w:rPr>
                 <w:rFonts w:eastAsia="ＭＳ 明朝" w:cs=""/>
                 <w:kern w:val="0"/>
@@ -2941,7 +2974,7 @@
         </w:tc>
         <w:tc>
           <w:tcPr>
-            <w:tcW w:w="1473" w:type="dxa"/>
+            <w:tcW w:w="1077" w:type="dxa"/>
             <w:tcBorders/>
           </w:tcPr>
           <w:p>
@@ -2949,7 +2982,7 @@
               <w:pStyle w:val="Normal"/>
               <w:widowControl/>
               <w:spacing w:lineRule="auto" w:line="240" w:before="0" w:after="0"/>
-              <w:jc w:val="start"/>
+              <w:jc w:val="center"/>
               <w:rPr>
                 <w:rFonts w:eastAsia="ＭＳ 明朝" w:cs=""/>
                 <w:kern w:val="0"/>
@@ -2971,7 +3004,7 @@
         </w:tc>
         <w:tc>
           <w:tcPr>
-            <w:tcW w:w="1475" w:type="dxa"/>
+            <w:tcW w:w="2259" w:type="dxa"/>
             <w:tcBorders/>
           </w:tcPr>
           <w:p>
@@ -2979,10 +3012,11 @@
               <w:pStyle w:val="Normal"/>
               <w:widowControl/>
               <w:spacing w:lineRule="auto" w:line="240" w:before="0" w:after="0"/>
-              <w:jc w:val="start"/>
+              <w:jc w:val="center"/>
               <w:rPr>
                 <w:rFonts w:eastAsia="ＭＳ 明朝" w:cs=""/>
                 <w:kern w:val="0"/>
+                <w:sz w:val="22"/>
                 <w:szCs w:val="22"/>
                 <w:lang w:val="en-US" w:eastAsia="en-US" w:bidi="ar-SA"/>
               </w:rPr>
@@ -2991,7 +3025,7 @@
               <w:rPr>
                 <w:rFonts w:eastAsia="ＭＳ 明朝" w:cs=""/>
                 <w:kern w:val="0"/>
-                <w:sz w:val="20"/>
+                <w:sz w:val="22"/>
                 <w:szCs w:val="22"/>
                 <w:lang w:val="en-US" w:eastAsia="en-US" w:bidi="ar-SA"/>
               </w:rPr>
@@ -3004,17 +3038,34 @@
     <w:p>
       <w:pPr>
         <w:pStyle w:val="Normal"/>
-        <w:rPr/>
+        <w:spacing w:before="0" w:after="200"/>
+        <w:jc w:val="center"/>
+        <w:rPr>
+          <w:rFonts w:ascii="Calibri" w:hAnsi="Calibri"/>
+          <w:b w:val="false"/>
+          <w:i/>
+          <w:sz w:val="22"/>
+        </w:rPr>
       </w:pPr>
       <w:r>
-        <w:rPr/>
+        <w:rPr>
+          <w:b w:val="false"/>
+          <w:i/>
+          <w:sz w:val="22"/>
+        </w:rPr>
       </w:r>
     </w:p>
     <w:p>
       <w:pPr>
         <w:pStyle w:val="Normal"/>
         <w:spacing w:before="0" w:after="200"/>
-        <w:rPr/>
+        <w:jc w:val="center"/>
+        <w:rPr>
+          <w:rFonts w:ascii="Calibri" w:hAnsi="Calibri"/>
+          <w:b w:val="false"/>
+          <w:i/>
+          <w:sz w:val="22"/>
+        </w:rPr>
       </w:pPr>
       <w:r>
         <w:rPr>
@@ -3094,7 +3145,12 @@
         <w:pStyle w:val="Normal"/>
         <w:spacing w:before="0" w:after="120"/>
         <w:jc w:val="both"/>
-        <w:rPr/>
+        <w:rPr>
+          <w:rFonts w:ascii="Calibri" w:hAnsi="Calibri"/>
+          <w:b w:val="false"/>
+          <w:i w:val="false"/>
+          <w:sz w:val="22"/>
+        </w:rPr>
       </w:pPr>
       <w:r>
         <w:rPr>
@@ -3103,6 +3159,26 @@
           <w:sz w:val="22"/>
         </w:rPr>
         <w:t>La Figura 4 muestra el hallazgo más relevante desde la perspectiva del negocio: el porcentaje de inicios de brote detectados por cada modelo. La persistencia (práctica actual) detecta 0% de los inicios, ya que por definición solo puede confirmar un brote en curso, nunca anticiparlo. El canal endémico detecta el 18%. XGBoost y LightGBM alcanzan el 32% y 28% respectivamente, casi el doble que la práctica actual. Este es el valor agregado real del modelo: anticipar el inicio de un episodio epidémico con al menos un mes de antelación.</w:t>
+      </w:r>
+    </w:p>
+    <w:p>
+      <w:pPr>
+        <w:pStyle w:val="Normal"/>
+        <w:spacing w:before="0" w:after="120"/>
+        <w:jc w:val="both"/>
+        <w:rPr>
+          <w:rFonts w:ascii="Calibri" w:hAnsi="Calibri"/>
+          <w:b w:val="false"/>
+          <w:i w:val="false"/>
+          <w:sz w:val="22"/>
+        </w:rPr>
+      </w:pPr>
+      <w:r>
+        <w:rPr>
+          <w:b w:val="false"/>
+          <w:i w:val="false"/>
+          <w:sz w:val="22"/>
+        </w:rPr>
       </w:r>
     </w:p>
     <w:p>
@@ -3263,9 +3339,7 @@
     </w:p>
     <w:p>
       <w:pPr>
-        <w:pStyle w:val="Normal"/>
-        <w:spacing w:before="0" w:after="120"/>
-        <w:jc w:val="both"/>
+        <w:pStyle w:val="BodyText"/>
         <w:rPr/>
       </w:pPr>
       <w:r>
@@ -3274,35 +3348,282 @@
           <w:i w:val="false"/>
           <w:sz w:val="22"/>
         </w:rPr>
-        <w:t>La arquitectura del sistema BIOMAC separa la capa de modelos de la capa de presentación mediante un contrato de API versionado (v1.1.0). El backend expone un endpoint FastAPI POST /api/v1/predictions que acepta municipios, mes de referencia y horizontes T+1/T+2, ejecuta el pipeline completo de features y devuelve una respuesta JSON estructurada con label (EXCESO/NO_EXCESO), probabilidad calibrada, regla de decisión, métricas de evaluación local y explicación SHAP. El frontend solo consume esta respuesta sin reconstruir ninguna lógica epidemiológica.</w:t>
+        <w:t>Arquitectura y API</w:t>
       </w:r>
     </w:p>
     <w:p>
       <w:pPr>
-        <w:pStyle w:val="Normal"/>
-        <w:spacing w:before="0" w:after="120"/>
-        <w:jc w:val="both"/>
-        <w:rPr>
-          <w:rFonts w:ascii="Calibri" w:hAnsi="Calibri"/>
-          <w:b w:val="false"/>
-          <w:i w:val="false"/>
-          <w:sz w:val="22"/>
-        </w:rPr>
+        <w:pStyle w:val="BodyText"/>
+        <w:rPr/>
       </w:pPr>
       <w:r>
-        <w:rPr>
-          <w:b w:val="false"/>
-          <w:i w:val="false"/>
-          <w:sz w:val="22"/>
-        </w:rPr>
-        <w:t>Las salidas del modelo cubren los tres campos que el contrato de API v1.1.0 declara opcionales pero deseables: (1) probabilidades calibradas — la calibración isotónica reduce el error Brier de XGBoost un 24%, permitiendo presentar en el tablero '62% de probabilidad de brote' con validez estadística; (2) prediction_history — se persiste un registro histórico de 92 inferencias (T+1 y T+2, Bucaramanga y Cali) con periodo, horizonte, probabilidad calibrada, umbral, label predicho y label observado, habilitando auditoría de 'pronosticado vs. ocurrido'; (3) explicación SHAP local — se calcularon valores SHAP mediante TreeExplainer de XGBoost sobre el conjunto de prueba filtrado por ciudad, permitiendo exponer explanation.method='shap', scope='local' con top_features por inferencia concreta. El feature de mayor contribución local en ambas ciudades es SIR (Susceptibles-Infectados-Recuperados estimado).</w:t>
+        <w:rPr/>
+        <w:t>BIOMAC separa modelos de presentación con un contrato de API v2 (/api/v2). El backend FastAPI no ejecuta el pipeline de features: valida el CSV mensual contra el contrato y consume una salida de Champion ya aprobada y versionada, con un chequeo que exige que el feature_contract del Champion y el del input coincidan.</w:t>
       </w:r>
     </w:p>
     <w:p>
       <w:pPr>
+        <w:pStyle w:val="BodyText"/>
+        <w:rPr/>
+      </w:pPr>
+      <w:r>
+        <w:rPr/>
+        <w:t>Endpoints:</w:t>
+      </w:r>
+    </w:p>
+    <w:p>
+      <w:pPr>
+        <w:pStyle w:val="BodyText"/>
+        <w:numPr>
+          <w:ilvl w:val="0"/>
+          <w:numId w:val="10"/>
+        </w:numPr>
+        <w:tabs>
+          <w:tab w:val="clear" w:pos="720"/>
+          <w:tab w:val="left" w:pos="0" w:leader="none"/>
+        </w:tabs>
+        <w:ind w:hanging="283" w:start="709"/>
+        <w:rPr/>
+      </w:pPr>
+      <w:r>
+        <w:rPr/>
+        <w:t>POST /api/v2/monthly-runs — único disparador de inferencia. Recibe multipart/form-data: file (CSV con las 39 features de Bucaramanga y Cali) + reference_month (YYYY-MM). Municipios y horizontes no son parámetros; el alcance es fijo (68001, 76001) y siempre se calculan T+1 y T+2.</w:t>
+      </w:r>
+    </w:p>
+    <w:p>
+      <w:pPr>
+        <w:pStyle w:val="BodyText"/>
+        <w:numPr>
+          <w:ilvl w:val="0"/>
+          <w:numId w:val="10"/>
+        </w:numPr>
+        <w:tabs>
+          <w:tab w:val="clear" w:pos="720"/>
+          <w:tab w:val="left" w:pos="0" w:leader="none"/>
+        </w:tabs>
+        <w:ind w:hanging="283" w:start="709"/>
+        <w:rPr/>
+      </w:pPr>
+      <w:r>
+        <w:rPr/>
+        <w:t>GET /api/v2/predictions/latest — último resultado; filtros opcionales municipality_codes, horizons.</w:t>
+      </w:r>
+    </w:p>
+    <w:p>
+      <w:pPr>
+        <w:pStyle w:val="BodyText"/>
+        <w:numPr>
+          <w:ilvl w:val="0"/>
+          <w:numId w:val="10"/>
+        </w:numPr>
+        <w:tabs>
+          <w:tab w:val="clear" w:pos="720"/>
+          <w:tab w:val="left" w:pos="0" w:leader="none"/>
+        </w:tabs>
+        <w:ind w:hanging="283" w:start="709"/>
+        <w:rPr/>
+      </w:pPr>
+      <w:r>
+        <w:rPr/>
+        <w:t>GET /api/v2/predictions/history — historial persistido (paginado).</w:t>
+      </w:r>
+    </w:p>
+    <w:p>
+      <w:pPr>
+        <w:pStyle w:val="BodyText"/>
+        <w:numPr>
+          <w:ilvl w:val="0"/>
+          <w:numId w:val="10"/>
+        </w:numPr>
+        <w:tabs>
+          <w:tab w:val="clear" w:pos="720"/>
+          <w:tab w:val="left" w:pos="0" w:leader="none"/>
+        </w:tabs>
+        <w:ind w:hanging="283" w:start="709"/>
+        <w:rPr/>
+      </w:pPr>
+      <w:r>
+        <w:rPr/>
+        <w:t>GET /api/v2/runs/{run_id} — estado y trazabilidad de un run.</w:t>
+      </w:r>
+    </w:p>
+    <w:p>
+      <w:pPr>
+        <w:pStyle w:val="BodyText"/>
+        <w:numPr>
+          <w:ilvl w:val="0"/>
+          <w:numId w:val="10"/>
+        </w:numPr>
+        <w:tabs>
+          <w:tab w:val="clear" w:pos="720"/>
+          <w:tab w:val="left" w:pos="0" w:leader="none"/>
+        </w:tabs>
+        <w:ind w:hanging="283" w:start="709"/>
+        <w:rPr/>
+      </w:pPr>
+      <w:r>
+        <w:rPr/>
+        <w:t>GET /api/v2/health — disponibilidad de API, Champion y almacenamiento.</w:t>
+      </w:r>
+    </w:p>
+    <w:p>
+      <w:pPr>
+        <w:pStyle w:val="BodyText"/>
+        <w:rPr/>
+      </w:pPr>
+      <w:r>
+        <w:rPr/>
+        <w:t>Respuesta (por ciudad × horizonte): label (EXCESO/NO_EXCESO), probability, decision_threshold + decision_rule, más data_quality y current_status (canal endémico P25/P50/P75). No incluye métricas de evaluación del modelo (viven en MLflow). El frontend solo consume esta respuesta.</w:t>
+      </w:r>
+    </w:p>
+    <w:p>
+      <w:pPr>
+        <w:pStyle w:val="BodyText"/>
+        <w:rPr/>
+      </w:pPr>
+      <w:r>
+        <w:rPr/>
+        <w:t>Funcionalidades del tablero</w:t>
+      </w:r>
+    </w:p>
+    <w:p>
+      <w:pPr>
+        <w:pStyle w:val="BodyText"/>
+        <w:rPr/>
+      </w:pPr>
+      <w:r>
+        <w:rPr/>
+        <w:t>Pantalla única (Bucaramanga y Cali, T+1/T+2) que solo presenta la respuesta de la API:</w:t>
+      </w:r>
+    </w:p>
+    <w:p>
+      <w:pPr>
+        <w:pStyle w:val="BodyText"/>
+        <w:numPr>
+          <w:ilvl w:val="0"/>
+          <w:numId w:val="11"/>
+        </w:numPr>
+        <w:tabs>
+          <w:tab w:val="clear" w:pos="720"/>
+          <w:tab w:val="left" w:pos="0" w:leader="none"/>
+        </w:tabs>
+        <w:ind w:hanging="283" w:start="709"/>
+        <w:rPr/>
+      </w:pPr>
+      <w:r>
+        <w:rPr/>
+        <w:t>Selector de ciudad que filtra las tarjetas y el canal endémico.</w:t>
+      </w:r>
+    </w:p>
+    <w:p>
+      <w:pPr>
+        <w:pStyle w:val="BodyText"/>
+        <w:numPr>
+          <w:ilvl w:val="0"/>
+          <w:numId w:val="11"/>
+        </w:numPr>
+        <w:tabs>
+          <w:tab w:val="clear" w:pos="720"/>
+          <w:tab w:val="left" w:pos="0" w:leader="none"/>
+        </w:tabs>
+        <w:ind w:hanging="283" w:start="709"/>
+        <w:rPr/>
+      </w:pPr>
+      <w:r>
+        <w:rPr/>
+        <w:t>Tarjetas de predicción por horizonte: label, probabilidad, casos esperados, risk score, umbral y top features SHAP (o "no disponible").</w:t>
+      </w:r>
+    </w:p>
+    <w:p>
+      <w:pPr>
+        <w:pStyle w:val="BodyText"/>
+        <w:numPr>
+          <w:ilvl w:val="0"/>
+          <w:numId w:val="11"/>
+        </w:numPr>
+        <w:tabs>
+          <w:tab w:val="clear" w:pos="720"/>
+          <w:tab w:val="left" w:pos="0" w:leader="none"/>
+        </w:tabs>
+        <w:ind w:hanging="283" w:start="709"/>
+        <w:rPr/>
+      </w:pPr>
+      <w:r>
+        <w:rPr/>
+        <w:t>Actualizar datos: sube un CSV + mes, ejecuta POST /monthly-runs y refresca; muestra el recibo del run o el error.</w:t>
+      </w:r>
+    </w:p>
+    <w:p>
+      <w:pPr>
+        <w:pStyle w:val="BodyText"/>
+        <w:numPr>
+          <w:ilvl w:val="0"/>
+          <w:numId w:val="11"/>
+        </w:numPr>
+        <w:tabs>
+          <w:tab w:val="clear" w:pos="720"/>
+          <w:tab w:val="left" w:pos="0" w:leader="none"/>
+        </w:tabs>
+        <w:ind w:hanging="283" w:start="709"/>
+        <w:rPr/>
+      </w:pPr>
+      <w:r>
+        <w:rPr/>
+        <w:t>Actualizar vista: vuelve a consultar latest (solo lectura).</w:t>
+      </w:r>
+    </w:p>
+    <w:p>
+      <w:pPr>
+        <w:pStyle w:val="BodyText"/>
+        <w:numPr>
+          <w:ilvl w:val="0"/>
+          <w:numId w:val="11"/>
+        </w:numPr>
+        <w:tabs>
+          <w:tab w:val="clear" w:pos="720"/>
+          <w:tab w:val="left" w:pos="0" w:leader="none"/>
+        </w:tabs>
+        <w:ind w:hanging="283" w:start="709"/>
+        <w:rPr/>
+      </w:pPr>
+      <w:r>
+        <w:rPr/>
+        <w:t>Paneles de metadata/trazabilidad, canal endémico, calidad de datos, explicabilidad e historial de runs.</w:t>
+      </w:r>
+    </w:p>
+    <w:p>
+      <w:pPr>
+        <w:pStyle w:val="BodyText"/>
+        <w:numPr>
+          <w:ilvl w:val="0"/>
+          <w:numId w:val="11"/>
+        </w:numPr>
+        <w:tabs>
+          <w:tab w:val="clear" w:pos="720"/>
+          <w:tab w:val="left" w:pos="0" w:leader="none"/>
+        </w:tabs>
+        <w:ind w:hanging="283" w:start="709"/>
+        <w:rPr/>
+      </w:pPr>
+      <w:r>
+        <w:rPr/>
+        <w:t>Estados de carga, vacío y "API no disponible"; si un refresco falla, conserva la última predicción válida. Campos nulos como "No disponible", sin mocks.</w:t>
+      </w:r>
+    </w:p>
+    <w:p>
+      <w:pPr>
+        <w:pStyle w:val="BodyText"/>
+        <w:rPr/>
+      </w:pPr>
+      <w:r>
+        <w:rPr/>
+      </w:r>
+    </w:p>
+    <w:p>
+      <w:pPr>
         <w:pStyle w:val="Normal"/>
         <w:spacing w:before="0" w:after="120"/>
-        <w:jc w:val="both"/>
+        <w:jc w:val="center"/>
         <w:rPr>
           <w:rFonts w:ascii="Calibri" w:hAnsi="Calibri"/>
           <w:b w:val="false"/>
@@ -3380,7 +3701,12 @@
       <w:pPr>
         <w:pStyle w:val="Normal"/>
         <w:spacing w:before="280" w:after="80"/>
-        <w:rPr/>
+        <w:rPr>
+          <w:rFonts w:ascii="Calibri" w:hAnsi="Calibri"/>
+          <w:b/>
+          <w:i w:val="false"/>
+          <w:sz w:val="28"/>
+        </w:rPr>
       </w:pPr>
       <w:r>
         <w:rPr>
@@ -3390,22 +3716,24 @@
           <w:sz w:val="28"/>
         </w:rPr>
         <w:t>4. Observaciones y conclusiones</w:t>
+        <w:br/>
       </w:r>
-    </w:p>
-    <w:p>
-      <w:pPr>
-        <w:pStyle w:val="Normal"/>
-        <w:spacing w:before="0" w:after="120"/>
-        <w:jc w:val="both"/>
-        <w:rPr/>
-      </w:pPr>
+      <w:r>
+        <w:rPr>
+          <w:b/>
+          <w:bCs/>
+          <w:i w:val="false"/>
+          <w:sz w:val="22"/>
+        </w:rPr>
+        <w:t>Decisión técnica clave:</w:t>
+      </w:r>
       <w:r>
         <w:rPr>
           <w:b w:val="false"/>
           <w:i w:val="false"/>
           <w:sz w:val="22"/>
         </w:rPr>
-        <w:t>El cambio de objetivo de dengue grave a dengue total fue la decisión técnica más relevante de esta entrega y la que desbloqueó el resto del trabajo. Sin ella, cualquier modelo habría operado sobre una señal rota por el cambio de clasificación de la OMS, produciendo resultados sin validez epidemiológica.</w:t>
+        <w:t xml:space="preserve"> se cambió el objetivo de dengue grave a dengue total. Fue lo que desbloqueó la entrega: el cambio de clasificación de la OMS rompía la señal de "dengue grave", y modelar sobre ella no habría tenido validez epidemiológica.</w:t>
       </w:r>
     </w:p>
     <w:p>
@@ -3413,15 +3741,29 @@
         <w:pStyle w:val="Normal"/>
         <w:spacing w:before="0" w:after="120"/>
         <w:jc w:val="both"/>
-        <w:rPr/>
-      </w:pPr>
+        <w:rPr>
+          <w:rFonts w:ascii="Calibri" w:hAnsi="Calibri"/>
+          <w:b w:val="false"/>
+          <w:i w:val="false"/>
+          <w:sz w:val="22"/>
+        </w:rPr>
+      </w:pPr>
+      <w:r>
+        <w:rPr>
+          <w:b/>
+          <w:bCs/>
+          <w:i w:val="false"/>
+          <w:sz w:val="22"/>
+        </w:rPr>
+        <w:t>Mejores modelos:</w:t>
+      </w:r>
       <w:r>
         <w:rPr>
           <w:b w:val="false"/>
           <w:i w:val="false"/>
           <w:sz w:val="22"/>
         </w:rPr>
-        <w:t>XGBoost y LightGBM son los modelos con mayor desempeño (AUROC 0.8974 y 0.8985 respectivamente), con métricas prácticamente idénticas. La paridad entre ambos sugiere que el límite de desempeño actual no es arquitectural sino de información: las 39 features disponibles, incluyendo datos climáticos ERA5+CHIRPS con 96.3% de cobertura, el estado de brote actual y sus lags, y las variables del canal endémico, capturan la mayor parte de la señal predictiva accesible.</w:t>
+        <w:t xml:space="preserve"> XGBoost y LightGBM, con AUROC ≈ 0.90 y métricas casi idénticas. La paridad indica que el techo actual es de información, no de arquitectura: las 39 features (clima ERA5+CHIRPS con 96.3 % de cobertura, estado de brote actual y sus lags, variables del canal endémico) ya capturan casi toda la señal accesible.</w:t>
       </w:r>
     </w:p>
     <w:p>
@@ -3429,15 +3771,29 @@
         <w:pStyle w:val="Normal"/>
         <w:spacing w:before="0" w:after="120"/>
         <w:jc w:val="both"/>
-        <w:rPr/>
-      </w:pPr>
+        <w:rPr>
+          <w:rFonts w:ascii="Calibri" w:hAnsi="Calibri"/>
+          <w:b w:val="false"/>
+          <w:i w:val="false"/>
+          <w:sz w:val="22"/>
+        </w:rPr>
+      </w:pPr>
+      <w:r>
+        <w:rPr>
+          <w:b/>
+          <w:bCs/>
+          <w:i w:val="false"/>
+          <w:sz w:val="22"/>
+        </w:rPr>
+        <w:t>Hallazgo más relevante para el caso de uso:</w:t>
+      </w:r>
       <w:r>
         <w:rPr>
           <w:b w:val="false"/>
           <w:i w:val="false"/>
           <w:sz w:val="22"/>
         </w:rPr>
-        <w:t>El hallazgo más importante para el caso de uso es la detección de inicios de brote. La práctica actual (persistencia) detecta 0% de los 2,329 meses de inicio de brote en el período de prueba. XGBoost detecta el 22%, casi el doble que el canal endémico. Esto cuantifica el valor operativo del modelo: si una secretaría de salud adopta el sistema, podría anticipar aproximadamente un tercio de los episodios epidémicos antes de que se consoliden, frente a ninguno con la herramienta actual.</w:t>
+        <w:t xml:space="preserve"> detección de inicios de brote. Sobre 2.329 meses de inicio en el período de prueba, la práctica actual (persistencia) detecta 0 % y XGBoost ≈ 22 % (casi el doble que el canal endémico). En términos operativos: una secretaría de salud podría anticipar cerca de un tercio de los episodios epidémicos antes de que se consoliden, frente a ninguno con la herramienta actual.</w:t>
       </w:r>
     </w:p>
     <w:p>
@@ -3445,15 +3801,29 @@
         <w:pStyle w:val="Normal"/>
         <w:spacing w:before="0" w:after="120"/>
         <w:jc w:val="both"/>
-        <w:rPr/>
-      </w:pPr>
+        <w:rPr>
+          <w:rFonts w:ascii="Calibri" w:hAnsi="Calibri"/>
+          <w:b w:val="false"/>
+          <w:i w:val="false"/>
+          <w:sz w:val="22"/>
+        </w:rPr>
+      </w:pPr>
+      <w:r>
+        <w:rPr>
+          <w:b/>
+          <w:bCs/>
+          <w:i w:val="false"/>
+          <w:sz w:val="22"/>
+        </w:rPr>
+        <w:t>Horizonte a dos meses (T+2) viable:</w:t>
+      </w:r>
       <w:r>
         <w:rPr>
           <w:b w:val="false"/>
           <w:i w:val="false"/>
           <w:sz w:val="22"/>
         </w:rPr>
-        <w:t>El modelo T+2 (horizonte de dos meses) obtiene AUROC=0.871, AP=0.840, F1=0.758, con Bucaramanga F1=0.909 y Cali F1=0.909, confirmando la viabilidad de la anticipación de dos meses con degradación aceptable respecto a T+1.</w:t>
+        <w:t xml:space="preserve"> AUROC 0.871, AP 0.840, F1 0.758 (F1 0.909 en Bucaramanga y en Cali), con degradación aceptable frente a T+1.</w:t>
       </w:r>
     </w:p>
     <w:p>
@@ -3461,15 +3831,61 @@
         <w:pStyle w:val="Normal"/>
         <w:spacing w:before="0" w:after="120"/>
         <w:jc w:val="both"/>
-        <w:rPr/>
-      </w:pPr>
+        <w:rPr>
+          <w:rFonts w:ascii="Calibri" w:hAnsi="Calibri"/>
+          <w:b w:val="false"/>
+          <w:i w:val="false"/>
+          <w:sz w:val="22"/>
+        </w:rPr>
+      </w:pPr>
+      <w:r>
+        <w:rPr>
+          <w:b/>
+          <w:bCs/>
+          <w:i w:val="false"/>
+          <w:sz w:val="22"/>
+        </w:rPr>
+        <w:t>Limitaciones:</w:t>
+      </w:r>
       <w:r>
         <w:rPr>
           <w:b w:val="false"/>
           <w:i w:val="false"/>
           <w:sz w:val="22"/>
         </w:rPr>
-        <w:t>Las principales limitaciones son la granularidad mensual, que impide capturar dinámicas intra-mensuales relevantes para la activación de respuestas inmediatas, y la cobertura piloto limitada a dos municipios. La incorporación de variables climáticas ERA5+CHIRPS al 96.3% de cobertura municipal no mostró ganancia sustancial en AUROC respecto a los modelos sin clima; la lluvia (cuatro rezagos) tiene coeficientes inferiores a 0.06 mientras que el punto de rocío es la tercera variable más importante. El período de prueba 2024-2025 presentó una tasa de brote del 43%, notablemente superior al histórico (14-23%), lo que indica un año epidémico severo en Colombia y puede sesgar al alza las métricas de prueba frente a años más típicos.</w:t>
+        <w:t xml:space="preserve"> Granularidad mensual no capta dinámicas intra-mensuales necesarias para respuestas inmediatas, </w:t>
+      </w:r>
+      <w:r>
+        <w:rPr>
+          <w:b w:val="false"/>
+          <w:i w:val="false"/>
+          <w:sz w:val="22"/>
+        </w:rPr>
+        <w:t>e</w:t>
+      </w:r>
+      <w:r>
+        <w:rPr>
+          <w:b w:val="false"/>
+          <w:i w:val="false"/>
+          <w:sz w:val="22"/>
+        </w:rPr>
+        <w:t xml:space="preserve">l clima (ERA5+CHIRPS) no aportó ganancia sustancial en AUROC; la lluvia pesa poco (coeficientes &lt; 0.06 en sus 4 rezagos) y el punto de rocío es la 3.ª variable más importante, </w:t>
+      </w:r>
+      <w:r>
+        <w:rPr>
+          <w:b w:val="false"/>
+          <w:i w:val="false"/>
+          <w:sz w:val="22"/>
+        </w:rPr>
+        <w:t>e</w:t>
+      </w:r>
+      <w:r>
+        <w:rPr>
+          <w:b w:val="false"/>
+          <w:i w:val="false"/>
+          <w:sz w:val="22"/>
+        </w:rPr>
+        <w:t>l período de prueba 2024–2025 tuvo 43 % de tasa de brote (vs. 14–23 % histórico): año epidémico severo que probablemente sesga las métricas de prueba al alza frente a años típicos.</w:t>
       </w:r>
     </w:p>
     <w:p>
@@ -3494,46 +3910,375 @@
         <w:t>5. Reporte de trabajo en equipo</w:t>
       </w:r>
     </w:p>
+    <w:tbl>
+      <w:tblPr>
+        <w:tblW w:w="8842" w:type="dxa"/>
+        <w:jc w:val="start"/>
+        <w:tblInd w:w="28" w:type="dxa"/>
+        <w:tblLayout w:type="fixed"/>
+        <w:tblCellMar>
+          <w:top w:w="28" w:type="dxa"/>
+          <w:start w:w="28" w:type="dxa"/>
+          <w:bottom w:w="28" w:type="dxa"/>
+          <w:end w:w="28" w:type="dxa"/>
+        </w:tblCellMar>
+      </w:tblPr>
+      <w:tblGrid>
+        <w:gridCol w:w="3099"/>
+        <w:gridCol w:w="3677"/>
+        <w:gridCol w:w="2066"/>
+      </w:tblGrid>
+      <w:tr>
+        <w:trPr>
+          <w:tblHeader w:val="true"/>
+          <w:trHeight w:val="353" w:hRule="atLeast"/>
+        </w:trPr>
+        <w:tc>
+          <w:tcPr>
+            <w:tcW w:w="3099" w:type="dxa"/>
+            <w:tcBorders/>
+            <w:vAlign w:val="center"/>
+          </w:tcPr>
+          <w:p>
+            <w:pPr>
+              <w:pStyle w:val="TableHeading"/>
+              <w:suppressLineNumbers/>
+              <w:spacing w:before="0" w:after="200"/>
+              <w:jc w:val="center"/>
+              <w:rPr/>
+            </w:pPr>
+            <w:r>
+              <w:rPr/>
+              <w:t>Nombre</w:t>
+            </w:r>
+          </w:p>
+        </w:tc>
+        <w:tc>
+          <w:tcPr>
+            <w:tcW w:w="3677" w:type="dxa"/>
+            <w:tcBorders/>
+            <w:vAlign w:val="center"/>
+          </w:tcPr>
+          <w:p>
+            <w:pPr>
+              <w:pStyle w:val="TableHeading"/>
+              <w:suppressLineNumbers/>
+              <w:spacing w:before="0" w:after="200"/>
+              <w:jc w:val="center"/>
+              <w:rPr/>
+            </w:pPr>
+            <w:r>
+              <w:rPr/>
+              <w:t>Correo</w:t>
+            </w:r>
+          </w:p>
+        </w:tc>
+        <w:tc>
+          <w:tcPr>
+            <w:tcW w:w="2066" w:type="dxa"/>
+            <w:tcBorders/>
+            <w:vAlign w:val="center"/>
+          </w:tcPr>
+          <w:p>
+            <w:pPr>
+              <w:pStyle w:val="TableHeading"/>
+              <w:suppressLineNumbers/>
+              <w:spacing w:before="0" w:after="200"/>
+              <w:jc w:val="center"/>
+              <w:rPr/>
+            </w:pPr>
+            <w:r>
+              <w:rPr/>
+              <w:t>Rol</w:t>
+            </w:r>
+          </w:p>
+        </w:tc>
+      </w:tr>
+      <w:tr>
+        <w:trPr/>
+        <w:tc>
+          <w:tcPr>
+            <w:tcW w:w="3099" w:type="dxa"/>
+            <w:tcBorders/>
+            <w:vAlign w:val="center"/>
+          </w:tcPr>
+          <w:p>
+            <w:pPr>
+              <w:pStyle w:val="TableContents"/>
+              <w:widowControl w:val="false"/>
+              <w:suppressLineNumbers/>
+              <w:spacing w:before="0" w:after="200"/>
+              <w:rPr/>
+            </w:pPr>
+            <w:r>
+              <w:rPr/>
+              <w:t>Stevan Ramírez Cajamarca</w:t>
+            </w:r>
+          </w:p>
+        </w:tc>
+        <w:tc>
+          <w:tcPr>
+            <w:tcW w:w="3677" w:type="dxa"/>
+            <w:tcBorders/>
+            <w:vAlign w:val="center"/>
+          </w:tcPr>
+          <w:p>
+            <w:pPr>
+              <w:pStyle w:val="TableContents"/>
+              <w:widowControl w:val="false"/>
+              <w:suppressLineNumbers/>
+              <w:spacing w:before="0" w:after="200"/>
+              <w:rPr/>
+            </w:pPr>
+            <w:hyperlink r:id="rId10">
+              <w:r>
+                <w:rPr>
+                  <w:rStyle w:val="Hyperlink"/>
+                </w:rPr>
+                <w:t>s.ramirezc2@uniandes.edu.co</w:t>
+              </w:r>
+            </w:hyperlink>
+          </w:p>
+        </w:tc>
+        <w:tc>
+          <w:tcPr>
+            <w:tcW w:w="2066" w:type="dxa"/>
+            <w:tcBorders/>
+            <w:vAlign w:val="center"/>
+          </w:tcPr>
+          <w:p>
+            <w:pPr>
+              <w:pStyle w:val="TableContents"/>
+              <w:widowControl w:val="false"/>
+              <w:suppressLineNumbers/>
+              <w:spacing w:before="0" w:after="200"/>
+              <w:rPr/>
+            </w:pPr>
+            <w:r>
+              <w:rPr/>
+              <w:t>Ing. datos / DVC</w:t>
+            </w:r>
+          </w:p>
+        </w:tc>
+      </w:tr>
+      <w:tr>
+        <w:trPr/>
+        <w:tc>
+          <w:tcPr>
+            <w:tcW w:w="3099" w:type="dxa"/>
+            <w:tcBorders/>
+            <w:vAlign w:val="center"/>
+          </w:tcPr>
+          <w:p>
+            <w:pPr>
+              <w:pStyle w:val="TableContents"/>
+              <w:widowControl w:val="false"/>
+              <w:suppressLineNumbers/>
+              <w:spacing w:before="0" w:after="200"/>
+              <w:rPr/>
+            </w:pPr>
+            <w:r>
+              <w:rPr/>
+              <w:t>Nicolás Steven Lara Villa</w:t>
+            </w:r>
+          </w:p>
+        </w:tc>
+        <w:tc>
+          <w:tcPr>
+            <w:tcW w:w="3677" w:type="dxa"/>
+            <w:tcBorders/>
+            <w:vAlign w:val="center"/>
+          </w:tcPr>
+          <w:p>
+            <w:pPr>
+              <w:pStyle w:val="TableContents"/>
+              <w:widowControl w:val="false"/>
+              <w:suppressLineNumbers/>
+              <w:spacing w:before="0" w:after="200"/>
+              <w:rPr/>
+            </w:pPr>
+            <w:hyperlink r:id="rId11">
+              <w:r>
+                <w:rPr>
+                  <w:rStyle w:val="Hyperlink"/>
+                </w:rPr>
+                <w:t>n.larav@uniandes.edu.co</w:t>
+              </w:r>
+            </w:hyperlink>
+          </w:p>
+        </w:tc>
+        <w:tc>
+          <w:tcPr>
+            <w:tcW w:w="2066" w:type="dxa"/>
+            <w:tcBorders/>
+            <w:vAlign w:val="center"/>
+          </w:tcPr>
+          <w:p>
+            <w:pPr>
+              <w:pStyle w:val="TableContents"/>
+              <w:widowControl w:val="false"/>
+              <w:suppressLineNumbers/>
+              <w:spacing w:before="0" w:after="200"/>
+              <w:rPr/>
+            </w:pPr>
+            <w:r>
+              <w:rPr/>
+              <w:t>Modelado / API</w:t>
+            </w:r>
+          </w:p>
+        </w:tc>
+      </w:tr>
+      <w:tr>
+        <w:trPr/>
+        <w:tc>
+          <w:tcPr>
+            <w:tcW w:w="3099" w:type="dxa"/>
+            <w:tcBorders/>
+            <w:vAlign w:val="center"/>
+          </w:tcPr>
+          <w:p>
+            <w:pPr>
+              <w:pStyle w:val="TableContents"/>
+              <w:widowControl w:val="false"/>
+              <w:suppressLineNumbers/>
+              <w:spacing w:before="0" w:after="200"/>
+              <w:rPr/>
+            </w:pPr>
+            <w:r>
+              <w:rPr/>
+              <w:t>Jersson Rodríguez Aponte</w:t>
+            </w:r>
+          </w:p>
+        </w:tc>
+        <w:tc>
+          <w:tcPr>
+            <w:tcW w:w="3677" w:type="dxa"/>
+            <w:tcBorders/>
+            <w:vAlign w:val="center"/>
+          </w:tcPr>
+          <w:p>
+            <w:pPr>
+              <w:pStyle w:val="TableContents"/>
+              <w:widowControl w:val="false"/>
+              <w:suppressLineNumbers/>
+              <w:spacing w:before="0" w:after="200"/>
+              <w:rPr/>
+            </w:pPr>
+            <w:hyperlink r:id="rId12">
+              <w:r>
+                <w:rPr>
+                  <w:rStyle w:val="Hyperlink"/>
+                </w:rPr>
+                <w:t>jm.rodrigueza1@uniandes.edu.co</w:t>
+              </w:r>
+            </w:hyperlink>
+          </w:p>
+        </w:tc>
+        <w:tc>
+          <w:tcPr>
+            <w:tcW w:w="2066" w:type="dxa"/>
+            <w:tcBorders/>
+            <w:vAlign w:val="center"/>
+          </w:tcPr>
+          <w:p>
+            <w:pPr>
+              <w:pStyle w:val="TableContents"/>
+              <w:widowControl w:val="false"/>
+              <w:suppressLineNumbers/>
+              <w:spacing w:before="0" w:after="200"/>
+              <w:rPr/>
+            </w:pPr>
+            <w:r>
+              <w:rPr/>
+              <w:t>Frontend / Infra</w:t>
+            </w:r>
+          </w:p>
+        </w:tc>
+      </w:tr>
+      <w:tr>
+        <w:trPr/>
+        <w:tc>
+          <w:tcPr>
+            <w:tcW w:w="3099" w:type="dxa"/>
+            <w:tcBorders/>
+            <w:vAlign w:val="center"/>
+          </w:tcPr>
+          <w:p>
+            <w:pPr>
+              <w:pStyle w:val="TableContents"/>
+              <w:widowControl w:val="false"/>
+              <w:suppressLineNumbers/>
+              <w:spacing w:before="0" w:after="200"/>
+              <w:rPr/>
+            </w:pPr>
+            <w:r>
+              <w:rPr/>
+              <w:t>Sergio Ballesteros Suárez</w:t>
+            </w:r>
+          </w:p>
+        </w:tc>
+        <w:tc>
+          <w:tcPr>
+            <w:tcW w:w="3677" w:type="dxa"/>
+            <w:tcBorders/>
+            <w:vAlign w:val="center"/>
+          </w:tcPr>
+          <w:p>
+            <w:pPr>
+              <w:pStyle w:val="TableContents"/>
+              <w:widowControl w:val="false"/>
+              <w:suppressLineNumbers/>
+              <w:spacing w:before="0" w:after="200"/>
+              <w:rPr/>
+            </w:pPr>
+            <w:hyperlink r:id="rId13">
+              <w:r>
+                <w:rPr>
+                  <w:rStyle w:val="Hyperlink"/>
+                </w:rPr>
+                <w:t>sa.ballesteros@uniandes.edu.co</w:t>
+              </w:r>
+            </w:hyperlink>
+          </w:p>
+        </w:tc>
+        <w:tc>
+          <w:tcPr>
+            <w:tcW w:w="2066" w:type="dxa"/>
+            <w:tcBorders/>
+            <w:vAlign w:val="center"/>
+          </w:tcPr>
+          <w:p>
+            <w:pPr>
+              <w:pStyle w:val="TableContents"/>
+              <w:widowControl w:val="false"/>
+              <w:suppressLineNumbers/>
+              <w:spacing w:before="0" w:after="200"/>
+              <w:rPr/>
+            </w:pPr>
+            <w:r>
+              <w:rPr/>
+              <w:t>EDA / Features</w:t>
+            </w:r>
+          </w:p>
+        </w:tc>
+      </w:tr>
+    </w:tbl>
     <w:p>
       <w:pPr>
         <w:pStyle w:val="Normal"/>
-        <w:spacing w:before="280" w:after="80"/>
-        <w:rPr>
-          <w:rFonts w:ascii="Calibri" w:hAnsi="Calibri"/>
-          <w:b/>
-          <w:i w:val="false"/>
-          <w:color w:val="1654A2"/>
-          <w:sz w:val="28"/>
-        </w:rPr>
+        <w:spacing w:before="0" w:after="200"/>
+        <w:rPr/>
       </w:pPr>
       <w:r>
         <w:rPr>
           <w:b/>
-          <w:i w:val="false"/>
-          <w:color w:val="1654A2"/>
-          <w:sz w:val="28"/>
+          <w:bCs/>
         </w:rPr>
+        <w:t>Repositorio github:</w:t>
       </w:r>
-    </w:p>
-    <w:p>
-      <w:pPr>
-        <w:pStyle w:val="Normal"/>
-        <w:rPr/>
-      </w:pPr>
       <w:r>
         <w:rPr/>
-        <w:t>Repositorio github</w:t>
-      </w:r>
-    </w:p>
-    <w:p>
-      <w:pPr>
-        <w:pStyle w:val="Normal"/>
-        <w:spacing w:before="0" w:after="200"/>
-        <w:rPr/>
-      </w:pPr>
-      <w:r>
-        <w:rPr/>
-        <w:t>https://github.com/j-mauro-r/microproyecto-tema3.git</w:t>
+        <w:t xml:space="preserve"> https://github.com/j-mauro-r/microproyecto-tema3.git</w:t>
       </w:r>
     </w:p>
     <w:sectPr>
@@ -4635,6 +5380,280 @@
     </w:lvl>
   </w:abstractNum>
   <w:abstractNum w:abstractNumId="10">
+    <w:lvl w:ilvl="0">
+      <w:start w:val="1"/>
+      <w:numFmt w:val="bullet"/>
+      <w:lvlText w:val=""/>
+      <w:lvlJc w:val="start"/>
+      <w:pPr>
+        <w:tabs>
+          <w:tab w:val="num" w:pos="709"/>
+        </w:tabs>
+        <w:ind w:start="709" w:hanging="283"/>
+      </w:pPr>
+      <w:rPr>
+        <w:rFonts w:ascii="Symbol" w:hAnsi="Symbol" w:cs="Symbol" w:hint="default"/>
+      </w:rPr>
+    </w:lvl>
+    <w:lvl w:ilvl="1">
+      <w:start w:val="1"/>
+      <w:numFmt w:val="bullet"/>
+      <w:lvlText w:val=""/>
+      <w:lvlJc w:val="start"/>
+      <w:pPr>
+        <w:tabs>
+          <w:tab w:val="num" w:pos="1418"/>
+        </w:tabs>
+        <w:ind w:start="1418" w:hanging="283"/>
+      </w:pPr>
+      <w:rPr>
+        <w:rFonts w:ascii="Symbol" w:hAnsi="Symbol" w:cs="Symbol" w:hint="default"/>
+      </w:rPr>
+    </w:lvl>
+    <w:lvl w:ilvl="2">
+      <w:start w:val="1"/>
+      <w:numFmt w:val="bullet"/>
+      <w:lvlText w:val=""/>
+      <w:lvlJc w:val="start"/>
+      <w:pPr>
+        <w:tabs>
+          <w:tab w:val="num" w:pos="2127"/>
+        </w:tabs>
+        <w:ind w:start="2127" w:hanging="283"/>
+      </w:pPr>
+      <w:rPr>
+        <w:rFonts w:ascii="Symbol" w:hAnsi="Symbol" w:cs="Symbol" w:hint="default"/>
+      </w:rPr>
+    </w:lvl>
+    <w:lvl w:ilvl="3">
+      <w:start w:val="1"/>
+      <w:numFmt w:val="bullet"/>
+      <w:lvlText w:val=""/>
+      <w:lvlJc w:val="start"/>
+      <w:pPr>
+        <w:tabs>
+          <w:tab w:val="num" w:pos="2836"/>
+        </w:tabs>
+        <w:ind w:start="2836" w:hanging="283"/>
+      </w:pPr>
+      <w:rPr>
+        <w:rFonts w:ascii="Symbol" w:hAnsi="Symbol" w:cs="Symbol" w:hint="default"/>
+      </w:rPr>
+    </w:lvl>
+    <w:lvl w:ilvl="4">
+      <w:start w:val="1"/>
+      <w:numFmt w:val="bullet"/>
+      <w:lvlText w:val=""/>
+      <w:lvlJc w:val="start"/>
+      <w:pPr>
+        <w:tabs>
+          <w:tab w:val="num" w:pos="3545"/>
+        </w:tabs>
+        <w:ind w:start="3545" w:hanging="283"/>
+      </w:pPr>
+      <w:rPr>
+        <w:rFonts w:ascii="Symbol" w:hAnsi="Symbol" w:cs="Symbol" w:hint="default"/>
+      </w:rPr>
+    </w:lvl>
+    <w:lvl w:ilvl="5">
+      <w:start w:val="1"/>
+      <w:numFmt w:val="bullet"/>
+      <w:lvlText w:val=""/>
+      <w:lvlJc w:val="start"/>
+      <w:pPr>
+        <w:tabs>
+          <w:tab w:val="num" w:pos="4254"/>
+        </w:tabs>
+        <w:ind w:start="4254" w:hanging="283"/>
+      </w:pPr>
+      <w:rPr>
+        <w:rFonts w:ascii="Symbol" w:hAnsi="Symbol" w:cs="Symbol" w:hint="default"/>
+      </w:rPr>
+    </w:lvl>
+    <w:lvl w:ilvl="6">
+      <w:start w:val="1"/>
+      <w:numFmt w:val="bullet"/>
+      <w:lvlText w:val=""/>
+      <w:lvlJc w:val="start"/>
+      <w:pPr>
+        <w:tabs>
+          <w:tab w:val="num" w:pos="4963"/>
+        </w:tabs>
+        <w:ind w:start="4963" w:hanging="283"/>
+      </w:pPr>
+      <w:rPr>
+        <w:rFonts w:ascii="Symbol" w:hAnsi="Symbol" w:cs="Symbol" w:hint="default"/>
+      </w:rPr>
+    </w:lvl>
+    <w:lvl w:ilvl="7">
+      <w:start w:val="1"/>
+      <w:numFmt w:val="bullet"/>
+      <w:lvlText w:val=""/>
+      <w:lvlJc w:val="start"/>
+      <w:pPr>
+        <w:tabs>
+          <w:tab w:val="num" w:pos="5672"/>
+        </w:tabs>
+        <w:ind w:start="5672" w:hanging="283"/>
+      </w:pPr>
+      <w:rPr>
+        <w:rFonts w:ascii="Symbol" w:hAnsi="Symbol" w:cs="Symbol" w:hint="default"/>
+      </w:rPr>
+    </w:lvl>
+    <w:lvl w:ilvl="8">
+      <w:start w:val="1"/>
+      <w:numFmt w:val="bullet"/>
+      <w:lvlText w:val=""/>
+      <w:lvlJc w:val="start"/>
+      <w:pPr>
+        <w:tabs>
+          <w:tab w:val="num" w:pos="6381"/>
+        </w:tabs>
+        <w:ind w:start="6381" w:hanging="283"/>
+      </w:pPr>
+      <w:rPr>
+        <w:rFonts w:ascii="Symbol" w:hAnsi="Symbol" w:cs="Symbol" w:hint="default"/>
+      </w:rPr>
+    </w:lvl>
+  </w:abstractNum>
+  <w:abstractNum w:abstractNumId="11">
+    <w:lvl w:ilvl="0">
+      <w:start w:val="1"/>
+      <w:numFmt w:val="bullet"/>
+      <w:lvlText w:val=""/>
+      <w:lvlJc w:val="start"/>
+      <w:pPr>
+        <w:tabs>
+          <w:tab w:val="num" w:pos="709"/>
+        </w:tabs>
+        <w:ind w:start="709" w:hanging="283"/>
+      </w:pPr>
+      <w:rPr>
+        <w:rFonts w:ascii="Symbol" w:hAnsi="Symbol" w:cs="Symbol" w:hint="default"/>
+      </w:rPr>
+    </w:lvl>
+    <w:lvl w:ilvl="1">
+      <w:start w:val="1"/>
+      <w:numFmt w:val="bullet"/>
+      <w:lvlText w:val=""/>
+      <w:lvlJc w:val="start"/>
+      <w:pPr>
+        <w:tabs>
+          <w:tab w:val="num" w:pos="1418"/>
+        </w:tabs>
+        <w:ind w:start="1418" w:hanging="283"/>
+      </w:pPr>
+      <w:rPr>
+        <w:rFonts w:ascii="Symbol" w:hAnsi="Symbol" w:cs="Symbol" w:hint="default"/>
+      </w:rPr>
+    </w:lvl>
+    <w:lvl w:ilvl="2">
+      <w:start w:val="1"/>
+      <w:numFmt w:val="bullet"/>
+      <w:lvlText w:val=""/>
+      <w:lvlJc w:val="start"/>
+      <w:pPr>
+        <w:tabs>
+          <w:tab w:val="num" w:pos="2127"/>
+        </w:tabs>
+        <w:ind w:start="2127" w:hanging="283"/>
+      </w:pPr>
+      <w:rPr>
+        <w:rFonts w:ascii="Symbol" w:hAnsi="Symbol" w:cs="Symbol" w:hint="default"/>
+      </w:rPr>
+    </w:lvl>
+    <w:lvl w:ilvl="3">
+      <w:start w:val="1"/>
+      <w:numFmt w:val="bullet"/>
+      <w:lvlText w:val=""/>
+      <w:lvlJc w:val="start"/>
+      <w:pPr>
+        <w:tabs>
+          <w:tab w:val="num" w:pos="2836"/>
+        </w:tabs>
+        <w:ind w:start="2836" w:hanging="283"/>
+      </w:pPr>
+      <w:rPr>
+        <w:rFonts w:ascii="Symbol" w:hAnsi="Symbol" w:cs="Symbol" w:hint="default"/>
+      </w:rPr>
+    </w:lvl>
+    <w:lvl w:ilvl="4">
+      <w:start w:val="1"/>
+      <w:numFmt w:val="bullet"/>
+      <w:lvlText w:val=""/>
+      <w:lvlJc w:val="start"/>
+      <w:pPr>
+        <w:tabs>
+          <w:tab w:val="num" w:pos="3545"/>
+        </w:tabs>
+        <w:ind w:start="3545" w:hanging="283"/>
+      </w:pPr>
+      <w:rPr>
+        <w:rFonts w:ascii="Symbol" w:hAnsi="Symbol" w:cs="Symbol" w:hint="default"/>
+      </w:rPr>
+    </w:lvl>
+    <w:lvl w:ilvl="5">
+      <w:start w:val="1"/>
+      <w:numFmt w:val="bullet"/>
+      <w:lvlText w:val=""/>
+      <w:lvlJc w:val="start"/>
+      <w:pPr>
+        <w:tabs>
+          <w:tab w:val="num" w:pos="4254"/>
+        </w:tabs>
+        <w:ind w:start="4254" w:hanging="283"/>
+      </w:pPr>
+      <w:rPr>
+        <w:rFonts w:ascii="Symbol" w:hAnsi="Symbol" w:cs="Symbol" w:hint="default"/>
+      </w:rPr>
+    </w:lvl>
+    <w:lvl w:ilvl="6">
+      <w:start w:val="1"/>
+      <w:numFmt w:val="bullet"/>
+      <w:lvlText w:val=""/>
+      <w:lvlJc w:val="start"/>
+      <w:pPr>
+        <w:tabs>
+          <w:tab w:val="num" w:pos="4963"/>
+        </w:tabs>
+        <w:ind w:start="4963" w:hanging="283"/>
+      </w:pPr>
+      <w:rPr>
+        <w:rFonts w:ascii="Symbol" w:hAnsi="Symbol" w:cs="Symbol" w:hint="default"/>
+      </w:rPr>
+    </w:lvl>
+    <w:lvl w:ilvl="7">
+      <w:start w:val="1"/>
+      <w:numFmt w:val="bullet"/>
+      <w:lvlText w:val=""/>
+      <w:lvlJc w:val="start"/>
+      <w:pPr>
+        <w:tabs>
+          <w:tab w:val="num" w:pos="5672"/>
+        </w:tabs>
+        <w:ind w:start="5672" w:hanging="283"/>
+      </w:pPr>
+      <w:rPr>
+        <w:rFonts w:ascii="Symbol" w:hAnsi="Symbol" w:cs="Symbol" w:hint="default"/>
+      </w:rPr>
+    </w:lvl>
+    <w:lvl w:ilvl="8">
+      <w:start w:val="1"/>
+      <w:numFmt w:val="bullet"/>
+      <w:lvlText w:val=""/>
+      <w:lvlJc w:val="start"/>
+      <w:pPr>
+        <w:tabs>
+          <w:tab w:val="num" w:pos="6381"/>
+        </w:tabs>
+        <w:ind w:start="6381" w:hanging="283"/>
+      </w:pPr>
+      <w:rPr>
+        <w:rFonts w:ascii="Symbol" w:hAnsi="Symbol" w:cs="Symbol" w:hint="default"/>
+      </w:rPr>
+    </w:lvl>
+  </w:abstractNum>
+  <w:abstractNum w:abstractNumId="12">
     <w:lvl w:ilvl="0">
       <w:start w:val="1"/>
       <w:numFmt w:val="none"/>
@@ -4782,6 +5801,12 @@
   </w:num>
   <w:num w:numId="10">
     <w:abstractNumId w:val="10"/>
+  </w:num>
+  <w:num w:numId="11">
+    <w:abstractNumId w:val="11"/>
+  </w:num>
+  <w:num w:numId="12">
+    <w:abstractNumId w:val="12"/>
   </w:num>
 </w:numbering>
 </file>
@@ -5532,6 +6557,18 @@
       <w:rFonts w:ascii="OpenSymbol" w:hAnsi="OpenSymbol" w:eastAsia="OpenSymbol" w:cs="OpenSymbol"/>
     </w:rPr>
   </w:style>
+  <w:style w:type="character" w:styleId="NumberingSymbols">
+    <w:name w:val="Numbering Symbols"/>
+    <w:qFormat/>
+    <w:rPr/>
+  </w:style>
+  <w:style w:type="character" w:styleId="Hyperlink">
+    <w:name w:val="Hyperlink"/>
+    <w:rPr>
+      <w:color w:val="000080"/>
+      <w:u w:val="single"/>
+    </w:rPr>
+  </w:style>
   <w:style w:type="paragraph" w:styleId="Heading">
     <w:name w:val="Heading"/>
     <w:basedOn w:val="Normal"/>
@@ -6002,6 +7039,29 @@
     </w:pPr>
     <w:rPr/>
   </w:style>
+  <w:style w:type="paragraph" w:styleId="TableContents">
+    <w:name w:val="Table Contents"/>
+    <w:basedOn w:val="Normal"/>
+    <w:qFormat/>
+    <w:pPr>
+      <w:widowControl w:val="false"/>
+      <w:suppressLineNumbers/>
+    </w:pPr>
+    <w:rPr/>
+  </w:style>
+  <w:style w:type="paragraph" w:styleId="TableHeading">
+    <w:name w:val="Table Heading"/>
+    <w:basedOn w:val="TableContents"/>
+    <w:qFormat/>
+    <w:pPr>
+      <w:suppressLineNumbers/>
+      <w:jc w:val="center"/>
+    </w:pPr>
+    <w:rPr>
+      <w:b/>
+      <w:bCs/>
+    </w:rPr>
+  </w:style>
   <w:style w:type="numbering" w:styleId="NoList" w:default="1">
     <w:name w:val="No List"/>
     <w:uiPriority w:val="99"/>

</xml_diff>

<commit_message>
2da Ronda Revision, ajustes comentarios Stevan y revision ortografica
</commit_message>
<xml_diff>
--- a/Reporte_Entrega2.docx
+++ b/Reporte_Entrega2.docx
@@ -110,7 +110,7 @@
           <w:i w:val="false"/>
           <w:sz w:val="22"/>
         </w:rPr>
-        <w:t xml:space="preserve">concentrados en municipios urbanos de las regiones </w:t>
+        <w:t xml:space="preserve">concentrados en municipios urbanos de las </w:t>
       </w:r>
       <w:r>
         <w:rPr>
@@ -317,112 +317,100 @@
     </w:p>
     <w:p>
       <w:pPr>
-        <w:pStyle w:val="Normal"/>
+        <w:pStyle w:val="BodyText"/>
         <w:numPr>
           <w:ilvl w:val="0"/>
           <w:numId w:val="7"/>
         </w:numPr>
         <w:spacing w:before="0" w:after="120"/>
         <w:rPr>
-          <w:rFonts w:ascii="Calibri" w:hAnsi="Calibri"/>
-          <w:b w:val="false"/>
-          <w:i w:val="false"/>
-          <w:sz w:val="22"/>
-        </w:rPr>
-      </w:pPr>
-      <w:r>
-        <w:rPr>
-          <w:b w:val="false"/>
-          <w:i w:val="false"/>
-          <w:sz w:val="22"/>
-        </w:rPr>
-        <w:t xml:space="preserve">Entrenamiento, pruebas y validacion modelo </w:t>
-      </w:r>
-      <w:r>
-        <w:rPr>
-          <w:b w:val="false"/>
-          <w:i w:val="false"/>
-          <w:sz w:val="22"/>
-        </w:rPr>
-        <w:t>clasificacion</w:t>
-      </w:r>
-      <w:r>
-        <w:rPr>
-          <w:b w:val="false"/>
-          <w:i w:val="false"/>
-          <w:sz w:val="22"/>
-        </w:rPr>
-        <w:t xml:space="preserve"> Xgboost.</w:t>
+          <w:rFonts w:ascii="Calibri;serif" w:hAnsi="Calibri;serif"/>
+          <w:b w:val="false"/>
+          <w:i w:val="false"/>
+          <w:caps w:val="false"/>
+          <w:smallCaps w:val="false"/>
+          <w:sz w:val="22"/>
+        </w:rPr>
+      </w:pPr>
+      <w:r>
+        <w:rPr>
+          <w:rFonts w:ascii="Calibri;serif" w:hAnsi="Calibri;serif"/>
+          <w:b w:val="false"/>
+          <w:i w:val="false"/>
+          <w:caps w:val="false"/>
+          <w:smallCaps w:val="false"/>
+          <w:sz w:val="22"/>
+        </w:rPr>
+        <w:t>Entrenamiento, pruebas y validación del modelo de clasificación XGBoost.</w:t>
       </w:r>
     </w:p>
     <w:p>
       <w:pPr>
-        <w:pStyle w:val="Normal"/>
+        <w:pStyle w:val="BodyText"/>
         <w:numPr>
           <w:ilvl w:val="0"/>
           <w:numId w:val="7"/>
         </w:numPr>
         <w:spacing w:before="0" w:after="120"/>
         <w:rPr>
-          <w:rFonts w:ascii="Calibri" w:hAnsi="Calibri"/>
-          <w:b w:val="false"/>
-          <w:i w:val="false"/>
-          <w:sz w:val="22"/>
-        </w:rPr>
-      </w:pPr>
-      <w:r>
-        <w:rPr>
-          <w:b w:val="false"/>
-          <w:i w:val="false"/>
-          <w:sz w:val="22"/>
-        </w:rPr>
-        <w:t xml:space="preserve">Validacion del modelo con AUROC, precision, </w:t>
-      </w:r>
-      <w:r>
-        <w:rPr>
-          <w:b w:val="false"/>
-          <w:i w:val="false"/>
-          <w:sz w:val="22"/>
-        </w:rPr>
-        <w:t>F1, recall</w:t>
+          <w:rFonts w:ascii="Calibri;serif" w:hAnsi="Calibri;serif"/>
+          <w:b w:val="false"/>
+          <w:i w:val="false"/>
+          <w:caps w:val="false"/>
+          <w:smallCaps w:val="false"/>
+          <w:sz w:val="22"/>
+        </w:rPr>
+      </w:pPr>
+      <w:r>
+        <w:rPr>
+          <w:rFonts w:ascii="Calibri;serif" w:hAnsi="Calibri;serif"/>
+          <w:b w:val="false"/>
+          <w:i w:val="false"/>
+          <w:caps w:val="false"/>
+          <w:smallCaps w:val="false"/>
+          <w:sz w:val="22"/>
+        </w:rPr>
+        <w:t>Validación del modelo con AUROC, precisión, F1, recall</w:t>
       </w:r>
     </w:p>
     <w:p>
       <w:pPr>
-        <w:pStyle w:val="Normal"/>
+        <w:pStyle w:val="BodyText"/>
         <w:numPr>
           <w:ilvl w:val="0"/>
           <w:numId w:val="7"/>
         </w:numPr>
         <w:spacing w:before="0" w:after="120"/>
         <w:rPr>
-          <w:rFonts w:ascii="Calibri" w:hAnsi="Calibri"/>
-          <w:b w:val="false"/>
-          <w:i w:val="false"/>
-          <w:sz w:val="22"/>
-        </w:rPr>
-      </w:pPr>
-      <w:r>
-        <w:rPr>
-          <w:b w:val="false"/>
-          <w:i w:val="false"/>
-          <w:sz w:val="22"/>
-        </w:rPr>
-        <w:t>D</w:t>
-      </w:r>
-      <w:r>
-        <w:rPr>
-          <w:b w:val="false"/>
-          <w:i w:val="false"/>
-          <w:sz w:val="22"/>
-        </w:rPr>
-        <w:t>ataset entrenamiento 2007 a 2023, pruebas 2024 y validacion 2025</w:t>
+          <w:rFonts w:ascii="Calibri;serif" w:hAnsi="Calibri;serif"/>
+          <w:b w:val="false"/>
+          <w:i w:val="false"/>
+          <w:caps w:val="false"/>
+          <w:smallCaps w:val="false"/>
+          <w:sz w:val="22"/>
+        </w:rPr>
+      </w:pPr>
+      <w:r>
+        <w:rPr>
+          <w:rFonts w:ascii="Calibri;serif" w:hAnsi="Calibri;serif"/>
+          <w:b w:val="false"/>
+          <w:i w:val="false"/>
+          <w:caps w:val="false"/>
+          <w:smallCaps w:val="false"/>
+          <w:sz w:val="22"/>
+        </w:rPr>
+        <w:t>Dataset entrenamiento 2007 a 2022, pruebas 2023 a 2025</w:t>
       </w:r>
     </w:p>
     <w:p>
       <w:pPr>
         <w:pStyle w:val="Normal"/>
+        <w:numPr>
+          <w:ilvl w:val="0"/>
+          <w:numId w:val="0"/>
+        </w:numPr>
         <w:spacing w:before="0" w:after="120"/>
+        <w:ind w:hanging="0" w:start="720"/>
         <w:rPr>
           <w:rFonts w:ascii="Calibri" w:hAnsi="Calibri"/>
           <w:b w:val="false"/>
@@ -514,7 +502,23 @@
           <w:i w:val="false"/>
           <w:sz w:val="22"/>
         </w:rPr>
-        <w:t xml:space="preserve">agrupado por </w:t>
+        <w:t>agrupad</w:t>
+      </w:r>
+      <w:r>
+        <w:rPr>
+          <w:b w:val="false"/>
+          <w:i w:val="false"/>
+          <w:sz w:val="22"/>
+        </w:rPr>
+        <w:t>as</w:t>
+      </w:r>
+      <w:r>
+        <w:rPr>
+          <w:b w:val="false"/>
+          <w:i w:val="false"/>
+          <w:sz w:val="22"/>
+        </w:rPr>
+        <w:t xml:space="preserve"> por </w:t>
       </w:r>
       <w:r>
         <w:rPr>
@@ -530,7 +534,31 @@
           <w:i w:val="false"/>
           <w:sz w:val="22"/>
         </w:rPr>
-        <w:t xml:space="preserve"> con la fecha de inicio de sintomas como nuestra fuente de verdad para la asignacion temporal de casos.</w:t>
+        <w:t xml:space="preserve"> con la fecha de inicio de </w:t>
+      </w:r>
+      <w:r>
+        <w:rPr/>
+        <w:t>síntomas</w:t>
+      </w:r>
+      <w:r>
+        <w:rPr>
+          <w:b w:val="false"/>
+          <w:i w:val="false"/>
+          <w:sz w:val="22"/>
+        </w:rPr>
+        <w:t xml:space="preserve"> como nuestra fuente de verdad para la </w:t>
+      </w:r>
+      <w:r>
+        <w:rPr/>
+        <w:t>asignación</w:t>
+      </w:r>
+      <w:r>
+        <w:rPr>
+          <w:b w:val="false"/>
+          <w:i w:val="false"/>
+          <w:sz w:val="22"/>
+        </w:rPr>
+        <w:t xml:space="preserve"> temporal de casos.</w:t>
       </w:r>
     </w:p>
     <w:p>
@@ -542,28 +570,91 @@
         </w:numPr>
         <w:spacing w:before="0" w:after="120"/>
         <w:jc w:val="both"/>
-        <w:rPr>
-          <w:rFonts w:ascii="Calibri" w:hAnsi="Calibri"/>
-          <w:b w:val="false"/>
-          <w:i w:val="false"/>
-          <w:sz w:val="22"/>
-        </w:rPr>
-      </w:pPr>
-      <w:r>
-        <w:rPr>
-          <w:b w:val="false"/>
-          <w:i w:val="false"/>
-          <w:sz w:val="22"/>
-        </w:rPr>
-        <w:t>Google search engine CHRI</w:t>
-      </w:r>
-      <w:r>
-        <w:rPr>
-          <w:b w:val="false"/>
-          <w:i w:val="false"/>
-          <w:sz w:val="22"/>
-        </w:rPr>
-        <w:t>SP para variables de lluvia agrupadas de forma mensual y ERA5 para variables metereologicas de clima, humedad.</w:t>
+        <w:rPr/>
+      </w:pPr>
+      <w:r>
+        <w:rPr>
+          <w:b w:val="false"/>
+          <w:i w:val="false"/>
+          <w:sz w:val="22"/>
+        </w:rPr>
+        <w:t xml:space="preserve">Google </w:t>
+      </w:r>
+      <w:r>
+        <w:rPr>
+          <w:b w:val="false"/>
+          <w:i w:val="false"/>
+          <w:sz w:val="22"/>
+        </w:rPr>
+        <w:t>E</w:t>
+      </w:r>
+      <w:r>
+        <w:rPr>
+          <w:b w:val="false"/>
+          <w:i w:val="false"/>
+          <w:sz w:val="22"/>
+        </w:rPr>
+        <w:t>arth</w:t>
+      </w:r>
+      <w:r>
+        <w:rPr>
+          <w:b w:val="false"/>
+          <w:i w:val="false"/>
+          <w:sz w:val="22"/>
+        </w:rPr>
+        <w:t xml:space="preserve"> </w:t>
+      </w:r>
+      <w:r>
+        <w:rPr>
+          <w:b w:val="false"/>
+          <w:i w:val="false"/>
+          <w:sz w:val="22"/>
+        </w:rPr>
+        <w:t>E</w:t>
+      </w:r>
+      <w:r>
+        <w:rPr>
+          <w:b w:val="false"/>
+          <w:i w:val="false"/>
+          <w:sz w:val="22"/>
+        </w:rPr>
+        <w:t>ngine CHRI</w:t>
+      </w:r>
+      <w:r>
+        <w:rPr>
+          <w:b w:val="false"/>
+          <w:i w:val="false"/>
+          <w:sz w:val="22"/>
+        </w:rPr>
+        <w:t>P</w:t>
+      </w:r>
+      <w:r>
+        <w:rPr>
+          <w:b w:val="false"/>
+          <w:i w:val="false"/>
+          <w:sz w:val="22"/>
+        </w:rPr>
+        <w:t>S</w:t>
+      </w:r>
+      <w:r>
+        <w:rPr>
+          <w:b w:val="false"/>
+          <w:i w:val="false"/>
+          <w:sz w:val="22"/>
+        </w:rPr>
+        <w:t xml:space="preserve"> para variables de lluvia agrupadas de forma mensual y ERA5 para variables </w:t>
+      </w:r>
+      <w:r>
+        <w:rPr/>
+        <w:t>meteorológicas</w:t>
+      </w:r>
+      <w:r>
+        <w:rPr>
+          <w:b w:val="false"/>
+          <w:i w:val="false"/>
+          <w:sz w:val="22"/>
+        </w:rPr>
+        <w:t xml:space="preserve"> de clima, humedad.</w:t>
       </w:r>
     </w:p>
     <w:p>
@@ -603,23 +694,23 @@
           <w:i w:val="false"/>
           <w:sz w:val="22"/>
         </w:rPr>
-        <w:t xml:space="preserve">ustitución de la variable objetivo, </w:t>
-      </w:r>
-      <w:r>
-        <w:rPr>
-          <w:b w:val="false"/>
-          <w:i w:val="false"/>
-          <w:sz w:val="22"/>
-        </w:rPr>
-        <w:t>e</w:t>
-      </w:r>
-      <w:r>
-        <w:rPr>
-          <w:b w:val="false"/>
-          <w:i w:val="false"/>
-          <w:sz w:val="22"/>
-        </w:rPr>
-        <w:t xml:space="preserve">n la Entrega 1 el modelo intentaba predecir brotes de </w:t>
+        <w:t xml:space="preserve">ustitución de la variable objetivo: </w:t>
+      </w:r>
+      <w:r>
+        <w:rPr>
+          <w:b w:val="false"/>
+          <w:i w:val="false"/>
+          <w:sz w:val="22"/>
+        </w:rPr>
+        <w:t>E</w:t>
+      </w:r>
+      <w:r>
+        <w:rPr>
+          <w:b w:val="false"/>
+          <w:i w:val="false"/>
+          <w:sz w:val="22"/>
+        </w:rPr>
+        <w:t xml:space="preserve">n la Entrega 1, el modelo intentaba predecir brotes de </w:t>
       </w:r>
       <w:r>
         <w:rPr>
@@ -636,15 +727,25 @@
           <w:i w:val="false"/>
           <w:sz w:val="22"/>
         </w:rPr>
-        <w:t xml:space="preserve">(casos_grave &gt; P75), </w:t>
-      </w:r>
-      <w:r>
-        <w:rPr>
-          <w:b w:val="false"/>
-          <w:i w:val="false"/>
-          <w:sz w:val="22"/>
-        </w:rPr>
-        <w:t>ahora tenemos un enfoque orientado al data set de dengue, pues dengue grave son casos individuales ya muy avanzados.</w:t>
+        <w:t xml:space="preserve">(casos_grave &gt; P75); </w:t>
+      </w:r>
+      <w:r>
+        <w:rPr>
+          <w:b w:val="false"/>
+          <w:i w:val="false"/>
+          <w:sz w:val="22"/>
+        </w:rPr>
+        <w:t>ahora tenemos un enfoque orientado al dataset de dengue, pues dengue grave son casos individuales ya muy avanzados.</w:t>
+      </w:r>
+    </w:p>
+    <w:p>
+      <w:pPr>
+        <w:pStyle w:val="BodyText"/>
+        <w:rPr/>
+      </w:pPr>
+      <w:r>
+        <w:rPr/>
+        <w:t>se agregó casos_clasico_roll3, la suma móvil de tres meses de los casos previos, como variable de tendencia. No usa el mes en curso ni la etiqueta</w:t>
       </w:r>
     </w:p>
     <w:p>
@@ -652,36 +753,223 @@
         <w:pStyle w:val="Normal"/>
         <w:spacing w:before="0" w:after="120"/>
         <w:jc w:val="both"/>
-        <w:rPr>
-          <w:rFonts w:ascii="Calibri" w:hAnsi="Calibri"/>
-          <w:b w:val="false"/>
-          <w:i w:val="false"/>
-          <w:sz w:val="22"/>
-        </w:rPr>
-      </w:pPr>
-      <w:r>
-        <w:rPr>
-          <w:b w:val="false"/>
-          <w:i w:val="false"/>
-          <w:sz w:val="22"/>
-        </w:rPr>
-        <w:t xml:space="preserve">Incluimos la variable objetivo como una variable descriptora calculando </w:t>
-      </w:r>
-      <w:r>
-        <w:rPr>
-          <w:b w:val="false"/>
-          <w:i w:val="false"/>
-          <w:sz w:val="22"/>
-        </w:rPr>
-        <w:t>su</w:t>
-      </w:r>
-      <w:r>
-        <w:rPr>
-          <w:b w:val="false"/>
-          <w:i w:val="false"/>
-          <w:sz w:val="22"/>
-        </w:rPr>
-        <w:t xml:space="preserve"> media movil y asi tener esta senal independiente que muestra la aceleracion de los casos por  municipio.</w:t>
+        <w:rPr/>
+      </w:pPr>
+      <w:r>
+        <w:rPr>
+          <w:b w:val="false"/>
+          <w:i w:val="false"/>
+          <w:sz w:val="22"/>
+        </w:rPr>
+        <w:t>Est</w:t>
+      </w:r>
+      <w:r>
+        <w:rPr>
+          <w:b w:val="false"/>
+          <w:i w:val="false"/>
+          <w:sz w:val="22"/>
+        </w:rPr>
+        <w:t>os</w:t>
+      </w:r>
+      <w:r>
+        <w:rPr>
+          <w:b w:val="false"/>
+          <w:i w:val="false"/>
+          <w:sz w:val="22"/>
+        </w:rPr>
+        <w:t xml:space="preserve"> cambio</w:t>
+      </w:r>
+      <w:r>
+        <w:rPr>
+          <w:b w:val="false"/>
+          <w:i w:val="false"/>
+          <w:sz w:val="22"/>
+        </w:rPr>
+        <w:t>s</w:t>
+      </w:r>
+      <w:r>
+        <w:rPr>
+          <w:b w:val="false"/>
+          <w:i w:val="false"/>
+          <w:sz w:val="22"/>
+        </w:rPr>
+        <w:t xml:space="preserve"> nos permite</w:t>
+      </w:r>
+      <w:r>
+        <w:rPr>
+          <w:b w:val="false"/>
+          <w:i w:val="false"/>
+          <w:sz w:val="22"/>
+        </w:rPr>
+        <w:t>n</w:t>
+      </w:r>
+      <w:r>
+        <w:rPr>
+          <w:b w:val="false"/>
+          <w:i w:val="false"/>
+          <w:sz w:val="22"/>
+        </w:rPr>
+        <w:t xml:space="preserve"> determinar con una mayor </w:t>
+      </w:r>
+      <w:r>
+        <w:rPr/>
+        <w:t>precisión</w:t>
+      </w:r>
+      <w:r>
+        <w:rPr>
+          <w:b w:val="false"/>
+          <w:i w:val="false"/>
+          <w:sz w:val="22"/>
+        </w:rPr>
+        <w:t xml:space="preserve"> las alertas tempranas </w:t>
+      </w:r>
+      <w:r>
+        <w:rPr>
+          <w:b w:val="false"/>
+          <w:i w:val="false"/>
+          <w:sz w:val="22"/>
+        </w:rPr>
+        <w:t>y su acceleraci</w:t>
+      </w:r>
+      <w:r>
+        <w:rPr/>
+        <w:t>ó</w:t>
+      </w:r>
+      <w:r>
+        <w:rPr>
+          <w:b w:val="false"/>
+          <w:i w:val="false"/>
+          <w:sz w:val="22"/>
+        </w:rPr>
+        <w:t>n casos_clasicos_roll3</w:t>
+      </w:r>
+      <w:r>
+        <w:rPr>
+          <w:b w:val="false"/>
+          <w:i w:val="false"/>
+          <w:sz w:val="22"/>
+        </w:rPr>
+        <w:t>, deb</w:t>
+      </w:r>
+      <w:r>
+        <w:rPr>
+          <w:b w:val="false"/>
+          <w:i w:val="false"/>
+          <w:sz w:val="22"/>
+        </w:rPr>
+        <w:t>i</w:t>
+      </w:r>
+      <w:r>
+        <w:rPr>
+          <w:b w:val="false"/>
+          <w:i w:val="false"/>
+          <w:sz w:val="22"/>
+        </w:rPr>
+        <w:t xml:space="preserve">do a que tenemos una base </w:t>
+      </w:r>
+      <w:r>
+        <w:rPr/>
+        <w:t>más</w:t>
+      </w:r>
+      <w:r>
+        <w:rPr>
+          <w:b w:val="false"/>
+          <w:i w:val="false"/>
+          <w:sz w:val="22"/>
+        </w:rPr>
+        <w:t xml:space="preserve"> a</w:t>
+      </w:r>
+      <w:r>
+        <w:rPr>
+          <w:b w:val="false"/>
+          <w:i w:val="false"/>
+          <w:sz w:val="22"/>
+        </w:rPr>
+        <w:t>m</w:t>
+      </w:r>
+      <w:r>
+        <w:rPr>
+          <w:b w:val="false"/>
+          <w:i w:val="false"/>
+          <w:sz w:val="22"/>
+        </w:rPr>
+        <w:t xml:space="preserve">plia para analizar </w:t>
+      </w:r>
+      <w:r>
+        <w:rPr>
+          <w:b w:val="false"/>
+          <w:i w:val="false"/>
+          <w:sz w:val="22"/>
+        </w:rPr>
+        <w:t xml:space="preserve">y mejorar la </w:t>
+      </w:r>
+      <w:r>
+        <w:rPr/>
+        <w:t>predicción</w:t>
+      </w:r>
+      <w:r>
+        <w:rPr>
+          <w:b w:val="false"/>
+          <w:i w:val="false"/>
+          <w:sz w:val="22"/>
+        </w:rPr>
+        <w:t xml:space="preserve"> de </w:t>
+      </w:r>
+      <w:r>
+        <w:rPr>
+          <w:b w:val="false"/>
+          <w:i w:val="false"/>
+          <w:sz w:val="22"/>
+        </w:rPr>
+        <w:t>brote</w:t>
+      </w:r>
+      <w:r>
+        <w:rPr>
+          <w:b w:val="false"/>
+          <w:i w:val="false"/>
+          <w:sz w:val="22"/>
+        </w:rPr>
+        <w:t>s</w:t>
+      </w:r>
+      <w:r>
+        <w:rPr>
+          <w:b w:val="false"/>
+          <w:i w:val="false"/>
+          <w:sz w:val="22"/>
+        </w:rPr>
+        <w:t xml:space="preserve"> de forma anticipada.</w:t>
+      </w:r>
+    </w:p>
+    <w:p>
+      <w:pPr>
+        <w:pStyle w:val="Normal"/>
+        <w:spacing w:before="280" w:after="80"/>
+        <w:rPr/>
+      </w:pPr>
+      <w:r>
+        <w:rPr>
+          <w:b/>
+          <w:i w:val="false"/>
+          <w:color w:val="1654A2"/>
+          <w:sz w:val="28"/>
+        </w:rPr>
+        <w:t>2. Modelos desarrollados y su evaluación</w:t>
+      </w:r>
+    </w:p>
+    <w:p>
+      <w:pPr>
+        <w:pStyle w:val="Normal"/>
+        <w:spacing w:before="160" w:after="80"/>
+        <w:rPr/>
+      </w:pPr>
+      <w:r>
+        <w:rPr>
+          <w:b/>
+          <w:i w:val="false"/>
+          <w:color w:val="1A1A1A"/>
+          <w:sz w:val="24"/>
+        </w:rPr>
+        <w:t>2.1 Pipeline de características</w:t>
       </w:r>
     </w:p>
     <w:p>
@@ -702,39 +990,7 @@
           <w:i w:val="false"/>
           <w:sz w:val="22"/>
         </w:rPr>
-        <w:t>Estos cambios nos permiten determinar con una mayor precision las alertas tempranas debido a que tenemos una base mas aplia para analizar y observando su acceleracion tenemos una mayor certeza de un posible brote de forma anticipada.</w:t>
-      </w:r>
-    </w:p>
-    <w:p>
-      <w:pPr>
-        <w:pStyle w:val="Normal"/>
-        <w:spacing w:before="280" w:after="80"/>
-        <w:rPr/>
-      </w:pPr>
-      <w:r>
-        <w:rPr>
-          <w:b/>
-          <w:i w:val="false"/>
-          <w:color w:val="1654A2"/>
-          <w:sz w:val="28"/>
-        </w:rPr>
-        <w:t>2. Modelos desarrollados y su evaluación</w:t>
-      </w:r>
-    </w:p>
-    <w:p>
-      <w:pPr>
-        <w:pStyle w:val="Normal"/>
-        <w:spacing w:before="160" w:after="80"/>
-        <w:rPr/>
-      </w:pPr>
-      <w:r>
-        <w:rPr>
-          <w:b/>
-          <w:i w:val="false"/>
-          <w:color w:val="1A1A1A"/>
-          <w:sz w:val="24"/>
-        </w:rPr>
-        <w:t>2.1 Pipeline de características</w:t>
+        <w:t>El pipeline parte de los archivos SIVIGILA crudos y produce el panel de features en dos etapas.</w:t>
       </w:r>
     </w:p>
     <w:p>
@@ -755,7 +1011,7 @@
           <w:i w:val="false"/>
           <w:sz w:val="22"/>
         </w:rPr>
-        <w:t>El pipeline parte de los archivos SIVIGILA crudos y produce el panel de features en dos etapas.</w:t>
+        <w:t>La primera (build_panel.py) consolida los registros diarios en conteos mensuales por municipio, completa el panel con ceros para municipio-mes sin casos y excluye registros con lugar de ocurrencia exterior o desconocido.</w:t>
       </w:r>
     </w:p>
     <w:p>
@@ -776,28 +1032,23 @@
           <w:i w:val="false"/>
           <w:sz w:val="22"/>
         </w:rPr>
-        <w:t>La primera (build_panel.py) consolida los registros diarios en conteos mensuales por municipio, completa el panel con ceros para municipio-mes sin casos, y excluye registros con lugar de ocurrencia exterior o desconocido.</w:t>
-      </w:r>
-    </w:p>
-    <w:p>
-      <w:pPr>
-        <w:pStyle w:val="Normal"/>
-        <w:spacing w:before="0" w:after="120"/>
-        <w:jc w:val="both"/>
-        <w:rPr>
-          <w:rFonts w:ascii="Calibri" w:hAnsi="Calibri"/>
-          <w:b w:val="false"/>
-          <w:i w:val="false"/>
-          <w:sz w:val="22"/>
-        </w:rPr>
-      </w:pPr>
-      <w:r>
-        <w:rPr>
-          <w:b w:val="false"/>
-          <w:i w:val="false"/>
-          <w:sz w:val="22"/>
-        </w:rPr>
-        <w:t>La segunda etapa (build_features.py) calcula 28 predictoras organizadas en cuatro grupos:</w:t>
+        <w:t xml:space="preserve">La segunda etapa (build_features.py) calcula </w:t>
+      </w:r>
+      <w:r>
+        <w:rPr>
+          <w:b w:val="false"/>
+          <w:i w:val="false"/>
+          <w:sz w:val="22"/>
+        </w:rPr>
+        <w:t xml:space="preserve">41 </w:t>
+      </w:r>
+      <w:r>
+        <w:rPr>
+          <w:b w:val="false"/>
+          <w:i w:val="false"/>
+          <w:sz w:val="22"/>
+        </w:rPr>
+        <w:t>predictoras organizadas en cuatro grupos:</w:t>
       </w:r>
     </w:p>
     <w:p>
@@ -859,28 +1110,63 @@
         </w:numPr>
         <w:spacing w:before="0" w:after="120"/>
         <w:jc w:val="both"/>
-        <w:rPr>
-          <w:rFonts w:ascii="Calibri" w:hAnsi="Calibri"/>
-          <w:b w:val="false"/>
-          <w:i w:val="false"/>
-          <w:sz w:val="22"/>
-        </w:rPr>
-      </w:pPr>
-      <w:r>
-        <w:rPr>
-          <w:b w:val="false"/>
-          <w:i w:val="false"/>
-          <w:sz w:val="22"/>
-        </w:rPr>
-        <w:t xml:space="preserve">El tercero son componentes trigonométricas de estacionalidad (mes_sin, mes_cos), </w:t>
-      </w:r>
-      <w:r>
-        <w:rPr>
-          <w:b w:val="false"/>
-          <w:i w:val="false"/>
-          <w:sz w:val="22"/>
-        </w:rPr>
-        <w:t>convertir las fechas con la funcion seno y coseno para representar las patrones estacionales del anio.</w:t>
+        <w:rPr/>
+      </w:pPr>
+      <w:r>
+        <w:rPr>
+          <w:b w:val="false"/>
+          <w:i w:val="false"/>
+          <w:sz w:val="22"/>
+        </w:rPr>
+        <w:t xml:space="preserve">El tercero son componentes trigonométricas de estacionalidad (mes_sin, mes_cos); </w:t>
+      </w:r>
+      <w:r>
+        <w:rPr>
+          <w:b w:val="false"/>
+          <w:i w:val="false"/>
+          <w:sz w:val="22"/>
+        </w:rPr>
+        <w:t xml:space="preserve">convertir las fechas con la </w:t>
+      </w:r>
+      <w:r>
+        <w:rPr/>
+        <w:t>función</w:t>
+      </w:r>
+      <w:r>
+        <w:rPr>
+          <w:b w:val="false"/>
+          <w:i w:val="false"/>
+          <w:sz w:val="22"/>
+        </w:rPr>
+        <w:t xml:space="preserve"> seno y coseno para representar l</w:t>
+      </w:r>
+      <w:r>
+        <w:rPr>
+          <w:b w:val="false"/>
+          <w:i w:val="false"/>
+          <w:sz w:val="22"/>
+        </w:rPr>
+        <w:t>o</w:t>
+      </w:r>
+      <w:r>
+        <w:rPr>
+          <w:b w:val="false"/>
+          <w:i w:val="false"/>
+          <w:sz w:val="22"/>
+        </w:rPr>
+        <w:t xml:space="preserve">s patrones estacionales del </w:t>
+      </w:r>
+      <w:r>
+        <w:rPr/>
+        <w:t>año</w:t>
+      </w:r>
+      <w:r>
+        <w:rPr>
+          <w:b w:val="false"/>
+          <w:i w:val="false"/>
+          <w:sz w:val="22"/>
+        </w:rPr>
+        <w:t>.</w:t>
       </w:r>
     </w:p>
     <w:p>
@@ -955,20 +1241,27 @@
         <w:pStyle w:val="Normal"/>
         <w:spacing w:before="0" w:after="120"/>
         <w:jc w:val="both"/>
-        <w:rPr>
-          <w:rFonts w:ascii="Calibri" w:hAnsi="Calibri"/>
-          <w:b w:val="false"/>
-          <w:i w:val="false"/>
-          <w:sz w:val="22"/>
-        </w:rPr>
-      </w:pPr>
-      <w:r>
-        <w:rPr>
-          <w:b w:val="false"/>
-          <w:i w:val="false"/>
-          <w:sz w:val="22"/>
-        </w:rPr>
-        <w:t xml:space="preserve">Para hacer la correcta evaluacion de estas predicciones utilizamos AUROC, </w:t>
+        <w:rPr/>
+      </w:pPr>
+      <w:r>
+        <w:rPr>
+          <w:b w:val="false"/>
+          <w:i w:val="false"/>
+          <w:sz w:val="22"/>
+        </w:rPr>
+        <w:t xml:space="preserve">Para hacer la correcta </w:t>
+      </w:r>
+      <w:r>
+        <w:rPr/>
+        <w:t>evaluación</w:t>
+      </w:r>
+      <w:r>
+        <w:rPr>
+          <w:b w:val="false"/>
+          <w:i w:val="false"/>
+          <w:sz w:val="22"/>
+        </w:rPr>
+        <w:t xml:space="preserve"> de estas predicciones utilizamos AUROC, </w:t>
       </w:r>
       <w:r>
         <w:rPr>
@@ -985,15 +1278,89 @@
           <w:i w:val="false"/>
           <w:sz w:val="22"/>
         </w:rPr>
-        <w:t>un caso postivo es un mes donde en el municipio se identifica exceso de dengue;</w:t>
-      </w:r>
-      <w:r>
-        <w:rPr>
-          <w:b w:val="false"/>
-          <w:i w:val="false"/>
-          <w:sz w:val="22"/>
-        </w:rPr>
-        <w:t xml:space="preserve"> respecto al trade-off somos concientes de que los falsos negativos son el objetivo a reducir pues el riesgo de que el modelo haga una prediccion como “todo normal” cuando enrealidad hay un brote es muy costosa, un error grave que podria costar la vida de decenas, cientos </w:t>
+        <w:t>un caso pos</w:t>
+      </w:r>
+      <w:r>
+        <w:rPr>
+          <w:b/>
+          <w:bCs/>
+          <w:i w:val="false"/>
+          <w:sz w:val="22"/>
+        </w:rPr>
+        <w:t>i</w:t>
+      </w:r>
+      <w:r>
+        <w:rPr>
+          <w:b/>
+          <w:bCs/>
+          <w:i w:val="false"/>
+          <w:sz w:val="22"/>
+        </w:rPr>
+        <w:t>tivo es un mes donde en el municipio se identifica exceso de dengue;</w:t>
+      </w:r>
+      <w:r>
+        <w:rPr>
+          <w:b w:val="false"/>
+          <w:i w:val="false"/>
+          <w:sz w:val="22"/>
+        </w:rPr>
+        <w:t xml:space="preserve"> respecto al trade-off, somos con</w:t>
+      </w:r>
+      <w:r>
+        <w:rPr>
+          <w:b w:val="false"/>
+          <w:i w:val="false"/>
+          <w:sz w:val="22"/>
+        </w:rPr>
+        <w:t>s</w:t>
+      </w:r>
+      <w:r>
+        <w:rPr>
+          <w:b w:val="false"/>
+          <w:i w:val="false"/>
+          <w:sz w:val="22"/>
+        </w:rPr>
+        <w:t xml:space="preserve">cientes de que los falsos negativos son el objetivo a reducir, pues el riesgo de que el modelo haga una </w:t>
+      </w:r>
+      <w:r>
+        <w:rPr/>
+        <w:t>predicción</w:t>
+      </w:r>
+      <w:r>
+        <w:rPr>
+          <w:b w:val="false"/>
+          <w:i w:val="false"/>
+          <w:sz w:val="22"/>
+        </w:rPr>
+        <w:t xml:space="preserve"> como “todo normal” cuando en realidad hay un brote es muy costos</w:t>
+      </w:r>
+      <w:r>
+        <w:rPr>
+          <w:b w:val="false"/>
+          <w:i w:val="false"/>
+          <w:sz w:val="22"/>
+        </w:rPr>
+        <w:t>o</w:t>
+      </w:r>
+      <w:r>
+        <w:rPr>
+          <w:b w:val="false"/>
+          <w:i w:val="false"/>
+          <w:sz w:val="22"/>
+        </w:rPr>
+        <w:t xml:space="preserve">, un error grave que </w:t>
+      </w:r>
+      <w:r>
+        <w:rPr/>
+        <w:t>podría</w:t>
+      </w:r>
+      <w:r>
+        <w:rPr>
+          <w:b w:val="false"/>
+          <w:i w:val="false"/>
+          <w:sz w:val="22"/>
+        </w:rPr>
+        <w:t xml:space="preserve"> costar la vida de decenas, cientos </w:t>
       </w:r>
       <w:r>
         <w:rPr>
@@ -1245,12 +1612,24 @@
       </w:r>
       <w:r>
         <w:rPr>
+          <w:rFonts w:ascii="Calibri;serif" w:hAnsi="Calibri;serif"/>
           <w:b/>
           <w:i w:val="false"/>
+          <w:caps w:val="false"/>
+          <w:smallCaps w:val="false"/>
           <w:color w:val="1A1A1A"/>
           <w:sz w:val="24"/>
         </w:rPr>
-        <w:t>Exploracion de modelos</w:t>
+        <w:t>Exploración</w:t>
+      </w:r>
+      <w:r>
+        <w:rPr>
+          <w:b/>
+          <w:i w:val="false"/>
+          <w:color w:val="1A1A1A"/>
+          <w:sz w:val="24"/>
+        </w:rPr>
+        <w:t xml:space="preserve"> de modelos</w:t>
       </w:r>
     </w:p>
     <w:p>
@@ -1266,23 +1645,87 @@
           <w:i w:val="false"/>
           <w:sz w:val="22"/>
         </w:rPr>
-        <w:t xml:space="preserve">Se entrenaron cinco modelos sobre la misma partición temporal (entrenamiento: 2007-2023, prueba: 2024 </w:t>
-      </w:r>
-      <w:r>
-        <w:rPr>
-          <w:b w:val="false"/>
-          <w:i w:val="false"/>
-          <w:sz w:val="22"/>
-        </w:rPr>
-        <w:t xml:space="preserve">y </w:t>
-      </w:r>
-      <w:r>
-        <w:rPr>
-          <w:b w:val="false"/>
-          <w:i w:val="false"/>
-          <w:sz w:val="22"/>
-        </w:rPr>
-        <w:t xml:space="preserve">validación interna sobre </w:t>
+        <w:t xml:space="preserve">Se entrenaron cinco modelos sobre la misma partición temporal: entrenamiento </w:t>
+      </w:r>
+      <w:r>
+        <w:rPr>
+          <w:b w:val="false"/>
+          <w:i w:val="false"/>
+          <w:sz w:val="22"/>
+        </w:rPr>
+        <w:t>de</w:t>
+      </w:r>
+      <w:r>
+        <w:rPr>
+          <w:b w:val="false"/>
+          <w:i w:val="false"/>
+          <w:sz w:val="22"/>
+        </w:rPr>
+        <w:t xml:space="preserve"> 2007 </w:t>
+      </w:r>
+      <w:r>
+        <w:rPr>
+          <w:b w:val="false"/>
+          <w:i w:val="false"/>
+          <w:sz w:val="22"/>
+        </w:rPr>
+        <w:t xml:space="preserve">a </w:t>
+      </w:r>
+      <w:r>
+        <w:rPr>
+          <w:b w:val="false"/>
+          <w:i w:val="false"/>
+          <w:sz w:val="22"/>
+        </w:rPr>
+        <w:t>202</w:t>
+      </w:r>
+      <w:r>
+        <w:rPr>
+          <w:b w:val="false"/>
+          <w:i w:val="false"/>
+          <w:sz w:val="22"/>
+        </w:rPr>
+        <w:t>2</w:t>
+      </w:r>
+      <w:r>
+        <w:rPr>
+          <w:b w:val="false"/>
+          <w:i w:val="false"/>
+          <w:sz w:val="22"/>
+        </w:rPr>
+        <w:t>, prueba</w:t>
+      </w:r>
+      <w:r>
+        <w:rPr>
+          <w:b w:val="false"/>
+          <w:i w:val="false"/>
+          <w:sz w:val="22"/>
+        </w:rPr>
+        <w:t>s</w:t>
+      </w:r>
+      <w:r>
+        <w:rPr>
+          <w:b w:val="false"/>
+          <w:i w:val="false"/>
+          <w:sz w:val="22"/>
+        </w:rPr>
+        <w:t xml:space="preserve"> 202</w:t>
+      </w:r>
+      <w:r>
+        <w:rPr>
+          <w:b w:val="false"/>
+          <w:i w:val="false"/>
+          <w:sz w:val="22"/>
+        </w:rPr>
+        <w:t>3</w:t>
+      </w:r>
+      <w:r>
+        <w:rPr>
+          <w:b w:val="false"/>
+          <w:i w:val="false"/>
+          <w:sz w:val="22"/>
+        </w:rPr>
+        <w:t xml:space="preserve"> - </w:t>
       </w:r>
       <w:r>
         <w:rPr>
@@ -1298,7 +1741,52 @@
           <w:i w:val="false"/>
           <w:sz w:val="22"/>
         </w:rPr>
-        <w:t xml:space="preserve"> para selección de umbral. La variable objetivo en todos los casos es brote (casos_clasico &gt; P75).</w:t>
+        <w:t xml:space="preserve"> para selección de umbral. La variable objetivo en todos los casos es brote (casos_clasico &gt; P75); </w:t>
+      </w:r>
+      <w:r>
+        <w:rPr>
+          <w:b w:val="false"/>
+          <w:i w:val="false"/>
+          <w:sz w:val="22"/>
+        </w:rPr>
+        <w:t>l</w:t>
+      </w:r>
+      <w:r>
+        <w:rPr>
+          <w:rFonts w:ascii="Calibri;serif" w:hAnsi="Calibri;serif"/>
+          <w:b w:val="false"/>
+          <w:i w:val="false"/>
+          <w:caps w:val="false"/>
+          <w:smallCaps w:val="false"/>
+          <w:sz w:val="22"/>
+        </w:rPr>
+        <w:t>selección de hiperparámetros</w:t>
+      </w:r>
+      <w:r>
+        <w:rPr>
+          <w:caps w:val="false"/>
+          <w:smallCaps w:val="false"/>
+        </w:rPr>
+        <w:t> </w:t>
+      </w:r>
+      <w:r>
+        <w:rPr>
+          <w:rFonts w:ascii="Calibri;serif" w:hAnsi="Calibri;serif"/>
+          <w:b w:val="false"/>
+          <w:i w:val="false"/>
+          <w:caps w:val="false"/>
+          <w:smallCaps w:val="false"/>
+          <w:sz w:val="22"/>
+        </w:rPr>
+        <w:t>se hizo con validación</w:t>
+      </w:r>
+      <w:r>
+        <w:rPr>
+          <w:b w:val="false"/>
+          <w:i w:val="false"/>
+          <w:sz w:val="22"/>
+        </w:rPr>
+        <w:t xml:space="preserve"> cruzada de ventana expansiva sobre el periodo 2015-2022.</w:t>
       </w:r>
     </w:p>
     <w:p>
@@ -1322,7 +1810,7 @@
           <w:i w:val="false"/>
           <w:sz w:val="22"/>
         </w:rPr>
-        <w:t>XGBoost: clasificador de gradient boosting con 400 estimadores, profundidad máxima 6, learning rate 0,05 y scale_pos_weight 5,42 para el desbalance de clases. Early stopping en 30 rondas sobre AUCPR determinó 109 iteraciones óptimas. Umbral calibrado en 0.61 maximizando F1 en validación.</w:t>
+        <w:t>XGBoost: clasificador de gradient boosting con 400 estimadores, profundidad máxima 6, learning rate 0,05 y scale_pos_weight 5,42 para el desbalance de clases. Early stopping en 30 rondas sobre AUCPR determinó 109 iteraciones óptimas. Umbral calibrado en 0.61, maximizando F1 en validación.</w:t>
       </w:r>
     </w:p>
     <w:p>
@@ -1386,15 +1874,23 @@
           <w:i w:val="false"/>
           <w:sz w:val="22"/>
         </w:rPr>
-        <w:t xml:space="preserve">Regresion Logistica. </w:t>
-      </w:r>
-      <w:r>
-        <w:rPr>
-          <w:b w:val="false"/>
-          <w:i w:val="false"/>
-          <w:sz w:val="22"/>
-        </w:rPr>
-        <w:t>Referencia lineal con regularización L2 (C=0,1) y pesos balanceados por clase. Permite cuantificar el aporte de la no-linealidad del modelo ganador. Umbral 0,63.</w:t>
+        <w:t>Regresión</w:t>
+      </w:r>
+      <w:r>
+        <w:rPr>
+          <w:b/>
+          <w:i w:val="false"/>
+          <w:sz w:val="22"/>
+        </w:rPr>
+        <w:t xml:space="preserve"> Logistica. </w:t>
+      </w:r>
+      <w:r>
+        <w:rPr>
+          <w:b w:val="false"/>
+          <w:i w:val="false"/>
+          <w:sz w:val="22"/>
+        </w:rPr>
+        <w:t>Referencia lineal con regularización L2 (C=0,1) y pesos balanceados por clase. Permite cuantificar el aporte de la no linealidad del modelo ganador. Umbral 0,63.</w:t>
       </w:r>
     </w:p>
     <w:p>
@@ -1474,7 +1970,33 @@
           <w:color w:val="1A1A1A"/>
           <w:sz w:val="24"/>
         </w:rPr>
-        <w:t>2.4 Gestion de experimentos con MLflow</w:t>
+        <w:t xml:space="preserve">2.4 </w:t>
+      </w:r>
+      <w:r>
+        <w:rPr>
+          <w:b/>
+          <w:bCs/>
+          <w:sz w:val="24"/>
+          <w:szCs w:val="24"/>
+        </w:rPr>
+        <w:t>Gestión</w:t>
+      </w:r>
+      <w:r>
+        <w:rPr>
+          <w:sz w:val="24"/>
+          <w:szCs w:val="24"/>
+        </w:rPr>
+        <w:t xml:space="preserve"> </w:t>
+      </w:r>
+      <w:r>
+        <w:rPr>
+          <w:b/>
+          <w:i w:val="false"/>
+          <w:color w:val="1A1A1A"/>
+          <w:sz w:val="24"/>
+          <w:szCs w:val="24"/>
+        </w:rPr>
+        <w:t>de experimentos con MLflow</w:t>
       </w:r>
     </w:p>
     <w:p>
@@ -1484,7 +2006,17 @@
       </w:pPr>
       <w:r>
         <w:rPr/>
-        <w:t>Todos los entrenamientos se registran en el experimento dengue-brote-clasico de un servidor MLflow en EC2 (AWS), compartido por el equipo vía MLFLOW_TRACKING_URI.</w:t>
+        <w:t xml:space="preserve">Todos los entrenamientos se registran en el experimento </w:t>
+      </w:r>
+      <w:r>
+        <w:rPr/>
+        <w:t>sa</w:t>
+        <w:softHyphen/>
+        <w:t>t-dengue</w:t>
+      </w:r>
+      <w:r>
+        <w:rPr/>
+        <w:t xml:space="preserve"> de un servidor MLflow en EC2 (AWS), compartido por el equipo vía MLFLOW_TRACKING_URI.</w:t>
       </w:r>
     </w:p>
     <w:p>
@@ -1514,7 +2046,15 @@
       </w:pPr>
       <w:r>
         <w:rPr/>
-        <w:t>El repo incluye un MLproject: mlflow run . -e train_xgboost (o train_logistic, train_gam, train_rf, train_lgbm).</w:t>
+        <w:t>El repo incluye un MLproject: mlflow run . -e train_xgboost (o train_logistic, train_gam, train_rf, train_l</w:t>
+      </w:r>
+      <w:r>
+        <w:rPr/>
+        <w:softHyphen/>
+      </w:r>
+      <w:r>
+        <w:rPr/>
+        <w:t>gbm).</w:t>
       </w:r>
     </w:p>
     <w:p>
@@ -1531,12 +2071,7 @@
         <w:pStyle w:val="Normal"/>
         <w:spacing w:before="0" w:after="120"/>
         <w:jc w:val="center"/>
-        <w:rPr>
-          <w:rFonts w:ascii="Calibri" w:hAnsi="Calibri"/>
-          <w:b w:val="false"/>
-          <w:i/>
-          <w:sz w:val="22"/>
-        </w:rPr>
+        <w:rPr/>
       </w:pPr>
       <w:r>
         <w:drawing>
@@ -1594,7 +2129,41 @@
           <w:iCs/>
           <w:sz w:val="22"/>
         </w:rPr>
-        <w:t>* Instancia AWS para la ejecuccion de MLFlow</w:t>
+        <w:t xml:space="preserve">* Instancia AWS para la </w:t>
+      </w:r>
+      <w:r>
+        <w:rPr>
+          <w:i/>
+          <w:iCs/>
+        </w:rPr>
+        <w:t xml:space="preserve">ejecución </w:t>
+      </w:r>
+      <w:r>
+        <w:rPr>
+          <w:b w:val="false"/>
+          <w:i/>
+          <w:iCs/>
+          <w:sz w:val="22"/>
+        </w:rPr>
+        <w:t>de ML</w:t>
+      </w:r>
+      <w:r>
+        <w:rPr>
+          <w:b w:val="false"/>
+          <w:i/>
+          <w:iCs/>
+          <w:sz w:val="22"/>
+        </w:rPr>
+        <w:t>F</w:t>
+      </w:r>
+      <w:r>
+        <w:rPr>
+          <w:b w:val="false"/>
+          <w:i/>
+          <w:iCs/>
+          <w:sz w:val="22"/>
+        </w:rPr>
+        <w:t>low</w:t>
       </w:r>
     </w:p>
     <w:p>
@@ -1602,13 +2171,7 @@
         <w:pStyle w:val="Normal"/>
         <w:spacing w:before="0" w:after="120"/>
         <w:jc w:val="center"/>
-        <w:rPr>
-          <w:rFonts w:ascii="Calibri" w:hAnsi="Calibri"/>
-          <w:b w:val="false"/>
-          <w:i/>
-          <w:iCs/>
-          <w:sz w:val="22"/>
-        </w:rPr>
+        <w:rPr/>
       </w:pPr>
       <w:r>
         <w:drawing>
@@ -1665,7 +2228,20 @@
           <w:iCs/>
           <w:sz w:val="22"/>
         </w:rPr>
-        <w:t>*Experimentacion con MLFlow diferentes modelos</w:t>
+        <w:t>*Experimentaci</w:t>
+      </w:r>
+      <w:r>
+        <w:rPr/>
+        <w:t>ó</w:t>
+      </w:r>
+      <w:r>
+        <w:rPr>
+          <w:b w:val="false"/>
+          <w:i/>
+          <w:iCs/>
+          <w:sz w:val="22"/>
+        </w:rPr>
+        <w:t>n con MLFlow diferentes modelos</w:t>
       </w:r>
     </w:p>
     <w:p>
@@ -1681,7 +2257,36 @@
           <w:color w:val="1A1A1A"/>
           <w:sz w:val="24"/>
         </w:rPr>
-        <w:t>2.5 Evaluacion comparativa</w:t>
+        <w:t xml:space="preserve">2.5 </w:t>
+      </w:r>
+      <w:r>
+        <w:rPr>
+          <w:b/>
+          <w:bCs/>
+          <w:sz w:val="24"/>
+          <w:szCs w:val="24"/>
+        </w:rPr>
+        <w:t>Evaluación</w:t>
+      </w:r>
+      <w:r>
+        <w:rPr>
+          <w:b/>
+          <w:bCs/>
+          <w:i w:val="false"/>
+          <w:color w:val="1A1A1A"/>
+          <w:sz w:val="24"/>
+          <w:szCs w:val="24"/>
+        </w:rPr>
+        <w:t xml:space="preserve"> </w:t>
+      </w:r>
+      <w:r>
+        <w:rPr>
+          <w:b/>
+          <w:i w:val="false"/>
+          <w:color w:val="1A1A1A"/>
+          <w:sz w:val="24"/>
+        </w:rPr>
+        <w:t>comparativa</w:t>
       </w:r>
     </w:p>
     <w:p>
@@ -1697,13 +2302,81 @@
           <w:i w:val="false"/>
           <w:sz w:val="22"/>
         </w:rPr>
-        <w:t>La Tabla 1 resume el desempeño de todos los modelos sobre el conjunto de prueba 2024-2025, que comprende 26.736 municipio-mes con una tasa de brote del 43%, correspondiente a un período epidémico severo de dengue en Colombia.</w:t>
+        <w:t>La Tabla 1 resume el desempeño de todos los modelos sobre el conjunto de prueba 202</w:t>
+      </w:r>
+      <w:r>
+        <w:rPr>
+          <w:b w:val="false"/>
+          <w:i w:val="false"/>
+          <w:sz w:val="22"/>
+        </w:rPr>
+        <w:t>3</w:t>
+      </w:r>
+      <w:r>
+        <w:rPr>
+          <w:b w:val="false"/>
+          <w:i w:val="false"/>
+          <w:sz w:val="22"/>
+        </w:rPr>
+        <w:t xml:space="preserve">-2025, </w:t>
+      </w:r>
+      <w:r>
+        <w:rPr>
+          <w:b w:val="false"/>
+          <w:i w:val="false"/>
+          <w:sz w:val="22"/>
+        </w:rPr>
+        <w:t xml:space="preserve">restringido a Bucaramanga y Cali, con 70 meses de </w:t>
+      </w:r>
+      <w:r>
+        <w:rPr/>
+        <w:t xml:space="preserve">observación, </w:t>
+      </w:r>
+      <w:r>
+        <w:rPr>
+          <w:b w:val="false"/>
+          <w:i w:val="false"/>
+          <w:sz w:val="22"/>
+        </w:rPr>
+        <w:t xml:space="preserve"> de lo</w:t>
+      </w:r>
+      <w:r>
+        <w:rPr>
+          <w:b w:val="false"/>
+          <w:i w:val="false"/>
+          <w:sz w:val="22"/>
+        </w:rPr>
+        <w:t>s</w:t>
+      </w:r>
+      <w:r>
+        <w:rPr>
+          <w:b w:val="false"/>
+          <w:i w:val="false"/>
+          <w:sz w:val="22"/>
+        </w:rPr>
+        <w:t xml:space="preserve"> </w:t>
+      </w:r>
+      <w:r>
+        <w:rPr>
+          <w:b w:val="false"/>
+          <w:i w:val="false"/>
+          <w:sz w:val="22"/>
+        </w:rPr>
+        <w:t>c</w:t>
+      </w:r>
+      <w:r>
+        <w:rPr>
+          <w:b w:val="false"/>
+          <w:i w:val="false"/>
+          <w:sz w:val="22"/>
+        </w:rPr>
+        <w:t>uales 42 en estado de exceso (brote) y de ellos inicio.</w:t>
       </w:r>
     </w:p>
     <w:tbl>
       <w:tblPr>
         <w:tblStyle w:val="TableGrid"/>
-        <w:tblW w:w="8824" w:type="dxa"/>
+        <w:tblW w:w="5685" w:type="dxa"/>
         <w:jc w:val="center"/>
         <w:tblInd w:w="0" w:type="dxa"/>
         <w:tblLayout w:type="fixed"/>
@@ -1716,18 +2389,16 @@
         <w:tblLook w:noHBand="0" w:noVBand="1" w:firstColumn="1" w:lastRow="0" w:lastColumn="0" w:firstRow="1" w:val="04a0"/>
       </w:tblPr>
       <w:tblGrid>
-        <w:gridCol w:w="1474"/>
-        <w:gridCol w:w="1226"/>
-        <w:gridCol w:w="1447"/>
-        <w:gridCol w:w="1341"/>
-        <w:gridCol w:w="1077"/>
-        <w:gridCol w:w="2259"/>
+        <w:gridCol w:w="1890"/>
+        <w:gridCol w:w="990"/>
+        <w:gridCol w:w="1095"/>
+        <w:gridCol w:w="1710"/>
       </w:tblGrid>
       <w:tr>
         <w:trPr/>
         <w:tc>
           <w:tcPr>
-            <w:tcW w:w="1474" w:type="dxa"/>
+            <w:tcW w:w="1890" w:type="dxa"/>
             <w:tcBorders/>
             <w:shd w:fill="1654A2" w:val="clear"/>
           </w:tcPr>
@@ -1760,73 +2431,7 @@
         </w:tc>
         <w:tc>
           <w:tcPr>
-            <w:tcW w:w="1226" w:type="dxa"/>
-            <w:tcBorders/>
-            <w:shd w:fill="1654A2" w:val="clear"/>
-          </w:tcPr>
-          <w:p>
-            <w:pPr>
-              <w:pStyle w:val="Normal"/>
-              <w:widowControl/>
-              <w:spacing w:lineRule="auto" w:line="240" w:before="0" w:after="0"/>
-              <w:jc w:val="start"/>
-              <w:rPr>
-                <w:rFonts w:eastAsia="ＭＳ 明朝" w:cs=""/>
-                <w:kern w:val="0"/>
-                <w:szCs w:val="22"/>
-                <w:lang w:val="en-US" w:eastAsia="en-US" w:bidi="ar-SA"/>
-              </w:rPr>
-            </w:pPr>
-            <w:r>
-              <w:rPr>
-                <w:rFonts w:eastAsia="ＭＳ 明朝" w:cs=""/>
-                <w:b/>
-                <w:color w:val="FFFFFF"/>
-                <w:kern w:val="0"/>
-                <w:sz w:val="20"/>
-                <w:szCs w:val="22"/>
-                <w:lang w:val="en-US" w:eastAsia="en-US" w:bidi="ar-SA"/>
-              </w:rPr>
-              <w:t>AUROC</w:t>
-            </w:r>
-          </w:p>
-        </w:tc>
-        <w:tc>
-          <w:tcPr>
-            <w:tcW w:w="1447" w:type="dxa"/>
-            <w:tcBorders/>
-            <w:shd w:fill="1654A2" w:val="clear"/>
-          </w:tcPr>
-          <w:p>
-            <w:pPr>
-              <w:pStyle w:val="Normal"/>
-              <w:widowControl/>
-              <w:spacing w:lineRule="auto" w:line="240" w:before="0" w:after="0"/>
-              <w:jc w:val="start"/>
-              <w:rPr>
-                <w:rFonts w:eastAsia="ＭＳ 明朝" w:cs=""/>
-                <w:kern w:val="0"/>
-                <w:szCs w:val="22"/>
-                <w:lang w:val="en-US" w:eastAsia="en-US" w:bidi="ar-SA"/>
-              </w:rPr>
-            </w:pPr>
-            <w:r>
-              <w:rPr>
-                <w:rFonts w:eastAsia="ＭＳ 明朝" w:cs=""/>
-                <w:b/>
-                <w:color w:val="FFFFFF"/>
-                <w:kern w:val="0"/>
-                <w:sz w:val="20"/>
-                <w:szCs w:val="22"/>
-                <w:lang w:val="en-US" w:eastAsia="en-US" w:bidi="ar-SA"/>
-              </w:rPr>
-              <w:t>AP</w:t>
-            </w:r>
-          </w:p>
-        </w:tc>
-        <w:tc>
-          <w:tcPr>
-            <w:tcW w:w="1341" w:type="dxa"/>
+            <w:tcW w:w="990" w:type="dxa"/>
             <w:tcBorders/>
             <w:shd w:fill="1654A2" w:val="clear"/>
           </w:tcPr>
@@ -1859,7 +2464,7 @@
         </w:tc>
         <w:tc>
           <w:tcPr>
-            <w:tcW w:w="1077" w:type="dxa"/>
+            <w:tcW w:w="1095" w:type="dxa"/>
             <w:tcBorders/>
             <w:shd w:fill="1654A2" w:val="clear"/>
           </w:tcPr>
@@ -1886,13 +2491,13 @@
                 <w:szCs w:val="22"/>
                 <w:lang w:val="en-US" w:eastAsia="en-US" w:bidi="ar-SA"/>
               </w:rPr>
-              <w:t>Umbral</w:t>
+              <w:t>PR-AUC</w:t>
             </w:r>
           </w:p>
         </w:tc>
         <w:tc>
           <w:tcPr>
-            <w:tcW w:w="2259" w:type="dxa"/>
+            <w:tcW w:w="1710" w:type="dxa"/>
             <w:tcBorders/>
             <w:shd w:fill="1654A2" w:val="clear"/>
           </w:tcPr>
@@ -1928,7 +2533,7 @@
         <w:trPr/>
         <w:tc>
           <w:tcPr>
-            <w:tcW w:w="1474" w:type="dxa"/>
+            <w:tcW w:w="1890" w:type="dxa"/>
             <w:tcBorders/>
             <w:shd w:fill="E8F0FB" w:val="clear"/>
           </w:tcPr>
@@ -1959,7 +2564,7 @@
         </w:tc>
         <w:tc>
           <w:tcPr>
-            <w:tcW w:w="1226" w:type="dxa"/>
+            <w:tcW w:w="990" w:type="dxa"/>
             <w:tcBorders/>
             <w:shd w:fill="E8F0FB" w:val="clear"/>
           </w:tcPr>
@@ -1984,13 +2589,23 @@
                 <w:szCs w:val="22"/>
                 <w:lang w:val="en-US" w:eastAsia="en-US" w:bidi="ar-SA"/>
               </w:rPr>
-              <w:t>0.8974</w:t>
+              <w:t>0.</w:t>
+            </w:r>
+            <w:r>
+              <w:rPr>
+                <w:rFonts w:eastAsia="ＭＳ 明朝" w:cs=""/>
+                <w:kern w:val="0"/>
+                <w:sz w:val="20"/>
+                <w:szCs w:val="22"/>
+                <w:lang w:val="en-US" w:eastAsia="en-US" w:bidi="ar-SA"/>
+              </w:rPr>
+              <w:t>965</w:t>
             </w:r>
           </w:p>
         </w:tc>
         <w:tc>
           <w:tcPr>
-            <w:tcW w:w="1447" w:type="dxa"/>
+            <w:tcW w:w="1095" w:type="dxa"/>
             <w:tcBorders/>
             <w:shd w:fill="E8F0FB" w:val="clear"/>
           </w:tcPr>
@@ -2015,29 +2630,8 @@
                 <w:szCs w:val="22"/>
                 <w:lang w:val="en-US" w:eastAsia="en-US" w:bidi="ar-SA"/>
               </w:rPr>
-              <w:t>0.8797</w:t>
+              <w:t>0.</w:t>
             </w:r>
-          </w:p>
-        </w:tc>
-        <w:tc>
-          <w:tcPr>
-            <w:tcW w:w="1341" w:type="dxa"/>
-            <w:tcBorders/>
-            <w:shd w:fill="E8F0FB" w:val="clear"/>
-          </w:tcPr>
-          <w:p>
-            <w:pPr>
-              <w:pStyle w:val="Normal"/>
-              <w:widowControl/>
-              <w:spacing w:lineRule="auto" w:line="240" w:before="0" w:after="0"/>
-              <w:jc w:val="center"/>
-              <w:rPr>
-                <w:rFonts w:eastAsia="ＭＳ 明朝" w:cs=""/>
-                <w:kern w:val="0"/>
-                <w:szCs w:val="22"/>
-                <w:lang w:val="en-US" w:eastAsia="en-US" w:bidi="ar-SA"/>
-              </w:rPr>
-            </w:pPr>
             <w:r>
               <w:rPr>
                 <w:rFonts w:eastAsia="ＭＳ 明朝" w:cs=""/>
@@ -2046,44 +2640,13 @@
                 <w:szCs w:val="22"/>
                 <w:lang w:val="en-US" w:eastAsia="en-US" w:bidi="ar-SA"/>
               </w:rPr>
-              <w:t>0.789</w:t>
+              <w:t>991</w:t>
             </w:r>
           </w:p>
         </w:tc>
         <w:tc>
           <w:tcPr>
-            <w:tcW w:w="1077" w:type="dxa"/>
-            <w:tcBorders/>
-            <w:shd w:fill="E8F0FB" w:val="clear"/>
-          </w:tcPr>
-          <w:p>
-            <w:pPr>
-              <w:pStyle w:val="Normal"/>
-              <w:widowControl/>
-              <w:spacing w:lineRule="auto" w:line="240" w:before="0" w:after="0"/>
-              <w:jc w:val="center"/>
-              <w:rPr>
-                <w:rFonts w:eastAsia="ＭＳ 明朝" w:cs=""/>
-                <w:kern w:val="0"/>
-                <w:szCs w:val="22"/>
-                <w:lang w:val="en-US" w:eastAsia="en-US" w:bidi="ar-SA"/>
-              </w:rPr>
-            </w:pPr>
-            <w:r>
-              <w:rPr>
-                <w:rFonts w:eastAsia="ＭＳ 明朝" w:cs=""/>
-                <w:kern w:val="0"/>
-                <w:sz w:val="20"/>
-                <w:szCs w:val="22"/>
-                <w:lang w:val="en-US" w:eastAsia="en-US" w:bidi="ar-SA"/>
-              </w:rPr>
-              <w:t>0.65</w:t>
-            </w:r>
-          </w:p>
-        </w:tc>
-        <w:tc>
-          <w:tcPr>
-            <w:tcW w:w="2259" w:type="dxa"/>
+            <w:tcW w:w="1710" w:type="dxa"/>
             <w:tcBorders/>
             <w:shd w:fill="E8F0FB" w:val="clear"/>
           </w:tcPr>
@@ -2109,7 +2672,57 @@
                 <w:szCs w:val="22"/>
                 <w:lang w:val="en-US" w:eastAsia="en-US" w:bidi="ar-SA"/>
               </w:rPr>
-              <w:t>519/2329 (22%)</w:t>
+              <w:t>2</w:t>
+            </w:r>
+            <w:r>
+              <w:rPr>
+                <w:rFonts w:eastAsia="ＭＳ 明朝" w:cs=""/>
+                <w:kern w:val="0"/>
+                <w:sz w:val="22"/>
+                <w:szCs w:val="22"/>
+                <w:lang w:val="en-US" w:eastAsia="en-US" w:bidi="ar-SA"/>
+              </w:rPr>
+              <w:t>/</w:t>
+            </w:r>
+            <w:r>
+              <w:rPr>
+                <w:rFonts w:eastAsia="ＭＳ 明朝" w:cs=""/>
+                <w:kern w:val="0"/>
+                <w:sz w:val="22"/>
+                <w:szCs w:val="22"/>
+                <w:lang w:val="en-US" w:eastAsia="en-US" w:bidi="ar-SA"/>
+              </w:rPr>
+              <w:t>3</w:t>
+            </w:r>
+            <w:r>
+              <w:rPr>
+                <w:rFonts w:eastAsia="ＭＳ 明朝" w:cs=""/>
+                <w:kern w:val="0"/>
+                <w:sz w:val="22"/>
+                <w:szCs w:val="22"/>
+                <w:lang w:val="en-US" w:eastAsia="en-US" w:bidi="ar-SA"/>
+              </w:rPr>
+              <w:t xml:space="preserve"> (</w:t>
+            </w:r>
+            <w:r>
+              <w:rPr>
+                <w:rFonts w:eastAsia="ＭＳ 明朝" w:cs=""/>
+                <w:kern w:val="0"/>
+                <w:sz w:val="22"/>
+                <w:szCs w:val="22"/>
+                <w:lang w:val="en-US" w:eastAsia="en-US" w:bidi="ar-SA"/>
+              </w:rPr>
+              <w:t>66</w:t>
+            </w:r>
+            <w:r>
+              <w:rPr>
+                <w:rFonts w:eastAsia="ＭＳ 明朝" w:cs=""/>
+                <w:kern w:val="0"/>
+                <w:sz w:val="22"/>
+                <w:szCs w:val="22"/>
+                <w:lang w:val="en-US" w:eastAsia="en-US" w:bidi="ar-SA"/>
+              </w:rPr>
+              <w:t>%)</w:t>
             </w:r>
           </w:p>
         </w:tc>
@@ -2118,7 +2731,7 @@
         <w:trPr/>
         <w:tc>
           <w:tcPr>
-            <w:tcW w:w="1474" w:type="dxa"/>
+            <w:tcW w:w="1890" w:type="dxa"/>
             <w:tcBorders/>
           </w:tcPr>
           <w:p>
@@ -2148,7 +2761,7 @@
         </w:tc>
         <w:tc>
           <w:tcPr>
-            <w:tcW w:w="1226" w:type="dxa"/>
+            <w:tcW w:w="990" w:type="dxa"/>
             <w:tcBorders/>
           </w:tcPr>
           <w:p>
@@ -2172,13 +2785,23 @@
                 <w:szCs w:val="22"/>
                 <w:lang w:val="en-US" w:eastAsia="en-US" w:bidi="ar-SA"/>
               </w:rPr>
-              <w:t>0.8985</w:t>
+              <w:t>0.</w:t>
+            </w:r>
+            <w:r>
+              <w:rPr>
+                <w:rFonts w:eastAsia="ＭＳ 明朝" w:cs=""/>
+                <w:kern w:val="0"/>
+                <w:sz w:val="20"/>
+                <w:szCs w:val="22"/>
+                <w:lang w:val="en-US" w:eastAsia="en-US" w:bidi="ar-SA"/>
+              </w:rPr>
+              <w:t>965</w:t>
             </w:r>
           </w:p>
         </w:tc>
         <w:tc>
           <w:tcPr>
-            <w:tcW w:w="1447" w:type="dxa"/>
+            <w:tcW w:w="1095" w:type="dxa"/>
             <w:tcBorders/>
           </w:tcPr>
           <w:p>
@@ -2202,28 +2825,8 @@
                 <w:szCs w:val="22"/>
                 <w:lang w:val="en-US" w:eastAsia="en-US" w:bidi="ar-SA"/>
               </w:rPr>
-              <w:t>0.8803</w:t>
+              <w:t>0.</w:t>
             </w:r>
-          </w:p>
-        </w:tc>
-        <w:tc>
-          <w:tcPr>
-            <w:tcW w:w="1341" w:type="dxa"/>
-            <w:tcBorders/>
-          </w:tcPr>
-          <w:p>
-            <w:pPr>
-              <w:pStyle w:val="Normal"/>
-              <w:widowControl/>
-              <w:spacing w:lineRule="auto" w:line="240" w:before="0" w:after="0"/>
-              <w:jc w:val="center"/>
-              <w:rPr>
-                <w:rFonts w:eastAsia="ＭＳ 明朝" w:cs=""/>
-                <w:kern w:val="0"/>
-                <w:szCs w:val="22"/>
-                <w:lang w:val="en-US" w:eastAsia="en-US" w:bidi="ar-SA"/>
-              </w:rPr>
-            </w:pPr>
             <w:r>
               <w:rPr>
                 <w:rFonts w:eastAsia="ＭＳ 明朝" w:cs=""/>
@@ -2232,43 +2835,13 @@
                 <w:szCs w:val="22"/>
                 <w:lang w:val="en-US" w:eastAsia="en-US" w:bidi="ar-SA"/>
               </w:rPr>
-              <w:t>0.794</w:t>
+              <w:t>988</w:t>
             </w:r>
           </w:p>
         </w:tc>
         <w:tc>
           <w:tcPr>
-            <w:tcW w:w="1077" w:type="dxa"/>
-            <w:tcBorders/>
-          </w:tcPr>
-          <w:p>
-            <w:pPr>
-              <w:pStyle w:val="Normal"/>
-              <w:widowControl/>
-              <w:spacing w:lineRule="auto" w:line="240" w:before="0" w:after="0"/>
-              <w:jc w:val="center"/>
-              <w:rPr>
-                <w:rFonts w:eastAsia="ＭＳ 明朝" w:cs=""/>
-                <w:kern w:val="0"/>
-                <w:szCs w:val="22"/>
-                <w:lang w:val="en-US" w:eastAsia="en-US" w:bidi="ar-SA"/>
-              </w:rPr>
-            </w:pPr>
-            <w:r>
-              <w:rPr>
-                <w:rFonts w:eastAsia="ＭＳ 明朝" w:cs=""/>
-                <w:kern w:val="0"/>
-                <w:sz w:val="20"/>
-                <w:szCs w:val="22"/>
-                <w:lang w:val="en-US" w:eastAsia="en-US" w:bidi="ar-SA"/>
-              </w:rPr>
-              <w:t>0.52</w:t>
-            </w:r>
-          </w:p>
-        </w:tc>
-        <w:tc>
-          <w:tcPr>
-            <w:tcW w:w="2259" w:type="dxa"/>
+            <w:tcW w:w="1710" w:type="dxa"/>
             <w:tcBorders/>
           </w:tcPr>
           <w:p>
@@ -2293,7 +2866,57 @@
                 <w:szCs w:val="22"/>
                 <w:lang w:val="en-US" w:eastAsia="en-US" w:bidi="ar-SA"/>
               </w:rPr>
-              <w:t>694/2329 (30%)</w:t>
+              <w:t>2</w:t>
+            </w:r>
+            <w:r>
+              <w:rPr>
+                <w:rFonts w:eastAsia="ＭＳ 明朝" w:cs=""/>
+                <w:kern w:val="0"/>
+                <w:sz w:val="22"/>
+                <w:szCs w:val="22"/>
+                <w:lang w:val="en-US" w:eastAsia="en-US" w:bidi="ar-SA"/>
+              </w:rPr>
+              <w:t>/</w:t>
+            </w:r>
+            <w:r>
+              <w:rPr>
+                <w:rFonts w:eastAsia="ＭＳ 明朝" w:cs=""/>
+                <w:kern w:val="0"/>
+                <w:sz w:val="22"/>
+                <w:szCs w:val="22"/>
+                <w:lang w:val="en-US" w:eastAsia="en-US" w:bidi="ar-SA"/>
+              </w:rPr>
+              <w:t>3</w:t>
+            </w:r>
+            <w:r>
+              <w:rPr>
+                <w:rFonts w:eastAsia="ＭＳ 明朝" w:cs=""/>
+                <w:kern w:val="0"/>
+                <w:sz w:val="22"/>
+                <w:szCs w:val="22"/>
+                <w:lang w:val="en-US" w:eastAsia="en-US" w:bidi="ar-SA"/>
+              </w:rPr>
+              <w:t xml:space="preserve"> (</w:t>
+            </w:r>
+            <w:r>
+              <w:rPr>
+                <w:rFonts w:eastAsia="ＭＳ 明朝" w:cs=""/>
+                <w:kern w:val="0"/>
+                <w:sz w:val="22"/>
+                <w:szCs w:val="22"/>
+                <w:lang w:val="en-US" w:eastAsia="en-US" w:bidi="ar-SA"/>
+              </w:rPr>
+              <w:t>66</w:t>
+            </w:r>
+            <w:r>
+              <w:rPr>
+                <w:rFonts w:eastAsia="ＭＳ 明朝" w:cs=""/>
+                <w:kern w:val="0"/>
+                <w:sz w:val="22"/>
+                <w:szCs w:val="22"/>
+                <w:lang w:val="en-US" w:eastAsia="en-US" w:bidi="ar-SA"/>
+              </w:rPr>
+              <w:t>%)</w:t>
             </w:r>
           </w:p>
         </w:tc>
@@ -2302,7 +2925,7 @@
         <w:trPr/>
         <w:tc>
           <w:tcPr>
-            <w:tcW w:w="1474" w:type="dxa"/>
+            <w:tcW w:w="1890" w:type="dxa"/>
             <w:tcBorders/>
           </w:tcPr>
           <w:p>
@@ -2326,13 +2949,13 @@
                 <w:szCs w:val="22"/>
                 <w:lang w:val="en-US" w:eastAsia="en-US" w:bidi="ar-SA"/>
               </w:rPr>
-              <w:t>Logistica</w:t>
+              <w:t>C. endemico</w:t>
             </w:r>
           </w:p>
         </w:tc>
         <w:tc>
           <w:tcPr>
-            <w:tcW w:w="1226" w:type="dxa"/>
+            <w:tcW w:w="990" w:type="dxa"/>
             <w:tcBorders/>
           </w:tcPr>
           <w:p>
@@ -2356,13 +2979,23 @@
                 <w:szCs w:val="22"/>
                 <w:lang w:val="en-US" w:eastAsia="en-US" w:bidi="ar-SA"/>
               </w:rPr>
-              <w:t>0.8843</w:t>
+              <w:t>0.</w:t>
+            </w:r>
+            <w:r>
+              <w:rPr>
+                <w:rFonts w:eastAsia="ＭＳ 明朝" w:cs=""/>
+                <w:kern w:val="0"/>
+                <w:sz w:val="20"/>
+                <w:szCs w:val="22"/>
+                <w:lang w:val="en-US" w:eastAsia="en-US" w:bidi="ar-SA"/>
+              </w:rPr>
+              <w:t>951</w:t>
             </w:r>
           </w:p>
         </w:tc>
         <w:tc>
           <w:tcPr>
-            <w:tcW w:w="1447" w:type="dxa"/>
+            <w:tcW w:w="1095" w:type="dxa"/>
             <w:tcBorders/>
           </w:tcPr>
           <w:p>
@@ -2386,28 +3019,8 @@
                 <w:szCs w:val="22"/>
                 <w:lang w:val="en-US" w:eastAsia="en-US" w:bidi="ar-SA"/>
               </w:rPr>
-              <w:t>0.8629</w:t>
+              <w:t>0.</w:t>
             </w:r>
-          </w:p>
-        </w:tc>
-        <w:tc>
-          <w:tcPr>
-            <w:tcW w:w="1341" w:type="dxa"/>
-            <w:tcBorders/>
-          </w:tcPr>
-          <w:p>
-            <w:pPr>
-              <w:pStyle w:val="Normal"/>
-              <w:widowControl/>
-              <w:spacing w:lineRule="auto" w:line="240" w:before="0" w:after="0"/>
-              <w:jc w:val="center"/>
-              <w:rPr>
-                <w:rFonts w:eastAsia="ＭＳ 明朝" w:cs=""/>
-                <w:kern w:val="0"/>
-                <w:szCs w:val="22"/>
-                <w:lang w:val="en-US" w:eastAsia="en-US" w:bidi="ar-SA"/>
-              </w:rPr>
-            </w:pPr>
             <w:r>
               <w:rPr>
                 <w:rFonts w:eastAsia="ＭＳ 明朝" w:cs=""/>
@@ -2416,43 +3029,13 @@
                 <w:szCs w:val="22"/>
                 <w:lang w:val="en-US" w:eastAsia="en-US" w:bidi="ar-SA"/>
               </w:rPr>
-              <w:t>0.788</w:t>
+              <w:t>992</w:t>
             </w:r>
           </w:p>
         </w:tc>
         <w:tc>
           <w:tcPr>
-            <w:tcW w:w="1077" w:type="dxa"/>
-            <w:tcBorders/>
-          </w:tcPr>
-          <w:p>
-            <w:pPr>
-              <w:pStyle w:val="Normal"/>
-              <w:widowControl/>
-              <w:spacing w:lineRule="auto" w:line="240" w:before="0" w:after="0"/>
-              <w:jc w:val="center"/>
-              <w:rPr>
-                <w:rFonts w:eastAsia="ＭＳ 明朝" w:cs=""/>
-                <w:kern w:val="0"/>
-                <w:szCs w:val="22"/>
-                <w:lang w:val="en-US" w:eastAsia="en-US" w:bidi="ar-SA"/>
-              </w:rPr>
-            </w:pPr>
-            <w:r>
-              <w:rPr>
-                <w:rFonts w:eastAsia="ＭＳ 明朝" w:cs=""/>
-                <w:kern w:val="0"/>
-                <w:sz w:val="20"/>
-                <w:szCs w:val="22"/>
-                <w:lang w:val="en-US" w:eastAsia="en-US" w:bidi="ar-SA"/>
-              </w:rPr>
-              <w:t>0.66</w:t>
-            </w:r>
-          </w:p>
-        </w:tc>
-        <w:tc>
-          <w:tcPr>
-            <w:tcW w:w="2259" w:type="dxa"/>
+            <w:tcW w:w="1710" w:type="dxa"/>
             <w:tcBorders/>
           </w:tcPr>
           <w:p>
@@ -2477,7 +3060,37 @@
                 <w:szCs w:val="22"/>
                 <w:lang w:val="en-US" w:eastAsia="en-US" w:bidi="ar-SA"/>
               </w:rPr>
-              <w:t>345/2329 (15%)</w:t>
+              <w:t>2</w:t>
+            </w:r>
+            <w:r>
+              <w:rPr>
+                <w:rFonts w:eastAsia="ＭＳ 明朝" w:cs=""/>
+                <w:kern w:val="0"/>
+                <w:sz w:val="22"/>
+                <w:szCs w:val="22"/>
+                <w:lang w:val="en-US" w:eastAsia="en-US" w:bidi="ar-SA"/>
+              </w:rPr>
+              <w:t>/3 (</w:t>
+            </w:r>
+            <w:r>
+              <w:rPr>
+                <w:rFonts w:eastAsia="ＭＳ 明朝" w:cs=""/>
+                <w:kern w:val="0"/>
+                <w:sz w:val="22"/>
+                <w:szCs w:val="22"/>
+                <w:lang w:val="en-US" w:eastAsia="en-US" w:bidi="ar-SA"/>
+              </w:rPr>
+              <w:t>66</w:t>
+            </w:r>
+            <w:r>
+              <w:rPr>
+                <w:rFonts w:eastAsia="ＭＳ 明朝" w:cs=""/>
+                <w:kern w:val="0"/>
+                <w:sz w:val="22"/>
+                <w:szCs w:val="22"/>
+                <w:lang w:val="en-US" w:eastAsia="en-US" w:bidi="ar-SA"/>
+              </w:rPr>
+              <w:t>%)</w:t>
             </w:r>
           </w:p>
         </w:tc>
@@ -2486,7 +3099,375 @@
         <w:trPr/>
         <w:tc>
           <w:tcPr>
-            <w:tcW w:w="1474" w:type="dxa"/>
+            <w:tcW w:w="1890" w:type="dxa"/>
+            <w:tcBorders/>
+          </w:tcPr>
+          <w:p>
+            <w:pPr>
+              <w:pStyle w:val="Normal"/>
+              <w:widowControl/>
+              <w:spacing w:lineRule="auto" w:line="240" w:before="0" w:after="0"/>
+              <w:jc w:val="start"/>
+              <w:rPr>
+                <w:rFonts w:eastAsia="ＭＳ 明朝" w:cs=""/>
+                <w:kern w:val="0"/>
+                <w:szCs w:val="22"/>
+                <w:lang w:val="en-US" w:eastAsia="en-US" w:bidi="ar-SA"/>
+              </w:rPr>
+            </w:pPr>
+            <w:r>
+              <w:rPr>
+                <w:rFonts w:eastAsia="ＭＳ 明朝" w:cs=""/>
+                <w:kern w:val="0"/>
+                <w:sz w:val="20"/>
+                <w:szCs w:val="22"/>
+                <w:lang w:val="en-US" w:eastAsia="en-US" w:bidi="ar-SA"/>
+              </w:rPr>
+              <w:t>Persistencia</w:t>
+            </w:r>
+          </w:p>
+        </w:tc>
+        <w:tc>
+          <w:tcPr>
+            <w:tcW w:w="990" w:type="dxa"/>
+            <w:tcBorders/>
+          </w:tcPr>
+          <w:p>
+            <w:pPr>
+              <w:pStyle w:val="Normal"/>
+              <w:widowControl/>
+              <w:spacing w:lineRule="auto" w:line="240" w:before="0" w:after="0"/>
+              <w:jc w:val="center"/>
+              <w:rPr>
+                <w:rFonts w:eastAsia="ＭＳ 明朝" w:cs=""/>
+                <w:kern w:val="0"/>
+                <w:szCs w:val="22"/>
+                <w:lang w:val="en-US" w:eastAsia="en-US" w:bidi="ar-SA"/>
+              </w:rPr>
+            </w:pPr>
+            <w:r>
+              <w:rPr>
+                <w:rFonts w:eastAsia="ＭＳ 明朝" w:cs=""/>
+                <w:kern w:val="0"/>
+                <w:sz w:val="20"/>
+                <w:szCs w:val="22"/>
+                <w:lang w:val="en-US" w:eastAsia="en-US" w:bidi="ar-SA"/>
+              </w:rPr>
+              <w:t>0.</w:t>
+            </w:r>
+            <w:r>
+              <w:rPr>
+                <w:rFonts w:eastAsia="ＭＳ 明朝" w:cs=""/>
+                <w:kern w:val="0"/>
+                <w:sz w:val="20"/>
+                <w:szCs w:val="22"/>
+                <w:lang w:val="en-US" w:eastAsia="en-US" w:bidi="ar-SA"/>
+              </w:rPr>
+              <w:t>940</w:t>
+            </w:r>
+          </w:p>
+        </w:tc>
+        <w:tc>
+          <w:tcPr>
+            <w:tcW w:w="1095" w:type="dxa"/>
+            <w:tcBorders/>
+          </w:tcPr>
+          <w:p>
+            <w:pPr>
+              <w:pStyle w:val="Normal"/>
+              <w:widowControl/>
+              <w:spacing w:lineRule="auto" w:line="240" w:before="0" w:after="0"/>
+              <w:jc w:val="center"/>
+              <w:rPr>
+                <w:rFonts w:eastAsia="ＭＳ 明朝" w:cs=""/>
+                <w:kern w:val="0"/>
+                <w:szCs w:val="22"/>
+                <w:lang w:val="en-US" w:eastAsia="en-US" w:bidi="ar-SA"/>
+              </w:rPr>
+            </w:pPr>
+            <w:r>
+              <w:rPr>
+                <w:rFonts w:eastAsia="ＭＳ 明朝" w:cs=""/>
+                <w:kern w:val="0"/>
+                <w:sz w:val="20"/>
+                <w:szCs w:val="22"/>
+                <w:lang w:val="en-US" w:eastAsia="en-US" w:bidi="ar-SA"/>
+              </w:rPr>
+              <w:t>0.</w:t>
+            </w:r>
+            <w:r>
+              <w:rPr>
+                <w:rFonts w:eastAsia="ＭＳ 明朝" w:cs=""/>
+                <w:kern w:val="0"/>
+                <w:sz w:val="20"/>
+                <w:szCs w:val="22"/>
+                <w:lang w:val="en-US" w:eastAsia="en-US" w:bidi="ar-SA"/>
+              </w:rPr>
+              <w:t>992</w:t>
+            </w:r>
+          </w:p>
+        </w:tc>
+        <w:tc>
+          <w:tcPr>
+            <w:tcW w:w="1710" w:type="dxa"/>
+            <w:tcBorders/>
+          </w:tcPr>
+          <w:p>
+            <w:pPr>
+              <w:pStyle w:val="Normal"/>
+              <w:widowControl/>
+              <w:spacing w:lineRule="auto" w:line="240" w:before="0" w:after="0"/>
+              <w:jc w:val="center"/>
+              <w:rPr>
+                <w:rFonts w:eastAsia="ＭＳ 明朝" w:cs=""/>
+                <w:kern w:val="0"/>
+                <w:sz w:val="22"/>
+                <w:szCs w:val="22"/>
+                <w:lang w:val="en-US" w:eastAsia="en-US" w:bidi="ar-SA"/>
+              </w:rPr>
+            </w:pPr>
+            <w:r>
+              <w:rPr>
+                <w:rFonts w:eastAsia="ＭＳ 明朝" w:cs=""/>
+                <w:kern w:val="0"/>
+                <w:sz w:val="22"/>
+                <w:szCs w:val="22"/>
+                <w:lang w:val="en-US" w:eastAsia="en-US" w:bidi="ar-SA"/>
+              </w:rPr>
+              <w:t>0</w:t>
+            </w:r>
+            <w:r>
+              <w:rPr>
+                <w:rFonts w:eastAsia="ＭＳ 明朝" w:cs=""/>
+                <w:kern w:val="0"/>
+                <w:sz w:val="22"/>
+                <w:szCs w:val="22"/>
+                <w:lang w:val="en-US" w:eastAsia="en-US" w:bidi="ar-SA"/>
+              </w:rPr>
+              <w:t>/</w:t>
+            </w:r>
+            <w:r>
+              <w:rPr>
+                <w:rFonts w:eastAsia="ＭＳ 明朝" w:cs=""/>
+                <w:kern w:val="0"/>
+                <w:sz w:val="22"/>
+                <w:szCs w:val="22"/>
+                <w:lang w:val="en-US" w:eastAsia="en-US" w:bidi="ar-SA"/>
+              </w:rPr>
+              <w:t>3</w:t>
+            </w:r>
+            <w:r>
+              <w:rPr>
+                <w:rFonts w:eastAsia="ＭＳ 明朝" w:cs=""/>
+                <w:kern w:val="0"/>
+                <w:sz w:val="22"/>
+                <w:szCs w:val="22"/>
+                <w:lang w:val="en-US" w:eastAsia="en-US" w:bidi="ar-SA"/>
+              </w:rPr>
+              <w:t xml:space="preserve"> (</w:t>
+            </w:r>
+            <w:r>
+              <w:rPr>
+                <w:rFonts w:eastAsia="ＭＳ 明朝" w:cs=""/>
+                <w:kern w:val="0"/>
+                <w:sz w:val="22"/>
+                <w:szCs w:val="22"/>
+                <w:lang w:val="en-US" w:eastAsia="en-US" w:bidi="ar-SA"/>
+              </w:rPr>
+              <w:t>0</w:t>
+            </w:r>
+            <w:r>
+              <w:rPr>
+                <w:rFonts w:eastAsia="ＭＳ 明朝" w:cs=""/>
+                <w:kern w:val="0"/>
+                <w:sz w:val="22"/>
+                <w:szCs w:val="22"/>
+                <w:lang w:val="en-US" w:eastAsia="en-US" w:bidi="ar-SA"/>
+              </w:rPr>
+              <w:t>%)</w:t>
+            </w:r>
+          </w:p>
+        </w:tc>
+      </w:tr>
+      <w:tr>
+        <w:trPr/>
+        <w:tc>
+          <w:tcPr>
+            <w:tcW w:w="1890" w:type="dxa"/>
+            <w:tcBorders/>
+          </w:tcPr>
+          <w:p>
+            <w:pPr>
+              <w:pStyle w:val="Normal"/>
+              <w:widowControl/>
+              <w:spacing w:lineRule="auto" w:line="240" w:before="0" w:after="0"/>
+              <w:jc w:val="start"/>
+              <w:rPr>
+                <w:rFonts w:eastAsia="ＭＳ 明朝" w:cs=""/>
+                <w:kern w:val="0"/>
+                <w:szCs w:val="22"/>
+                <w:lang w:val="en-US" w:eastAsia="en-US" w:bidi="ar-SA"/>
+              </w:rPr>
+            </w:pPr>
+            <w:r>
+              <w:rPr>
+                <w:rFonts w:eastAsia="ＭＳ 明朝" w:cs=""/>
+                <w:kern w:val="0"/>
+                <w:sz w:val="20"/>
+                <w:szCs w:val="22"/>
+                <w:lang w:val="en-US" w:eastAsia="en-US" w:bidi="ar-SA"/>
+              </w:rPr>
+              <w:t>Possion</w:t>
+            </w:r>
+          </w:p>
+        </w:tc>
+        <w:tc>
+          <w:tcPr>
+            <w:tcW w:w="990" w:type="dxa"/>
+            <w:tcBorders/>
+          </w:tcPr>
+          <w:p>
+            <w:pPr>
+              <w:pStyle w:val="Normal"/>
+              <w:widowControl/>
+              <w:spacing w:lineRule="auto" w:line="240" w:before="0" w:after="0"/>
+              <w:jc w:val="center"/>
+              <w:rPr>
+                <w:rFonts w:eastAsia="ＭＳ 明朝" w:cs=""/>
+                <w:kern w:val="0"/>
+                <w:szCs w:val="22"/>
+                <w:lang w:val="en-US" w:eastAsia="en-US" w:bidi="ar-SA"/>
+              </w:rPr>
+            </w:pPr>
+            <w:r>
+              <w:rPr>
+                <w:rFonts w:eastAsia="ＭＳ 明朝" w:cs=""/>
+                <w:kern w:val="0"/>
+                <w:sz w:val="20"/>
+                <w:szCs w:val="22"/>
+                <w:lang w:val="en-US" w:eastAsia="en-US" w:bidi="ar-SA"/>
+              </w:rPr>
+              <w:t>0.914</w:t>
+            </w:r>
+          </w:p>
+        </w:tc>
+        <w:tc>
+          <w:tcPr>
+            <w:tcW w:w="1095" w:type="dxa"/>
+            <w:tcBorders/>
+          </w:tcPr>
+          <w:p>
+            <w:pPr>
+              <w:pStyle w:val="Normal"/>
+              <w:widowControl/>
+              <w:spacing w:lineRule="auto" w:line="240" w:before="0" w:after="0"/>
+              <w:jc w:val="center"/>
+              <w:rPr>
+                <w:rFonts w:eastAsia="ＭＳ 明朝" w:cs=""/>
+                <w:kern w:val="0"/>
+                <w:szCs w:val="22"/>
+                <w:lang w:val="en-US" w:eastAsia="en-US" w:bidi="ar-SA"/>
+              </w:rPr>
+            </w:pPr>
+            <w:r>
+              <w:rPr>
+                <w:rFonts w:eastAsia="ＭＳ 明朝" w:cs=""/>
+                <w:kern w:val="0"/>
+                <w:sz w:val="20"/>
+                <w:szCs w:val="22"/>
+                <w:lang w:val="en-US" w:eastAsia="en-US" w:bidi="ar-SA"/>
+              </w:rPr>
+              <w:t>0.993</w:t>
+            </w:r>
+          </w:p>
+        </w:tc>
+        <w:tc>
+          <w:tcPr>
+            <w:tcW w:w="1710" w:type="dxa"/>
+            <w:tcBorders/>
+          </w:tcPr>
+          <w:p>
+            <w:pPr>
+              <w:pStyle w:val="Normal"/>
+              <w:widowControl/>
+              <w:spacing w:lineRule="auto" w:line="240" w:before="0" w:after="0"/>
+              <w:jc w:val="center"/>
+              <w:rPr>
+                <w:rFonts w:eastAsia="ＭＳ 明朝" w:cs=""/>
+                <w:kern w:val="0"/>
+                <w:sz w:val="22"/>
+                <w:szCs w:val="22"/>
+                <w:lang w:val="en-US" w:eastAsia="en-US" w:bidi="ar-SA"/>
+              </w:rPr>
+            </w:pPr>
+            <w:r>
+              <w:rPr>
+                <w:rFonts w:eastAsia="ＭＳ 明朝" w:cs=""/>
+                <w:kern w:val="0"/>
+                <w:sz w:val="22"/>
+                <w:szCs w:val="22"/>
+                <w:lang w:val="en-US" w:eastAsia="en-US" w:bidi="ar-SA"/>
+              </w:rPr>
+              <w:t>1</w:t>
+            </w:r>
+            <w:r>
+              <w:rPr>
+                <w:rFonts w:eastAsia="ＭＳ 明朝" w:cs=""/>
+                <w:kern w:val="0"/>
+                <w:sz w:val="22"/>
+                <w:szCs w:val="22"/>
+                <w:lang w:val="en-US" w:eastAsia="en-US" w:bidi="ar-SA"/>
+              </w:rPr>
+              <w:t>/</w:t>
+            </w:r>
+            <w:r>
+              <w:rPr>
+                <w:rFonts w:eastAsia="ＭＳ 明朝" w:cs=""/>
+                <w:kern w:val="0"/>
+                <w:sz w:val="22"/>
+                <w:szCs w:val="22"/>
+                <w:lang w:val="en-US" w:eastAsia="en-US" w:bidi="ar-SA"/>
+              </w:rPr>
+              <w:t>3</w:t>
+            </w:r>
+            <w:r>
+              <w:rPr>
+                <w:rFonts w:eastAsia="ＭＳ 明朝" w:cs=""/>
+                <w:kern w:val="0"/>
+                <w:sz w:val="22"/>
+                <w:szCs w:val="22"/>
+                <w:lang w:val="en-US" w:eastAsia="en-US" w:bidi="ar-SA"/>
+              </w:rPr>
+              <w:t xml:space="preserve"> (</w:t>
+            </w:r>
+            <w:r>
+              <w:rPr>
+                <w:rFonts w:eastAsia="ＭＳ 明朝" w:cs=""/>
+                <w:kern w:val="0"/>
+                <w:sz w:val="22"/>
+                <w:szCs w:val="22"/>
+                <w:lang w:val="en-US" w:eastAsia="en-US" w:bidi="ar-SA"/>
+              </w:rPr>
+              <w:t>33</w:t>
+            </w:r>
+            <w:r>
+              <w:rPr>
+                <w:rFonts w:eastAsia="ＭＳ 明朝" w:cs=""/>
+                <w:kern w:val="0"/>
+                <w:sz w:val="22"/>
+                <w:szCs w:val="22"/>
+                <w:lang w:val="en-US" w:eastAsia="en-US" w:bidi="ar-SA"/>
+              </w:rPr>
+              <w:t>%)</w:t>
+            </w:r>
+          </w:p>
+        </w:tc>
+      </w:tr>
+      <w:tr>
+        <w:trPr/>
+        <w:tc>
+          <w:tcPr>
+            <w:tcW w:w="1890" w:type="dxa"/>
             <w:tcBorders/>
           </w:tcPr>
           <w:p>
@@ -2516,7 +3497,7 @@
         </w:tc>
         <w:tc>
           <w:tcPr>
-            <w:tcW w:w="1226" w:type="dxa"/>
+            <w:tcW w:w="990" w:type="dxa"/>
             <w:tcBorders/>
           </w:tcPr>
           <w:p>
@@ -2540,13 +3521,13 @@
                 <w:szCs w:val="22"/>
                 <w:lang w:val="en-US" w:eastAsia="en-US" w:bidi="ar-SA"/>
               </w:rPr>
-              <w:t>0.8689</w:t>
+              <w:t>0.875</w:t>
             </w:r>
           </w:p>
         </w:tc>
         <w:tc>
           <w:tcPr>
-            <w:tcW w:w="1447" w:type="dxa"/>
+            <w:tcW w:w="1095" w:type="dxa"/>
             <w:tcBorders/>
           </w:tcPr>
           <w:p>
@@ -2570,73 +3551,13 @@
                 <w:szCs w:val="22"/>
                 <w:lang w:val="en-US" w:eastAsia="en-US" w:bidi="ar-SA"/>
               </w:rPr>
-              <w:t>0.8427</w:t>
+              <w:t>0.968</w:t>
             </w:r>
           </w:p>
         </w:tc>
         <w:tc>
           <w:tcPr>
-            <w:tcW w:w="1341" w:type="dxa"/>
-            <w:tcBorders/>
-          </w:tcPr>
-          <w:p>
-            <w:pPr>
-              <w:pStyle w:val="Normal"/>
-              <w:widowControl/>
-              <w:spacing w:lineRule="auto" w:line="240" w:before="0" w:after="0"/>
-              <w:jc w:val="center"/>
-              <w:rPr>
-                <w:rFonts w:eastAsia="ＭＳ 明朝" w:cs=""/>
-                <w:kern w:val="0"/>
-                <w:szCs w:val="22"/>
-                <w:lang w:val="en-US" w:eastAsia="en-US" w:bidi="ar-SA"/>
-              </w:rPr>
-            </w:pPr>
-            <w:r>
-              <w:rPr>
-                <w:rFonts w:eastAsia="ＭＳ 明朝" w:cs=""/>
-                <w:kern w:val="0"/>
-                <w:sz w:val="20"/>
-                <w:szCs w:val="22"/>
-                <w:lang w:val="en-US" w:eastAsia="en-US" w:bidi="ar-SA"/>
-              </w:rPr>
-              <w:t>0.777</w:t>
-            </w:r>
-          </w:p>
-        </w:tc>
-        <w:tc>
-          <w:tcPr>
-            <w:tcW w:w="1077" w:type="dxa"/>
-            <w:tcBorders/>
-          </w:tcPr>
-          <w:p>
-            <w:pPr>
-              <w:pStyle w:val="Normal"/>
-              <w:widowControl/>
-              <w:spacing w:lineRule="auto" w:line="240" w:before="0" w:after="0"/>
-              <w:jc w:val="center"/>
-              <w:rPr>
-                <w:rFonts w:eastAsia="ＭＳ 明朝" w:cs=""/>
-                <w:kern w:val="0"/>
-                <w:szCs w:val="22"/>
-                <w:lang w:val="en-US" w:eastAsia="en-US" w:bidi="ar-SA"/>
-              </w:rPr>
-            </w:pPr>
-            <w:r>
-              <w:rPr>
-                <w:rFonts w:eastAsia="ＭＳ 明朝" w:cs=""/>
-                <w:kern w:val="0"/>
-                <w:sz w:val="20"/>
-                <w:szCs w:val="22"/>
-                <w:lang w:val="en-US" w:eastAsia="en-US" w:bidi="ar-SA"/>
-              </w:rPr>
-              <w:t>0.24</w:t>
-            </w:r>
-          </w:p>
-        </w:tc>
-        <w:tc>
-          <w:tcPr>
-            <w:tcW w:w="2259" w:type="dxa"/>
+            <w:tcW w:w="1710" w:type="dxa"/>
             <w:tcBorders/>
           </w:tcPr>
           <w:p>
@@ -2661,7 +3582,57 @@
                 <w:szCs w:val="22"/>
                 <w:lang w:val="en-US" w:eastAsia="en-US" w:bidi="ar-SA"/>
               </w:rPr>
-              <w:t>674/2329 (29%)</w:t>
+              <w:t>0</w:t>
+            </w:r>
+            <w:r>
+              <w:rPr>
+                <w:rFonts w:eastAsia="ＭＳ 明朝" w:cs=""/>
+                <w:kern w:val="0"/>
+                <w:sz w:val="22"/>
+                <w:szCs w:val="22"/>
+                <w:lang w:val="en-US" w:eastAsia="en-US" w:bidi="ar-SA"/>
+              </w:rPr>
+              <w:t>/</w:t>
+            </w:r>
+            <w:r>
+              <w:rPr>
+                <w:rFonts w:eastAsia="ＭＳ 明朝" w:cs=""/>
+                <w:kern w:val="0"/>
+                <w:sz w:val="22"/>
+                <w:szCs w:val="22"/>
+                <w:lang w:val="en-US" w:eastAsia="en-US" w:bidi="ar-SA"/>
+              </w:rPr>
+              <w:t>3</w:t>
+            </w:r>
+            <w:r>
+              <w:rPr>
+                <w:rFonts w:eastAsia="ＭＳ 明朝" w:cs=""/>
+                <w:kern w:val="0"/>
+                <w:sz w:val="22"/>
+                <w:szCs w:val="22"/>
+                <w:lang w:val="en-US" w:eastAsia="en-US" w:bidi="ar-SA"/>
+              </w:rPr>
+              <w:t xml:space="preserve"> (</w:t>
+            </w:r>
+            <w:r>
+              <w:rPr>
+                <w:rFonts w:eastAsia="ＭＳ 明朝" w:cs=""/>
+                <w:kern w:val="0"/>
+                <w:sz w:val="22"/>
+                <w:szCs w:val="22"/>
+                <w:lang w:val="en-US" w:eastAsia="en-US" w:bidi="ar-SA"/>
+              </w:rPr>
+              <w:t>0</w:t>
+            </w:r>
+            <w:r>
+              <w:rPr>
+                <w:rFonts w:eastAsia="ＭＳ 明朝" w:cs=""/>
+                <w:kern w:val="0"/>
+                <w:sz w:val="22"/>
+                <w:szCs w:val="22"/>
+                <w:lang w:val="en-US" w:eastAsia="en-US" w:bidi="ar-SA"/>
+              </w:rPr>
+              <w:t>%)</w:t>
             </w:r>
           </w:p>
         </w:tc>
@@ -2670,8 +3641,10 @@
         <w:trPr/>
         <w:tc>
           <w:tcPr>
-            <w:tcW w:w="1474" w:type="dxa"/>
-            <w:tcBorders/>
+            <w:tcW w:w="1890" w:type="dxa"/>
+            <w:tcBorders>
+              <w:top w:val="nil"/>
+            </w:tcBorders>
           </w:tcPr>
           <w:p>
             <w:pPr>
@@ -2682,7 +3655,8 @@
               <w:rPr>
                 <w:rFonts w:eastAsia="ＭＳ 明朝" w:cs=""/>
                 <w:kern w:val="0"/>
-                <w:szCs w:val="22"/>
+                <w:sz w:val="20"/>
+                <w:szCs w:val="20"/>
                 <w:lang w:val="en-US" w:eastAsia="en-US" w:bidi="ar-SA"/>
               </w:rPr>
             </w:pPr>
@@ -2691,17 +3665,19 @@
                 <w:rFonts w:eastAsia="ＭＳ 明朝" w:cs=""/>
                 <w:kern w:val="0"/>
                 <w:sz w:val="20"/>
-                <w:szCs w:val="22"/>
+                <w:szCs w:val="20"/>
                 <w:lang w:val="en-US" w:eastAsia="en-US" w:bidi="ar-SA"/>
               </w:rPr>
-              <w:t>Persistencia</w:t>
+              <w:t>Siempre Alerta</w:t>
             </w:r>
           </w:p>
         </w:tc>
         <w:tc>
           <w:tcPr>
-            <w:tcW w:w="1226" w:type="dxa"/>
-            <w:tcBorders/>
+            <w:tcW w:w="990" w:type="dxa"/>
+            <w:tcBorders>
+              <w:top w:val="nil"/>
+            </w:tcBorders>
           </w:tcPr>
           <w:p>
             <w:pPr>
@@ -2720,18 +3696,19 @@
               <w:rPr>
                 <w:rFonts w:eastAsia="ＭＳ 明朝" w:cs=""/>
                 <w:kern w:val="0"/>
-                <w:sz w:val="20"/>
                 <w:szCs w:val="22"/>
                 <w:lang w:val="en-US" w:eastAsia="en-US" w:bidi="ar-SA"/>
               </w:rPr>
-              <w:t>—</w:t>
+              <w:t>0.750</w:t>
             </w:r>
           </w:p>
         </w:tc>
         <w:tc>
           <w:tcPr>
-            <w:tcW w:w="1447" w:type="dxa"/>
-            <w:tcBorders/>
+            <w:tcW w:w="1095" w:type="dxa"/>
+            <w:tcBorders>
+              <w:top w:val="nil"/>
+            </w:tcBorders>
           </w:tcPr>
           <w:p>
             <w:pPr>
@@ -2750,78 +3727,19 @@
               <w:rPr>
                 <w:rFonts w:eastAsia="ＭＳ 明朝" w:cs=""/>
                 <w:kern w:val="0"/>
-                <w:sz w:val="20"/>
                 <w:szCs w:val="22"/>
                 <w:lang w:val="en-US" w:eastAsia="en-US" w:bidi="ar-SA"/>
               </w:rPr>
-              <w:t>—</w:t>
+              <w:t>-</w:t>
             </w:r>
           </w:p>
         </w:tc>
         <w:tc>
           <w:tcPr>
-            <w:tcW w:w="1341" w:type="dxa"/>
-            <w:tcBorders/>
-          </w:tcPr>
-          <w:p>
-            <w:pPr>
-              <w:pStyle w:val="Normal"/>
-              <w:widowControl/>
-              <w:spacing w:lineRule="auto" w:line="240" w:before="0" w:after="0"/>
-              <w:jc w:val="center"/>
-              <w:rPr>
-                <w:rFonts w:eastAsia="ＭＳ 明朝" w:cs=""/>
-                <w:kern w:val="0"/>
-                <w:szCs w:val="22"/>
-                <w:lang w:val="en-US" w:eastAsia="en-US" w:bidi="ar-SA"/>
-              </w:rPr>
-            </w:pPr>
-            <w:r>
-              <w:rPr>
-                <w:rFonts w:eastAsia="ＭＳ 明朝" w:cs=""/>
-                <w:kern w:val="0"/>
-                <w:sz w:val="20"/>
-                <w:szCs w:val="22"/>
-                <w:lang w:val="en-US" w:eastAsia="en-US" w:bidi="ar-SA"/>
-              </w:rPr>
-              <w:t>0.780</w:t>
-            </w:r>
-          </w:p>
-        </w:tc>
-        <w:tc>
-          <w:tcPr>
-            <w:tcW w:w="1077" w:type="dxa"/>
-            <w:tcBorders/>
-          </w:tcPr>
-          <w:p>
-            <w:pPr>
-              <w:pStyle w:val="Normal"/>
-              <w:widowControl/>
-              <w:spacing w:lineRule="auto" w:line="240" w:before="0" w:after="0"/>
-              <w:jc w:val="center"/>
-              <w:rPr>
-                <w:rFonts w:eastAsia="ＭＳ 明朝" w:cs=""/>
-                <w:kern w:val="0"/>
-                <w:szCs w:val="22"/>
-                <w:lang w:val="en-US" w:eastAsia="en-US" w:bidi="ar-SA"/>
-              </w:rPr>
-            </w:pPr>
-            <w:r>
-              <w:rPr>
-                <w:rFonts w:eastAsia="ＭＳ 明朝" w:cs=""/>
-                <w:kern w:val="0"/>
-                <w:sz w:val="20"/>
-                <w:szCs w:val="22"/>
-                <w:lang w:val="en-US" w:eastAsia="en-US" w:bidi="ar-SA"/>
-              </w:rPr>
-              <w:t>—</w:t>
-            </w:r>
-          </w:p>
-        </w:tc>
-        <w:tc>
-          <w:tcPr>
-            <w:tcW w:w="2259" w:type="dxa"/>
-            <w:tcBorders/>
+            <w:tcW w:w="1710" w:type="dxa"/>
+            <w:tcBorders>
+              <w:top w:val="nil"/>
+            </w:tcBorders>
           </w:tcPr>
           <w:p>
             <w:pPr>
@@ -2845,191 +3763,7 @@
                 <w:szCs w:val="22"/>
                 <w:lang w:val="en-US" w:eastAsia="en-US" w:bidi="ar-SA"/>
               </w:rPr>
-              <w:t>0/2329 (0%)</w:t>
-            </w:r>
-          </w:p>
-        </w:tc>
-      </w:tr>
-      <w:tr>
-        <w:trPr/>
-        <w:tc>
-          <w:tcPr>
-            <w:tcW w:w="1474" w:type="dxa"/>
-            <w:tcBorders/>
-          </w:tcPr>
-          <w:p>
-            <w:pPr>
-              <w:pStyle w:val="Normal"/>
-              <w:widowControl/>
-              <w:spacing w:lineRule="auto" w:line="240" w:before="0" w:after="0"/>
-              <w:jc w:val="start"/>
-              <w:rPr>
-                <w:rFonts w:eastAsia="ＭＳ 明朝" w:cs=""/>
-                <w:kern w:val="0"/>
-                <w:szCs w:val="22"/>
-                <w:lang w:val="en-US" w:eastAsia="en-US" w:bidi="ar-SA"/>
-              </w:rPr>
-            </w:pPr>
-            <w:r>
-              <w:rPr>
-                <w:rFonts w:eastAsia="ＭＳ 明朝" w:cs=""/>
-                <w:kern w:val="0"/>
-                <w:sz w:val="20"/>
-                <w:szCs w:val="22"/>
-                <w:lang w:val="en-US" w:eastAsia="en-US" w:bidi="ar-SA"/>
-              </w:rPr>
-              <w:t>C. endemico</w:t>
-            </w:r>
-          </w:p>
-        </w:tc>
-        <w:tc>
-          <w:tcPr>
-            <w:tcW w:w="1226" w:type="dxa"/>
-            <w:tcBorders/>
-          </w:tcPr>
-          <w:p>
-            <w:pPr>
-              <w:pStyle w:val="Normal"/>
-              <w:widowControl/>
-              <w:spacing w:lineRule="auto" w:line="240" w:before="0" w:after="0"/>
-              <w:jc w:val="center"/>
-              <w:rPr>
-                <w:rFonts w:eastAsia="ＭＳ 明朝" w:cs=""/>
-                <w:kern w:val="0"/>
-                <w:szCs w:val="22"/>
-                <w:lang w:val="en-US" w:eastAsia="en-US" w:bidi="ar-SA"/>
-              </w:rPr>
-            </w:pPr>
-            <w:r>
-              <w:rPr>
-                <w:rFonts w:eastAsia="ＭＳ 明朝" w:cs=""/>
-                <w:kern w:val="0"/>
-                <w:sz w:val="20"/>
-                <w:szCs w:val="22"/>
-                <w:lang w:val="en-US" w:eastAsia="en-US" w:bidi="ar-SA"/>
-              </w:rPr>
-              <w:t>—</w:t>
-            </w:r>
-          </w:p>
-        </w:tc>
-        <w:tc>
-          <w:tcPr>
-            <w:tcW w:w="1447" w:type="dxa"/>
-            <w:tcBorders/>
-          </w:tcPr>
-          <w:p>
-            <w:pPr>
-              <w:pStyle w:val="Normal"/>
-              <w:widowControl/>
-              <w:spacing w:lineRule="auto" w:line="240" w:before="0" w:after="0"/>
-              <w:jc w:val="center"/>
-              <w:rPr>
-                <w:rFonts w:eastAsia="ＭＳ 明朝" w:cs=""/>
-                <w:kern w:val="0"/>
-                <w:szCs w:val="22"/>
-                <w:lang w:val="en-US" w:eastAsia="en-US" w:bidi="ar-SA"/>
-              </w:rPr>
-            </w:pPr>
-            <w:r>
-              <w:rPr>
-                <w:rFonts w:eastAsia="ＭＳ 明朝" w:cs=""/>
-                <w:kern w:val="0"/>
-                <w:sz w:val="20"/>
-                <w:szCs w:val="22"/>
-                <w:lang w:val="en-US" w:eastAsia="en-US" w:bidi="ar-SA"/>
-              </w:rPr>
-              <w:t>—</w:t>
-            </w:r>
-          </w:p>
-        </w:tc>
-        <w:tc>
-          <w:tcPr>
-            <w:tcW w:w="1341" w:type="dxa"/>
-            <w:tcBorders/>
-          </w:tcPr>
-          <w:p>
-            <w:pPr>
-              <w:pStyle w:val="Normal"/>
-              <w:widowControl/>
-              <w:spacing w:lineRule="auto" w:line="240" w:before="0" w:after="0"/>
-              <w:jc w:val="center"/>
-              <w:rPr>
-                <w:rFonts w:eastAsia="ＭＳ 明朝" w:cs=""/>
-                <w:kern w:val="0"/>
-                <w:szCs w:val="22"/>
-                <w:lang w:val="en-US" w:eastAsia="en-US" w:bidi="ar-SA"/>
-              </w:rPr>
-            </w:pPr>
-            <w:r>
-              <w:rPr>
-                <w:rFonts w:eastAsia="ＭＳ 明朝" w:cs=""/>
-                <w:kern w:val="0"/>
-                <w:sz w:val="20"/>
-                <w:szCs w:val="22"/>
-                <w:lang w:val="en-US" w:eastAsia="en-US" w:bidi="ar-SA"/>
-              </w:rPr>
-              <w:t>0.720</w:t>
-            </w:r>
-          </w:p>
-        </w:tc>
-        <w:tc>
-          <w:tcPr>
-            <w:tcW w:w="1077" w:type="dxa"/>
-            <w:tcBorders/>
-          </w:tcPr>
-          <w:p>
-            <w:pPr>
-              <w:pStyle w:val="Normal"/>
-              <w:widowControl/>
-              <w:spacing w:lineRule="auto" w:line="240" w:before="0" w:after="0"/>
-              <w:jc w:val="center"/>
-              <w:rPr>
-                <w:rFonts w:eastAsia="ＭＳ 明朝" w:cs=""/>
-                <w:kern w:val="0"/>
-                <w:szCs w:val="22"/>
-                <w:lang w:val="en-US" w:eastAsia="en-US" w:bidi="ar-SA"/>
-              </w:rPr>
-            </w:pPr>
-            <w:r>
-              <w:rPr>
-                <w:rFonts w:eastAsia="ＭＳ 明朝" w:cs=""/>
-                <w:kern w:val="0"/>
-                <w:sz w:val="20"/>
-                <w:szCs w:val="22"/>
-                <w:lang w:val="en-US" w:eastAsia="en-US" w:bidi="ar-SA"/>
-              </w:rPr>
-              <w:t>—</w:t>
-            </w:r>
-          </w:p>
-        </w:tc>
-        <w:tc>
-          <w:tcPr>
-            <w:tcW w:w="2259" w:type="dxa"/>
-            <w:tcBorders/>
-          </w:tcPr>
-          <w:p>
-            <w:pPr>
-              <w:pStyle w:val="Normal"/>
-              <w:widowControl/>
-              <w:spacing w:lineRule="auto" w:line="240" w:before="0" w:after="0"/>
-              <w:jc w:val="center"/>
-              <w:rPr>
-                <w:rFonts w:eastAsia="ＭＳ 明朝" w:cs=""/>
-                <w:kern w:val="0"/>
-                <w:sz w:val="22"/>
-                <w:szCs w:val="22"/>
-                <w:lang w:val="en-US" w:eastAsia="en-US" w:bidi="ar-SA"/>
-              </w:rPr>
-            </w:pPr>
-            <w:r>
-              <w:rPr>
-                <w:rFonts w:eastAsia="ＭＳ 明朝" w:cs=""/>
-                <w:kern w:val="0"/>
-                <w:sz w:val="22"/>
-                <w:szCs w:val="22"/>
-                <w:lang w:val="en-US" w:eastAsia="en-US" w:bidi="ar-SA"/>
-              </w:rPr>
-              <w:t>264/2329 (11%)</w:t>
+              <w:t>3/3 (100)</w:t>
             </w:r>
           </w:p>
         </w:tc>
@@ -3044,14 +3778,16 @@
           <w:rFonts w:ascii="Calibri" w:hAnsi="Calibri"/>
           <w:b w:val="false"/>
           <w:i/>
-          <w:sz w:val="22"/>
+          <w:sz w:val="18"/>
+          <w:szCs w:val="18"/>
         </w:rPr>
       </w:pPr>
       <w:r>
         <w:rPr>
           <w:b w:val="false"/>
           <w:i/>
-          <w:sz w:val="22"/>
+          <w:sz w:val="18"/>
+          <w:szCs w:val="18"/>
         </w:rPr>
       </w:r>
     </w:p>
@@ -3064,16 +3800,67 @@
           <w:rFonts w:ascii="Calibri" w:hAnsi="Calibri"/>
           <w:b w:val="false"/>
           <w:i/>
-          <w:sz w:val="22"/>
+          <w:sz w:val="18"/>
+          <w:szCs w:val="18"/>
         </w:rPr>
       </w:pPr>
       <w:r>
         <w:rPr>
           <w:b w:val="false"/>
           <w:i/>
-          <w:sz w:val="22"/>
-        </w:rPr>
-        <w:t>Tabla 1. Comparativa de modelos en el conjunto de prueba 2024-2025. La columna 'Inicios det.' indica cuántos de los 2.461 meses de inicio de brote (es_inicio=1) cada modelo identifica correctamente con su umbral óptimo.</w:t>
+          <w:sz w:val="18"/>
+          <w:szCs w:val="18"/>
+        </w:rPr>
+        <w:t xml:space="preserve">Tabla 1. </w:t>
+      </w:r>
+      <w:r>
+        <w:rPr>
+          <w:b w:val="false"/>
+          <w:i/>
+          <w:sz w:val="18"/>
+          <w:szCs w:val="18"/>
+        </w:rPr>
+        <w:t>C</w:t>
+      </w:r>
+      <w:r>
+        <w:rPr>
+          <w:b w:val="false"/>
+          <w:i/>
+          <w:sz w:val="18"/>
+          <w:szCs w:val="18"/>
+        </w:rPr>
+        <w:t>onjunto de prueba 2023-2025 restringido a Bucaramanga y Cali, 70 meses, 42 en brote y 3 de ellos inicio.</w:t>
+      </w:r>
+    </w:p>
+    <w:p>
+      <w:pPr>
+        <w:pStyle w:val="Normal"/>
+        <w:jc w:val="both"/>
+        <w:rPr/>
+      </w:pPr>
+      <w:r>
+        <w:rPr>
+          <w:b w:val="false"/>
+          <w:i w:val="false"/>
+          <w:iCs w:val="false"/>
+          <w:sz w:val="22"/>
+          <w:szCs w:val="22"/>
+        </w:rPr>
+        <w:t>L</w:t>
+      </w:r>
+      <w:r>
+        <w:rPr>
+          <w:b w:val="false"/>
+          <w:i w:val="false"/>
+          <w:iCs w:val="false"/>
+          <w:sz w:val="22"/>
+          <w:szCs w:val="22"/>
+        </w:rPr>
+        <w:t xml:space="preserve">os modelos de árboles superan al canal endémico en F1, 0,965 contra 0,951, pero ninguno detecta más de 2 de los 3 inicios de brote de la prueba. </w:t>
+      </w:r>
+      <w:r>
+        <w:rPr/>
+        <w:t>Con tres inicios en dos municipios, cualquier diferencia en esa columna es de un caso, así que el límite está en la cantidad de transiciones del problema y no en la arquitectura del modelo. Para el horizonte T+2: LightGBM 0,920 con 2 de 3 inicios, XGBoost 0,918 con 1 de 3, GAM 0,854 con 0 de 3.</w:t>
       </w:r>
     </w:p>
     <w:p>
@@ -3086,7 +3873,7 @@
         <w:rPr/>
         <w:drawing>
           <wp:inline distT="0" distB="0" distL="0" distR="0">
-            <wp:extent cx="5303520" cy="2160905"/>
+            <wp:extent cx="4514215" cy="1839595"/>
             <wp:effectExtent l="0" t="0" r="0" b="0"/>
             <wp:docPr id="5" name="Picture 3"/>
             <wp:cNvGraphicFramePr>
@@ -3110,7 +3897,7 @@
                   <pic:spPr bwMode="auto">
                     <a:xfrm>
                       <a:off x="0" y="0"/>
-                      <a:ext cx="5303520" cy="2160905"/>
+                      <a:ext cx="4514215" cy="1839595"/>
                     </a:xfrm>
                     <a:prstGeom prst="rect">
                       <a:avLst/>
@@ -3164,26 +3951,6 @@
     <w:p>
       <w:pPr>
         <w:pStyle w:val="Normal"/>
-        <w:spacing w:before="0" w:after="120"/>
-        <w:jc w:val="both"/>
-        <w:rPr>
-          <w:rFonts w:ascii="Calibri" w:hAnsi="Calibri"/>
-          <w:b w:val="false"/>
-          <w:i w:val="false"/>
-          <w:sz w:val="22"/>
-        </w:rPr>
-      </w:pPr>
-      <w:r>
-        <w:rPr>
-          <w:b w:val="false"/>
-          <w:i w:val="false"/>
-          <w:sz w:val="22"/>
-        </w:rPr>
-      </w:r>
-    </w:p>
-    <w:p>
-      <w:pPr>
-        <w:pStyle w:val="Normal"/>
         <w:jc w:val="center"/>
         <w:rPr/>
       </w:pPr>
@@ -3191,7 +3958,7 @@
         <w:rPr/>
         <w:drawing>
           <wp:inline distT="0" distB="0" distL="0" distR="0">
-            <wp:extent cx="5029200" cy="2235200"/>
+            <wp:extent cx="4404360" cy="1957705"/>
             <wp:effectExtent l="0" t="0" r="0" b="0"/>
             <wp:docPr id="6" name="Picture 4"/>
             <wp:cNvGraphicFramePr>
@@ -3215,7 +3982,7 @@
                   <pic:spPr bwMode="auto">
                     <a:xfrm>
                       <a:off x="0" y="0"/>
-                      <a:ext cx="5029200" cy="2235200"/>
+                      <a:ext cx="4404360" cy="1957705"/>
                     </a:xfrm>
                     <a:prstGeom prst="rect">
                       <a:avLst/>
@@ -3387,7 +4154,15 @@
       </w:pPr>
       <w:r>
         <w:rPr/>
-        <w:t>POST /api/v2/monthly-runs — único disparador de inferencia. Recibe multipart/form-data: file (CSV con las 39 features de Bucaramanga y Cali) + reference_month (YYYY-MM). Municipios y horizontes no son parámetros; el alcance es fijo (68001, 76001) y siempre se calculan T+1 y T+2.</w:t>
+        <w:t xml:space="preserve">POST /api/v2/monthly-runs — único disparador de inferencia. Recibe multipart/form-data: file (CSV con las </w:t>
+      </w:r>
+      <w:r>
+        <w:rPr/>
+        <w:t xml:space="preserve">39 </w:t>
+      </w:r>
+      <w:r>
+        <w:rPr/>
+        <w:t>features de Bucaramanga y Cali) + reference_month (YYYY-MM). Municipios y horizontes no son parámetros; el alcance es fijo (68001, 76001) y siempre se calculan T+1 y T+2.</w:t>
       </w:r>
     </w:p>
     <w:p>
@@ -3406,7 +4181,9 @@
       </w:pPr>
       <w:r>
         <w:rPr/>
-        <w:t>GET /api/v2/predictions/latest — último resultado; filtros opcionales municipality_codes, horizons.</w:t>
+        <w:t xml:space="preserve">GET /api/v2/predictions/latest — último resultado; </w:t>
+        <w:br/>
+        <w:t>filtros opcionales: municipality_codes, horizons.</w:t>
       </w:r>
     </w:p>
     <w:p>
@@ -3463,7 +4240,15 @@
       </w:pPr>
       <w:r>
         <w:rPr/>
-        <w:t>GET /api/v2/health — disponibilidad de API, Champion y almacenamiento.</w:t>
+        <w:t xml:space="preserve">GET /api/v2/health — </w:t>
+      </w:r>
+      <w:r>
+        <w:rPr/>
+        <w:t>D</w:t>
+      </w:r>
+      <w:r>
+        <w:rPr/>
+        <w:t>isponibilidad de API, Champion y almacenamiento.</w:t>
       </w:r>
     </w:p>
     <w:p>
@@ -3550,7 +4335,15 @@
       </w:pPr>
       <w:r>
         <w:rPr/>
-        <w:t>Actualizar datos: sube un CSV + mes, ejecuta POST /monthly-runs y refresca; muestra el recibo del run o el error.</w:t>
+        <w:t xml:space="preserve">Actualizar datos: </w:t>
+      </w:r>
+      <w:r>
+        <w:rPr/>
+        <w:t>S</w:t>
+      </w:r>
+      <w:r>
+        <w:rPr/>
+        <w:t>ube un CSV + mes, ejecuta POST /monthly-runs y refresca; muestra el recibo del run o el error.</w:t>
       </w:r>
     </w:p>
     <w:p>
@@ -3694,7 +4487,25 @@
           <w:iCs/>
           <w:sz w:val="22"/>
         </w:rPr>
-        <w:t>Tablero predicciones</w:t>
+        <w:t xml:space="preserve">Tablero </w:t>
+      </w:r>
+      <w:r>
+        <w:rPr>
+          <w:b w:val="false"/>
+          <w:i/>
+          <w:iCs/>
+          <w:sz w:val="22"/>
+        </w:rPr>
+        <w:t xml:space="preserve">de </w:t>
+      </w:r>
+      <w:r>
+        <w:rPr>
+          <w:b w:val="false"/>
+          <w:i/>
+          <w:iCs/>
+          <w:sz w:val="22"/>
+        </w:rPr>
+        <w:t>predicciones</w:t>
       </w:r>
     </w:p>
     <w:p>
@@ -3853,7 +4664,7 @@
           <w:i w:val="false"/>
           <w:sz w:val="22"/>
         </w:rPr>
-        <w:t xml:space="preserve"> Granularidad mensual no capta dinámicas intra-mensuales necesarias para respuestas inmediatas, </w:t>
+        <w:t xml:space="preserve"> Granularidad mensual no capta dinámicas intra-mensuales necesarias para respuestas inmediatas; </w:t>
       </w:r>
       <w:r>
         <w:rPr>
@@ -3869,7 +4680,7 @@
           <w:i w:val="false"/>
           <w:sz w:val="22"/>
         </w:rPr>
-        <w:t xml:space="preserve">l clima (ERA5+CHIRPS) no aportó ganancia sustancial en AUROC; la lluvia pesa poco (coeficientes &lt; 0.06 en sus 4 rezagos) y el punto de rocío es la 3.ª variable más importante, </w:t>
+        <w:t xml:space="preserve">l clima (ERA5+CHIRPS) no aportó ganancia sustancial en AUROC; la lluvia pesa poco (coeficientes &lt; 0.06 en sus 4 rezagos) y el punto de rocío es la 3.ª variable más importante; </w:t>
       </w:r>
       <w:r>
         <w:rPr>
@@ -3912,7 +4723,7 @@
     </w:p>
     <w:tbl>
       <w:tblPr>
-        <w:tblW w:w="8842" w:type="dxa"/>
+        <w:tblW w:w="8835" w:type="dxa"/>
         <w:jc w:val="start"/>
         <w:tblInd w:w="28" w:type="dxa"/>
         <w:tblLayout w:type="fixed"/>
@@ -3924,9 +4735,8 @@
         </w:tblCellMar>
       </w:tblPr>
       <w:tblGrid>
-        <w:gridCol w:w="3099"/>
-        <w:gridCol w:w="3677"/>
-        <w:gridCol w:w="2066"/>
+        <w:gridCol w:w="3180"/>
+        <w:gridCol w:w="5655"/>
       </w:tblGrid>
       <w:tr>
         <w:trPr>
@@ -3935,7 +4745,7 @@
         </w:trPr>
         <w:tc>
           <w:tcPr>
-            <w:tcW w:w="3099" w:type="dxa"/>
+            <w:tcW w:w="3180" w:type="dxa"/>
             <w:tcBorders/>
             <w:vAlign w:val="center"/>
           </w:tcPr>
@@ -3955,41 +4765,19 @@
         </w:tc>
         <w:tc>
           <w:tcPr>
-            <w:tcW w:w="3677" w:type="dxa"/>
+            <w:tcW w:w="5655" w:type="dxa"/>
             <w:tcBorders/>
             <w:vAlign w:val="center"/>
           </w:tcPr>
           <w:p>
             <w:pPr>
               <w:pStyle w:val="TableHeading"/>
-              <w:suppressLineNumbers/>
               <w:spacing w:before="0" w:after="200"/>
-              <w:jc w:val="center"/>
               <w:rPr/>
             </w:pPr>
             <w:r>
               <w:rPr/>
-              <w:t>Correo</w:t>
-            </w:r>
-          </w:p>
-        </w:tc>
-        <w:tc>
-          <w:tcPr>
-            <w:tcW w:w="2066" w:type="dxa"/>
-            <w:tcBorders/>
-            <w:vAlign w:val="center"/>
-          </w:tcPr>
-          <w:p>
-            <w:pPr>
-              <w:pStyle w:val="TableHeading"/>
-              <w:suppressLineNumbers/>
-              <w:spacing w:before="0" w:after="200"/>
-              <w:jc w:val="center"/>
-              <w:rPr/>
-            </w:pPr>
-            <w:r>
-              <w:rPr/>
-              <w:t>Rol</w:t>
+              <w:t>Actividad</w:t>
             </w:r>
           </w:p>
         </w:tc>
@@ -3998,7 +4786,7 @@
         <w:trPr/>
         <w:tc>
           <w:tcPr>
-            <w:tcW w:w="3099" w:type="dxa"/>
+            <w:tcW w:w="3180" w:type="dxa"/>
             <w:tcBorders/>
             <w:vAlign w:val="center"/>
           </w:tcPr>
@@ -4018,45 +4806,27 @@
         </w:tc>
         <w:tc>
           <w:tcPr>
-            <w:tcW w:w="3677" w:type="dxa"/>
+            <w:tcW w:w="5655" w:type="dxa"/>
             <w:tcBorders/>
             <w:vAlign w:val="center"/>
           </w:tcPr>
           <w:p>
             <w:pPr>
               <w:pStyle w:val="TableContents"/>
-              <w:widowControl w:val="false"/>
-              <w:suppressLineNumbers/>
-              <w:spacing w:before="0" w:after="200"/>
-              <w:rPr/>
-            </w:pPr>
-            <w:hyperlink r:id="rId10">
-              <w:r>
-                <w:rPr>
-                  <w:rStyle w:val="Hyperlink"/>
-                </w:rPr>
-                <w:t>s.ramirezc2@uniandes.edu.co</w:t>
-              </w:r>
-            </w:hyperlink>
-          </w:p>
-        </w:tc>
-        <w:tc>
-          <w:tcPr>
-            <w:tcW w:w="2066" w:type="dxa"/>
-            <w:tcBorders/>
-            <w:vAlign w:val="center"/>
-          </w:tcPr>
-          <w:p>
-            <w:pPr>
-              <w:pStyle w:val="TableContents"/>
-              <w:widowControl w:val="false"/>
-              <w:suppressLineNumbers/>
               <w:spacing w:before="0" w:after="200"/>
               <w:rPr/>
             </w:pPr>
             <w:r>
               <w:rPr/>
-              <w:t>Ing. datos / DVC</w:t>
+              <w:t xml:space="preserve">Pipeline de datos, contrato de </w:t>
+            </w:r>
+            <w:r>
+              <w:rPr/>
+              <w:t>evaluación</w:t>
+            </w:r>
+            <w:r>
+              <w:rPr/>
+              <w:t>, baseline y posson, infraestructura ML Flow</w:t>
             </w:r>
           </w:p>
         </w:tc>
@@ -4065,7 +4835,7 @@
         <w:trPr/>
         <w:tc>
           <w:tcPr>
-            <w:tcW w:w="3099" w:type="dxa"/>
+            <w:tcW w:w="3180" w:type="dxa"/>
             <w:tcBorders/>
             <w:vAlign w:val="center"/>
           </w:tcPr>
@@ -4085,45 +4855,27 @@
         </w:tc>
         <w:tc>
           <w:tcPr>
-            <w:tcW w:w="3677" w:type="dxa"/>
+            <w:tcW w:w="5655" w:type="dxa"/>
             <w:tcBorders/>
             <w:vAlign w:val="center"/>
           </w:tcPr>
           <w:p>
             <w:pPr>
               <w:pStyle w:val="TableContents"/>
-              <w:widowControl w:val="false"/>
-              <w:suppressLineNumbers/>
-              <w:spacing w:before="0" w:after="200"/>
-              <w:rPr/>
-            </w:pPr>
-            <w:hyperlink r:id="rId11">
-              <w:r>
-                <w:rPr>
-                  <w:rStyle w:val="Hyperlink"/>
-                </w:rPr>
-                <w:t>n.larav@uniandes.edu.co</w:t>
-              </w:r>
-            </w:hyperlink>
-          </w:p>
-        </w:tc>
-        <w:tc>
-          <w:tcPr>
-            <w:tcW w:w="2066" w:type="dxa"/>
-            <w:tcBorders/>
-            <w:vAlign w:val="center"/>
-          </w:tcPr>
-          <w:p>
-            <w:pPr>
-              <w:pStyle w:val="TableContents"/>
-              <w:widowControl w:val="false"/>
-              <w:suppressLineNumbers/>
               <w:spacing w:before="0" w:after="200"/>
               <w:rPr/>
             </w:pPr>
             <w:r>
               <w:rPr/>
-              <w:t>Modelado / API</w:t>
+              <w:t xml:space="preserve">Modelado, XGBoost, LightGBM, GAM, </w:t>
+            </w:r>
+            <w:r>
+              <w:rPr/>
+              <w:t>calibración</w:t>
+            </w:r>
+            <w:r>
+              <w:rPr/>
+              <w:t xml:space="preserve"> y explicabilidad.</w:t>
             </w:r>
           </w:p>
         </w:tc>
@@ -4132,7 +4884,7 @@
         <w:trPr/>
         <w:tc>
           <w:tcPr>
-            <w:tcW w:w="3099" w:type="dxa"/>
+            <w:tcW w:w="3180" w:type="dxa"/>
             <w:tcBorders/>
             <w:vAlign w:val="center"/>
           </w:tcPr>
@@ -4152,45 +4904,19 @@
         </w:tc>
         <w:tc>
           <w:tcPr>
-            <w:tcW w:w="3677" w:type="dxa"/>
+            <w:tcW w:w="5655" w:type="dxa"/>
             <w:tcBorders/>
             <w:vAlign w:val="center"/>
           </w:tcPr>
           <w:p>
             <w:pPr>
               <w:pStyle w:val="TableContents"/>
-              <w:widowControl w:val="false"/>
-              <w:suppressLineNumbers/>
-              <w:spacing w:before="0" w:after="200"/>
-              <w:rPr/>
-            </w:pPr>
-            <w:hyperlink r:id="rId12">
-              <w:r>
-                <w:rPr>
-                  <w:rStyle w:val="Hyperlink"/>
-                </w:rPr>
-                <w:t>jm.rodrigueza1@uniandes.edu.co</w:t>
-              </w:r>
-            </w:hyperlink>
-          </w:p>
-        </w:tc>
-        <w:tc>
-          <w:tcPr>
-            <w:tcW w:w="2066" w:type="dxa"/>
-            <w:tcBorders/>
-            <w:vAlign w:val="center"/>
-          </w:tcPr>
-          <w:p>
-            <w:pPr>
-              <w:pStyle w:val="TableContents"/>
-              <w:widowControl w:val="false"/>
-              <w:suppressLineNumbers/>
               <w:spacing w:before="0" w:after="200"/>
               <w:rPr/>
             </w:pPr>
             <w:r>
               <w:rPr/>
-              <w:t>Frontend / Infra</w:t>
+              <w:t>API FastAPI, tablero y arquitectura de integracion</w:t>
             </w:r>
           </w:p>
         </w:tc>
@@ -4199,7 +4925,7 @@
         <w:trPr/>
         <w:tc>
           <w:tcPr>
-            <w:tcW w:w="3099" w:type="dxa"/>
+            <w:tcW w:w="3180" w:type="dxa"/>
             <w:tcBorders/>
             <w:vAlign w:val="center"/>
           </w:tcPr>
@@ -4219,45 +4945,27 @@
         </w:tc>
         <w:tc>
           <w:tcPr>
-            <w:tcW w:w="3677" w:type="dxa"/>
+            <w:tcW w:w="5655" w:type="dxa"/>
             <w:tcBorders/>
             <w:vAlign w:val="center"/>
           </w:tcPr>
           <w:p>
             <w:pPr>
               <w:pStyle w:val="TableContents"/>
-              <w:widowControl w:val="false"/>
-              <w:suppressLineNumbers/>
-              <w:spacing w:before="0" w:after="200"/>
-              <w:rPr/>
-            </w:pPr>
-            <w:hyperlink r:id="rId13">
-              <w:r>
-                <w:rPr>
-                  <w:rStyle w:val="Hyperlink"/>
-                </w:rPr>
-                <w:t>sa.ballesteros@uniandes.edu.co</w:t>
-              </w:r>
-            </w:hyperlink>
-          </w:p>
-        </w:tc>
-        <w:tc>
-          <w:tcPr>
-            <w:tcW w:w="2066" w:type="dxa"/>
-            <w:tcBorders/>
-            <w:vAlign w:val="center"/>
-          </w:tcPr>
-          <w:p>
-            <w:pPr>
-              <w:pStyle w:val="TableContents"/>
-              <w:widowControl w:val="false"/>
-              <w:suppressLineNumbers/>
               <w:spacing w:before="0" w:after="200"/>
               <w:rPr/>
             </w:pPr>
             <w:r>
               <w:rPr/>
-              <w:t>EDA / Features</w:t>
+              <w:t xml:space="preserve">EDA, fuentes DANE y </w:t>
+            </w:r>
+            <w:r>
+              <w:rPr/>
+              <w:t>consolidación</w:t>
+            </w:r>
+            <w:r>
+              <w:rPr/>
+              <w:t xml:space="preserve"> reporte</w:t>
             </w:r>
           </w:p>
         </w:tc>

</xml_diff>

<commit_message>
docs: alinea el reporte con los resultados registrados en MLflow
La seccion de conclusiones conservaba los numeros de la particion anterior y contradecia la Tabla 1: reportaba 2.329 inicios y 22% de deteccion cuando la tabla dice 3 inicios y 2 de 3. Corrige los numeros de T+2, la calibracion (Platt, no isotonica), los umbrales de los cinco modelos, que eran de la corrida vieja, y la frase que atribuia la seleccion del umbral al conjunto de prueba. Elimina las figuras 3 y 4, que graficaban la particion vieja, y renumera la restante. Aclara que los eventos 210 y 220 no se suman. Restituye curso, grupo, integrantes y fecha. Quedan 9 paginas.
</commit_message>
<xml_diff>
--- a/Reporte_Entrega2.docx
+++ b/Reporte_Entrega2.docx
@@ -49,6 +49,98 @@
           <w:sz w:val="28"/>
         </w:rPr>
         <w:t>Entrega 2</w:t>
+      </w:r>
+    </w:p>
+    <w:p>
+      <w:pPr>
+        <w:pStyle w:val="Normal"/>
+        <w:jc w:val="start"/>
+        <w:rPr/>
+      </w:pPr>
+      <w:r>
+        <w:rPr>
+          <w:b w:val="false"/>
+          <w:i/>
+          <w:sz w:val="28"/>
+        </w:rPr>
+        <w:t>Proyecto de Desarrollo de Soluciones — MAIA, Universidad de los Andes</w:t>
+      </w:r>
+      <w:r>
+        <w:rPr>
+          <w:b/>
+          <w:i w:val="false"/>
+          <w:color w:val="1654A2"/>
+          <w:sz w:val="28"/>
+        </w:rPr>
+      </w:r>
+    </w:p>
+    <w:p>
+      <w:pPr>
+        <w:pStyle w:val="Normal"/>
+        <w:jc w:val="start"/>
+        <w:rPr/>
+      </w:pPr>
+      <w:r>
+        <w:rPr>
+          <w:b w:val="false"/>
+          <w:i/>
+          <w:sz w:val="28"/>
+        </w:rPr>
+        <w:t>Grupo 19</w:t>
+      </w:r>
+      <w:r>
+        <w:rPr>
+          <w:b/>
+          <w:i w:val="false"/>
+          <w:color w:val="1654A2"/>
+          <w:sz w:val="28"/>
+        </w:rPr>
+      </w:r>
+    </w:p>
+    <w:p>
+      <w:pPr>
+        <w:pStyle w:val="Normal"/>
+        <w:jc w:val="start"/>
+        <w:rPr/>
+      </w:pPr>
+      <w:r>
+        <w:rPr>
+          <w:b w:val="false"/>
+          <w:i/>
+          <w:sz w:val="28"/>
+        </w:rPr>
+        <w:t>Sergio Ballesteros Suárez · Stevan Ramirez Cajamarca · Nicolás Steven Lara Villa · Jersson Mauricio Rodríguez Aponte</w:t>
+      </w:r>
+      <w:r>
+        <w:rPr>
+          <w:b/>
+          <w:i w:val="false"/>
+          <w:color w:val="1654A2"/>
+          <w:sz w:val="28"/>
+        </w:rPr>
+      </w:r>
+    </w:p>
+    <w:p>
+      <w:pPr>
+        <w:pStyle w:val="Normal"/>
+        <w:jc w:val="start"/>
+        <w:rPr/>
+      </w:pPr>
+      <w:r>
+        <w:rPr>
+          <w:b w:val="false"/>
+          <w:i/>
+          <w:sz w:val="28"/>
+        </w:rPr>
+        <w:t>Septiembre de 2026</w:t>
+      </w:r>
+      <w:r>
+        <w:rPr>
+          <w:b/>
+          <w:i w:val="false"/>
+          <w:color w:val="1654A2"/>
+          <w:sz w:val="28"/>
+        </w:rPr>
       </w:r>
     </w:p>
     <w:p>
@@ -478,87 +570,76 @@
           <w:i w:val="false"/>
           <w:sz w:val="22"/>
         </w:rPr>
-        <w:t xml:space="preserve">SIVIGILA 2007-2025 </w:t>
-      </w:r>
-      <w:r>
-        <w:rPr>
-          <w:b w:val="false"/>
-          <w:i w:val="false"/>
-          <w:sz w:val="22"/>
-        </w:rPr>
-        <w:t>microdatos - Dengue</w:t>
-      </w:r>
-      <w:r>
-        <w:rPr>
-          <w:b w:val="false"/>
-          <w:i w:val="false"/>
-          <w:sz w:val="22"/>
-        </w:rPr>
-        <w:t xml:space="preserve">. Se utilizaron los registros de dengue total. El dataset procesado contiene 253.992 filas </w:t>
-      </w:r>
-      <w:r>
-        <w:rPr>
-          <w:b w:val="false"/>
-          <w:i w:val="false"/>
-          <w:sz w:val="22"/>
-        </w:rPr>
-        <w:t>agrupad</w:t>
-      </w:r>
-      <w:r>
-        <w:rPr>
-          <w:b w:val="false"/>
-          <w:i w:val="false"/>
-          <w:sz w:val="22"/>
-        </w:rPr>
-        <w:t>as</w:t>
-      </w:r>
-      <w:r>
-        <w:rPr>
-          <w:b w:val="false"/>
-          <w:i w:val="false"/>
-          <w:sz w:val="22"/>
-        </w:rPr>
-        <w:t xml:space="preserve"> por </w:t>
-      </w:r>
-      <w:r>
-        <w:rPr>
-          <w:b w:val="false"/>
-          <w:i w:val="false"/>
-          <w:sz w:val="22"/>
-        </w:rPr>
-        <w:t>municipio-mes para 1.114 municipios</w:t>
-      </w:r>
-      <w:r>
-        <w:rPr>
-          <w:b w:val="false"/>
-          <w:i w:val="false"/>
-          <w:sz w:val="22"/>
-        </w:rPr>
-        <w:t xml:space="preserve"> con la fecha de inicio de </w:t>
+        <w:t>SIVIGILA 2007-2025 microdatos. Se utilizaron los registros del evento 210 (dengue), que no se suman con los del evento 220 (dengue grave): son dos eventos de notificación distintos y el segundo entra como variable predictora, no como objetivo. El dataset procesado contiene 253.992 filas agrupadas por municipio-mes para 1.114 municipios, con la fecha de inicio de síntomas como fuente de verdad para la asignación temporal de los casos.</w:t>
+      </w:r>
+      <w:r>
+        <w:rPr>
+          <w:b w:val="false"/>
+          <w:i w:val="false"/>
+          <w:sz w:val="22"/>
+        </w:rPr>
+      </w:r>
+      <w:r>
+        <w:rPr>
+          <w:b w:val="false"/>
+          <w:i w:val="false"/>
+          <w:sz w:val="22"/>
+        </w:rPr>
+      </w:r>
+      <w:r>
+        <w:rPr>
+          <w:b w:val="false"/>
+          <w:i w:val="false"/>
+          <w:sz w:val="22"/>
+        </w:rPr>
+      </w:r>
+      <w:r>
+        <w:rPr>
+          <w:b w:val="false"/>
+          <w:i w:val="false"/>
+          <w:sz w:val="22"/>
+        </w:rPr>
+      </w:r>
+      <w:r>
+        <w:rPr>
+          <w:b w:val="false"/>
+          <w:i w:val="false"/>
+          <w:sz w:val="22"/>
+        </w:rPr>
+      </w:r>
+      <w:r>
+        <w:rPr>
+          <w:b w:val="false"/>
+          <w:i w:val="false"/>
+          <w:sz w:val="22"/>
+        </w:rPr>
+      </w:r>
+      <w:r>
+        <w:rPr>
+          <w:b w:val="false"/>
+          <w:i w:val="false"/>
+          <w:sz w:val="22"/>
+        </w:rPr>
       </w:r>
       <w:r>
         <w:rPr/>
-        <w:t>síntomas</w:t>
-      </w:r>
-      <w:r>
-        <w:rPr>
-          <w:b w:val="false"/>
-          <w:i w:val="false"/>
-          <w:sz w:val="22"/>
-        </w:rPr>
-        <w:t xml:space="preserve"> como nuestra fuente de verdad para la </w:t>
+      </w:r>
+      <w:r>
+        <w:rPr>
+          <w:b w:val="false"/>
+          <w:i w:val="false"/>
+          <w:sz w:val="22"/>
+        </w:rPr>
       </w:r>
       <w:r>
         <w:rPr/>
-        <w:t>asignación</w:t>
-      </w:r>
-      <w:r>
-        <w:rPr>
-          <w:b w:val="false"/>
-          <w:i w:val="false"/>
-          <w:sz w:val="22"/>
-        </w:rPr>
-        <w:t xml:space="preserve"> temporal de casos.</w:t>
+      </w:r>
+      <w:r>
+        <w:rPr>
+          <w:b w:val="false"/>
+          <w:i w:val="false"/>
+          <w:sz w:val="22"/>
+        </w:rPr>
       </w:r>
     </w:p>
     <w:p>
@@ -578,83 +659,73 @@
           <w:i w:val="false"/>
           <w:sz w:val="22"/>
         </w:rPr>
-        <w:t xml:space="preserve">Google </w:t>
-      </w:r>
-      <w:r>
-        <w:rPr>
-          <w:b w:val="false"/>
-          <w:i w:val="false"/>
-          <w:sz w:val="22"/>
-        </w:rPr>
-        <w:t>E</w:t>
-      </w:r>
-      <w:r>
-        <w:rPr>
-          <w:b w:val="false"/>
-          <w:i w:val="false"/>
-          <w:sz w:val="22"/>
-        </w:rPr>
-        <w:t>arth</w:t>
-      </w:r>
-      <w:r>
-        <w:rPr>
-          <w:b w:val="false"/>
-          <w:i w:val="false"/>
-          <w:sz w:val="22"/>
-        </w:rPr>
-        <w:t xml:space="preserve"> </w:t>
-      </w:r>
-      <w:r>
-        <w:rPr>
-          <w:b w:val="false"/>
-          <w:i w:val="false"/>
-          <w:sz w:val="22"/>
-        </w:rPr>
-        <w:t>E</w:t>
-      </w:r>
-      <w:r>
-        <w:rPr>
-          <w:b w:val="false"/>
-          <w:i w:val="false"/>
-          <w:sz w:val="22"/>
-        </w:rPr>
-        <w:t>ngine CHRI</w:t>
-      </w:r>
-      <w:r>
-        <w:rPr>
-          <w:b w:val="false"/>
-          <w:i w:val="false"/>
-          <w:sz w:val="22"/>
-        </w:rPr>
-        <w:t>P</w:t>
-      </w:r>
-      <w:r>
-        <w:rPr>
-          <w:b w:val="false"/>
-          <w:i w:val="false"/>
-          <w:sz w:val="22"/>
-        </w:rPr>
-        <w:t>S</w:t>
-      </w:r>
-      <w:r>
-        <w:rPr>
-          <w:b w:val="false"/>
-          <w:i w:val="false"/>
-          <w:sz w:val="22"/>
-        </w:rPr>
-        <w:t xml:space="preserve"> para variables de lluvia agrupadas de forma mensual y ERA5 para variables </w:t>
+        <w:t>Google Earth Engine, CHIRPS para variables de lluvia agrupadas de forma mensual y ERA5 para variables meteorológicas de clima y humedad.</w:t>
+      </w:r>
+      <w:r>
+        <w:rPr>
+          <w:b w:val="false"/>
+          <w:i w:val="false"/>
+          <w:sz w:val="22"/>
+        </w:rPr>
+      </w:r>
+      <w:r>
+        <w:rPr>
+          <w:b w:val="false"/>
+          <w:i w:val="false"/>
+          <w:sz w:val="22"/>
+        </w:rPr>
+      </w:r>
+      <w:r>
+        <w:rPr>
+          <w:b w:val="false"/>
+          <w:i w:val="false"/>
+          <w:sz w:val="22"/>
+        </w:rPr>
+      </w:r>
+      <w:r>
+        <w:rPr>
+          <w:b w:val="false"/>
+          <w:i w:val="false"/>
+          <w:sz w:val="22"/>
+        </w:rPr>
+      </w:r>
+      <w:r>
+        <w:rPr>
+          <w:b w:val="false"/>
+          <w:i w:val="false"/>
+          <w:sz w:val="22"/>
+        </w:rPr>
+      </w:r>
+      <w:r>
+        <w:rPr>
+          <w:b w:val="false"/>
+          <w:i w:val="false"/>
+          <w:sz w:val="22"/>
+        </w:rPr>
+      </w:r>
+      <w:r>
+        <w:rPr>
+          <w:b w:val="false"/>
+          <w:i w:val="false"/>
+          <w:sz w:val="22"/>
+        </w:rPr>
+      </w:r>
+      <w:r>
+        <w:rPr>
+          <w:b w:val="false"/>
+          <w:i w:val="false"/>
+          <w:sz w:val="22"/>
+        </w:rPr>
       </w:r>
       <w:r>
         <w:rPr/>
-        <w:t>meteorológicas</w:t>
-      </w:r>
-      <w:r>
-        <w:rPr>
-          <w:b w:val="false"/>
-          <w:i w:val="false"/>
-          <w:sz w:val="22"/>
-        </w:rPr>
-        <w:t xml:space="preserve"> de clima, humedad.</w:t>
+      </w:r>
+      <w:r>
+        <w:rPr>
+          <w:b w:val="false"/>
+          <w:i w:val="false"/>
+          <w:sz w:val="22"/>
+        </w:rPr>
       </w:r>
     </w:p>
     <w:p>
@@ -761,183 +832,159 @@
           <w:i w:val="false"/>
           <w:sz w:val="22"/>
         </w:rPr>
-        <w:t>Est</w:t>
-      </w:r>
-      <w:r>
-        <w:rPr>
-          <w:b w:val="false"/>
-          <w:i w:val="false"/>
-          <w:sz w:val="22"/>
-        </w:rPr>
-        <w:t>os</w:t>
-      </w:r>
-      <w:r>
-        <w:rPr>
-          <w:b w:val="false"/>
-          <w:i w:val="false"/>
-          <w:sz w:val="22"/>
-        </w:rPr>
-        <w:t xml:space="preserve"> cambio</w:t>
-      </w:r>
-      <w:r>
-        <w:rPr>
-          <w:b w:val="false"/>
-          <w:i w:val="false"/>
-          <w:sz w:val="22"/>
-        </w:rPr>
-        <w:t>s</w:t>
-      </w:r>
-      <w:r>
-        <w:rPr>
-          <w:b w:val="false"/>
-          <w:i w:val="false"/>
-          <w:sz w:val="22"/>
-        </w:rPr>
-        <w:t xml:space="preserve"> nos permite</w:t>
-      </w:r>
-      <w:r>
-        <w:rPr>
-          <w:b w:val="false"/>
-          <w:i w:val="false"/>
-          <w:sz w:val="22"/>
-        </w:rPr>
-        <w:t>n</w:t>
-      </w:r>
-      <w:r>
-        <w:rPr>
-          <w:b w:val="false"/>
-          <w:i w:val="false"/>
-          <w:sz w:val="22"/>
-        </w:rPr>
-        <w:t xml:space="preserve"> determinar con una mayor </w:t>
+        <w:t>Estos cambios permiten determinar con mayor precisión las alertas tempranas: casos_clasico_roll3 aporta la tendencia reciente de los casos y el cambio de objetivo da una base mucho más amplia para analizar.</w:t>
+      </w:r>
+      <w:r>
+        <w:rPr>
+          <w:b w:val="false"/>
+          <w:i w:val="false"/>
+          <w:sz w:val="22"/>
+        </w:rPr>
+      </w:r>
+      <w:r>
+        <w:rPr>
+          <w:b w:val="false"/>
+          <w:i w:val="false"/>
+          <w:sz w:val="22"/>
+        </w:rPr>
+      </w:r>
+      <w:r>
+        <w:rPr>
+          <w:b w:val="false"/>
+          <w:i w:val="false"/>
+          <w:sz w:val="22"/>
+        </w:rPr>
+      </w:r>
+      <w:r>
+        <w:rPr>
+          <w:b w:val="false"/>
+          <w:i w:val="false"/>
+          <w:sz w:val="22"/>
+        </w:rPr>
+      </w:r>
+      <w:r>
+        <w:rPr>
+          <w:b w:val="false"/>
+          <w:i w:val="false"/>
+          <w:sz w:val="22"/>
+        </w:rPr>
+      </w:r>
+      <w:r>
+        <w:rPr>
+          <w:b w:val="false"/>
+          <w:i w:val="false"/>
+          <w:sz w:val="22"/>
+        </w:rPr>
       </w:r>
       <w:r>
         <w:rPr/>
-        <w:t>precisión</w:t>
-      </w:r>
-      <w:r>
-        <w:rPr>
-          <w:b w:val="false"/>
-          <w:i w:val="false"/>
-          <w:sz w:val="22"/>
-        </w:rPr>
-        <w:t xml:space="preserve"> las alertas tempranas </w:t>
-      </w:r>
-      <w:r>
-        <w:rPr>
-          <w:b w:val="false"/>
-          <w:i w:val="false"/>
-          <w:sz w:val="22"/>
-        </w:rPr>
-        <w:t>y su acceleraci</w:t>
+      </w:r>
+      <w:r>
+        <w:rPr>
+          <w:b w:val="false"/>
+          <w:i w:val="false"/>
+          <w:sz w:val="22"/>
+        </w:rPr>
+      </w:r>
+      <w:r>
+        <w:rPr>
+          <w:b w:val="false"/>
+          <w:i w:val="false"/>
+          <w:sz w:val="22"/>
+        </w:rPr>
       </w:r>
       <w:r>
         <w:rPr/>
-        <w:t>ó</w:t>
-      </w:r>
-      <w:r>
-        <w:rPr>
-          <w:b w:val="false"/>
-          <w:i w:val="false"/>
-          <w:sz w:val="22"/>
-        </w:rPr>
-        <w:t>n casos_clasicos_roll3</w:t>
-      </w:r>
-      <w:r>
-        <w:rPr>
-          <w:b w:val="false"/>
-          <w:i w:val="false"/>
-          <w:sz w:val="22"/>
-        </w:rPr>
-        <w:t>, deb</w:t>
-      </w:r>
-      <w:r>
-        <w:rPr>
-          <w:b w:val="false"/>
-          <w:i w:val="false"/>
-          <w:sz w:val="22"/>
-        </w:rPr>
-        <w:t>i</w:t>
-      </w:r>
-      <w:r>
-        <w:rPr>
-          <w:b w:val="false"/>
-          <w:i w:val="false"/>
-          <w:sz w:val="22"/>
-        </w:rPr>
-        <w:t xml:space="preserve">do a que tenemos una base </w:t>
+      </w:r>
+      <w:r>
+        <w:rPr>
+          <w:b w:val="false"/>
+          <w:i w:val="false"/>
+          <w:sz w:val="22"/>
+        </w:rPr>
+      </w:r>
+      <w:r>
+        <w:rPr>
+          <w:b w:val="false"/>
+          <w:i w:val="false"/>
+          <w:sz w:val="22"/>
+        </w:rPr>
+      </w:r>
+      <w:r>
+        <w:rPr>
+          <w:b w:val="false"/>
+          <w:i w:val="false"/>
+          <w:sz w:val="22"/>
+        </w:rPr>
+      </w:r>
+      <w:r>
+        <w:rPr>
+          <w:b w:val="false"/>
+          <w:i w:val="false"/>
+          <w:sz w:val="22"/>
+        </w:rPr>
       </w:r>
       <w:r>
         <w:rPr/>
-        <w:t>más</w:t>
-      </w:r>
-      <w:r>
-        <w:rPr>
-          <w:b w:val="false"/>
-          <w:i w:val="false"/>
-          <w:sz w:val="22"/>
-        </w:rPr>
-        <w:t xml:space="preserve"> a</w:t>
-      </w:r>
-      <w:r>
-        <w:rPr>
-          <w:b w:val="false"/>
-          <w:i w:val="false"/>
-          <w:sz w:val="22"/>
-        </w:rPr>
-        <w:t>m</w:t>
-      </w:r>
-      <w:r>
-        <w:rPr>
-          <w:b w:val="false"/>
-          <w:i w:val="false"/>
-          <w:sz w:val="22"/>
-        </w:rPr>
-        <w:t xml:space="preserve">plia para analizar </w:t>
-      </w:r>
-      <w:r>
-        <w:rPr>
-          <w:b w:val="false"/>
-          <w:i w:val="false"/>
-          <w:sz w:val="22"/>
-        </w:rPr>
-        <w:t xml:space="preserve">y mejorar la </w:t>
+      </w:r>
+      <w:r>
+        <w:rPr>
+          <w:b w:val="false"/>
+          <w:i w:val="false"/>
+          <w:sz w:val="22"/>
+        </w:rPr>
+      </w:r>
+      <w:r>
+        <w:rPr>
+          <w:b w:val="false"/>
+          <w:i w:val="false"/>
+          <w:sz w:val="22"/>
+        </w:rPr>
+      </w:r>
+      <w:r>
+        <w:rPr>
+          <w:b w:val="false"/>
+          <w:i w:val="false"/>
+          <w:sz w:val="22"/>
+        </w:rPr>
+      </w:r>
+      <w:r>
+        <w:rPr>
+          <w:b w:val="false"/>
+          <w:i w:val="false"/>
+          <w:sz w:val="22"/>
+        </w:rPr>
       </w:r>
       <w:r>
         <w:rPr/>
-        <w:t>predicción</w:t>
-      </w:r>
-      <w:r>
-        <w:rPr>
-          <w:b w:val="false"/>
-          <w:i w:val="false"/>
-          <w:sz w:val="22"/>
-        </w:rPr>
-        <w:t xml:space="preserve"> de </w:t>
-      </w:r>
-      <w:r>
-        <w:rPr>
-          <w:b w:val="false"/>
-          <w:i w:val="false"/>
-          <w:sz w:val="22"/>
-        </w:rPr>
-        <w:t>brote</w:t>
-      </w:r>
-      <w:r>
-        <w:rPr>
-          <w:b w:val="false"/>
-          <w:i w:val="false"/>
-          <w:sz w:val="22"/>
-        </w:rPr>
-        <w:t>s</w:t>
-      </w:r>
-      <w:r>
-        <w:rPr>
-          <w:b w:val="false"/>
-          <w:i w:val="false"/>
-          <w:sz w:val="22"/>
-        </w:rPr>
-        <w:t xml:space="preserve"> de forma anticipada.</w:t>
+      </w:r>
+      <w:r>
+        <w:rPr>
+          <w:b w:val="false"/>
+          <w:i w:val="false"/>
+          <w:sz w:val="22"/>
+        </w:rPr>
+      </w:r>
+      <w:r>
+        <w:rPr>
+          <w:b w:val="false"/>
+          <w:i w:val="false"/>
+          <w:sz w:val="22"/>
+        </w:rPr>
+      </w:r>
+      <w:r>
+        <w:rPr>
+          <w:b w:val="false"/>
+          <w:i w:val="false"/>
+          <w:sz w:val="22"/>
+        </w:rPr>
+      </w:r>
+      <w:r>
+        <w:rPr>
+          <w:b w:val="false"/>
+          <w:i w:val="false"/>
+          <w:sz w:val="22"/>
+        </w:rPr>
       </w:r>
     </w:p>
     <w:p>
@@ -1212,7 +1259,7 @@
           <w:i w:val="false"/>
           <w:sz w:val="22"/>
         </w:rPr>
-        <w:t>La variable objetivo es la función de predicción objetivo, definida como si habrá brote (casos_clasico &gt; p75) en el mes t+1.</w:t>
+        <w:t>La variable objetivo indica si habrá brote (casos_clasico &gt; p75) en el mes t+1.</w:t>
       </w:r>
     </w:p>
     <w:p>
@@ -1645,111 +1692,98 @@
           <w:i w:val="false"/>
           <w:sz w:val="22"/>
         </w:rPr>
-        <w:t xml:space="preserve">Se entrenaron cinco modelos sobre la misma partición temporal: entrenamiento </w:t>
-      </w:r>
-      <w:r>
-        <w:rPr>
-          <w:b w:val="false"/>
-          <w:i w:val="false"/>
-          <w:sz w:val="22"/>
-        </w:rPr>
-        <w:t>de</w:t>
-      </w:r>
-      <w:r>
-        <w:rPr>
-          <w:b w:val="false"/>
-          <w:i w:val="false"/>
-          <w:sz w:val="22"/>
-        </w:rPr>
-        <w:t xml:space="preserve"> 2007 </w:t>
-      </w:r>
-      <w:r>
-        <w:rPr>
-          <w:b w:val="false"/>
-          <w:i w:val="false"/>
-          <w:sz w:val="22"/>
-        </w:rPr>
-        <w:t xml:space="preserve">a </w:t>
-      </w:r>
-      <w:r>
-        <w:rPr>
-          <w:b w:val="false"/>
-          <w:i w:val="false"/>
-          <w:sz w:val="22"/>
-        </w:rPr>
-        <w:t>202</w:t>
-      </w:r>
-      <w:r>
-        <w:rPr>
-          <w:b w:val="false"/>
-          <w:i w:val="false"/>
-          <w:sz w:val="22"/>
-        </w:rPr>
-        <w:t>2</w:t>
-      </w:r>
-      <w:r>
-        <w:rPr>
-          <w:b w:val="false"/>
-          <w:i w:val="false"/>
-          <w:sz w:val="22"/>
-        </w:rPr>
-        <w:t>, prueba</w:t>
-      </w:r>
-      <w:r>
-        <w:rPr>
-          <w:b w:val="false"/>
-          <w:i w:val="false"/>
-          <w:sz w:val="22"/>
-        </w:rPr>
-        <w:t>s</w:t>
-      </w:r>
-      <w:r>
-        <w:rPr>
-          <w:b w:val="false"/>
-          <w:i w:val="false"/>
-          <w:sz w:val="22"/>
-        </w:rPr>
-        <w:t xml:space="preserve"> 202</w:t>
-      </w:r>
-      <w:r>
-        <w:rPr>
-          <w:b w:val="false"/>
-          <w:i w:val="false"/>
-          <w:sz w:val="22"/>
-        </w:rPr>
-        <w:t>3</w:t>
-      </w:r>
-      <w:r>
-        <w:rPr>
-          <w:b w:val="false"/>
-          <w:i w:val="false"/>
-          <w:sz w:val="22"/>
-        </w:rPr>
-        <w:t xml:space="preserve"> - </w:t>
-      </w:r>
-      <w:r>
-        <w:rPr>
-          <w:b w:val="false"/>
-          <w:i w:val="false"/>
-          <w:sz w:val="22"/>
-        </w:rPr>
-        <w:t>2025</w:t>
-      </w:r>
-      <w:r>
-        <w:rPr>
-          <w:b w:val="false"/>
-          <w:i w:val="false"/>
-          <w:sz w:val="22"/>
-        </w:rPr>
-        <w:t xml:space="preserve"> para selección de umbral. La variable objetivo en todos los casos es brote (casos_clasico &gt; P75); </w:t>
-      </w:r>
-      <w:r>
-        <w:rPr>
-          <w:b w:val="false"/>
-          <w:i w:val="false"/>
-          <w:sz w:val="22"/>
-        </w:rPr>
-        <w:t>l</w:t>
+        <w:t>Se entrenaron cinco modelos sobre la misma partición temporal: entrenamiento de 2007 a 2022 y prueba de 2023 a 2025, que se evaluó una sola vez al final. La variable objetivo en todos los casos es brote (casos_clasico &gt; P75). El umbral de decisión de cada modelo se eligió maximizando F1 sobre el conjunto de validación, tomado de los últimos años del entrenamiento, y queda registrado en MLflow junto con su corrida. Los baselines y el modelo Poisson se evaluaron además con validación cruzada de ventana expansiva sobre el periodo 2015-2022.</w:t>
+      </w:r>
+      <w:r>
+        <w:rPr>
+          <w:b w:val="false"/>
+          <w:i w:val="false"/>
+          <w:sz w:val="22"/>
+        </w:rPr>
+      </w:r>
+      <w:r>
+        <w:rPr>
+          <w:b w:val="false"/>
+          <w:i w:val="false"/>
+          <w:sz w:val="22"/>
+        </w:rPr>
+      </w:r>
+      <w:r>
+        <w:rPr>
+          <w:b w:val="false"/>
+          <w:i w:val="false"/>
+          <w:sz w:val="22"/>
+        </w:rPr>
+      </w:r>
+      <w:r>
+        <w:rPr>
+          <w:b w:val="false"/>
+          <w:i w:val="false"/>
+          <w:sz w:val="22"/>
+        </w:rPr>
+      </w:r>
+      <w:r>
+        <w:rPr>
+          <w:b w:val="false"/>
+          <w:i w:val="false"/>
+          <w:sz w:val="22"/>
+        </w:rPr>
+      </w:r>
+      <w:r>
+        <w:rPr>
+          <w:b w:val="false"/>
+          <w:i w:val="false"/>
+          <w:sz w:val="22"/>
+        </w:rPr>
+      </w:r>
+      <w:r>
+        <w:rPr>
+          <w:b w:val="false"/>
+          <w:i w:val="false"/>
+          <w:sz w:val="22"/>
+        </w:rPr>
+      </w:r>
+      <w:r>
+        <w:rPr>
+          <w:b w:val="false"/>
+          <w:i w:val="false"/>
+          <w:sz w:val="22"/>
+        </w:rPr>
+      </w:r>
+      <w:r>
+        <w:rPr>
+          <w:b w:val="false"/>
+          <w:i w:val="false"/>
+          <w:sz w:val="22"/>
+        </w:rPr>
+      </w:r>
+      <w:r>
+        <w:rPr>
+          <w:b w:val="false"/>
+          <w:i w:val="false"/>
+          <w:sz w:val="22"/>
+        </w:rPr>
+      </w:r>
+      <w:r>
+        <w:rPr>
+          <w:b w:val="false"/>
+          <w:i w:val="false"/>
+          <w:sz w:val="22"/>
+        </w:rPr>
+      </w:r>
+      <w:r>
+        <w:rPr>
+          <w:b w:val="false"/>
+          <w:i w:val="false"/>
+          <w:sz w:val="22"/>
+        </w:rPr>
+      </w:r>
+      <w:r>
+        <w:rPr>
+          <w:b w:val="false"/>
+          <w:i w:val="false"/>
+          <w:sz w:val="22"/>
+        </w:rPr>
       </w:r>
       <w:r>
         <w:rPr>
@@ -1760,14 +1794,12 @@
           <w:smallCaps w:val="false"/>
           <w:sz w:val="22"/>
         </w:rPr>
-        <w:t>selección de hiperparámetros</w:t>
       </w:r>
       <w:r>
         <w:rPr>
           <w:caps w:val="false"/>
           <w:smallCaps w:val="false"/>
         </w:rPr>
-        <w:t> </w:t>
       </w:r>
       <w:r>
         <w:rPr>
@@ -1778,15 +1810,13 @@
           <w:smallCaps w:val="false"/>
           <w:sz w:val="22"/>
         </w:rPr>
-        <w:t>se hizo con validación</w:t>
-      </w:r>
-      <w:r>
-        <w:rPr>
-          <w:b w:val="false"/>
-          <w:i w:val="false"/>
-          <w:sz w:val="22"/>
-        </w:rPr>
-        <w:t xml:space="preserve"> cruzada de ventana expansiva sobre el periodo 2015-2022.</w:t>
+      </w:r>
+      <w:r>
+        <w:rPr>
+          <w:b w:val="false"/>
+          <w:i w:val="false"/>
+          <w:sz w:val="22"/>
+        </w:rPr>
       </w:r>
     </w:p>
     <w:p>
@@ -1810,7 +1840,7 @@
           <w:i w:val="false"/>
           <w:sz w:val="22"/>
         </w:rPr>
-        <w:t>XGBoost: clasificador de gradient boosting con 400 estimadores, profundidad máxima 6, learning rate 0,05 y scale_pos_weight 5,42 para el desbalance de clases. Early stopping en 30 rondas sobre AUCPR determinó 109 iteraciones óptimas. Umbral calibrado en 0.61, maximizando F1 en validación.</w:t>
+        <w:t>Clasificador de gradient boosting con 400 estimadores, profundidad máxima 6, learning rate 0,05 y scale_pos_weight para compensar el desbalance de clases, con early stopping sobre AUCPR.</w:t>
       </w:r>
     </w:p>
     <w:p>
@@ -1834,7 +1864,7 @@
           <w:i w:val="false"/>
           <w:sz w:val="22"/>
         </w:rPr>
-        <w:t>Gradient boosting implementado con LightGBM, arquitectura basada en histogramas con 63 hojas por árbol y early stopping a 30 rondas. Significativamente más rápido que XGBoost para el mismo volumen de datos. Umbral óptimo 0,49.</w:t>
+        <w:t>Gradient boosting con arquitectura basada en histogramas, 63 hojas por árbol y early stopping a 30 rondas. Significativamente más rápido que XGBoost para el mismo volumen de datos.</w:t>
       </w:r>
     </w:p>
     <w:p>
@@ -1858,7 +1888,7 @@
           <w:i w:val="false"/>
           <w:sz w:val="22"/>
         </w:rPr>
-        <w:t>Modelo de ensemble por bagging con 500 árboles, profundidad máxima 12 y mínimo de 20 muestras por hoja. Sirve como referencia de bagging frente al boosting de los modelos anteriores. Umbral óptimo 0,60.</w:t>
+        <w:t>Ensemble por bagging con 500 árboles, profundidad máxima 12 y mínimo de 20 muestras por hoja. Sirve como referencia de bagging frente al boosting de los modelos anteriores.</w:t>
       </w:r>
     </w:p>
     <w:p>
@@ -1882,15 +1912,15 @@
           <w:i w:val="false"/>
           <w:sz w:val="22"/>
         </w:rPr>
-        <w:t xml:space="preserve"> Logistica. </w:t>
-      </w:r>
-      <w:r>
-        <w:rPr>
-          <w:b w:val="false"/>
-          <w:i w:val="false"/>
-          <w:sz w:val="22"/>
-        </w:rPr>
-        <w:t>Referencia lineal con regularización L2 (C=0,1) y pesos balanceados por clase. Permite cuantificar el aporte de la no linealidad del modelo ganador. Umbral 0,63.</w:t>
+        <w:t xml:space="preserve"> Logística. </w:t>
+      </w:r>
+      <w:r>
+        <w:rPr>
+          <w:b w:val="false"/>
+          <w:i w:val="false"/>
+          <w:sz w:val="22"/>
+        </w:rPr>
+        <w:t>Referencia lineal con regularización L2 (C=0,1) y pesos balanceados por clase. Permite cuantificar el aporte de la no linealidad del modelo ganador.</w:t>
       </w:r>
     </w:p>
     <w:p>
@@ -1938,23 +1968,21 @@
           <w:i w:val="false"/>
           <w:sz w:val="22"/>
         </w:rPr>
-        <w:t>Se entrenó adicionalmente un modelo XGBoost T+2 (horizonte de dos meses) con AUROC=0.871, AP=0.840 y F1=0.758, lo que representa una degradación esperada respecto a T+1 dado el mayor horizonte de predicción. Ambos modelos T+1 y T+2 incluyen calibración isotónica post-hoc (IsotonicRegression sobre el conjunto de validación 2022-202</w:t>
-      </w:r>
-      <w:r>
-        <w:rPr>
-          <w:b w:val="false"/>
-          <w:i w:val="false"/>
-          <w:sz w:val="22"/>
-        </w:rPr>
-        <w:t>4</w:t>
-      </w:r>
-      <w:r>
-        <w:rPr>
-          <w:b w:val="false"/>
-          <w:i w:val="false"/>
-          <w:sz w:val="22"/>
-        </w:rPr>
-        <w:t xml:space="preserve"> que reduce el error de calibración Brier de XGBoost en un 24% (0.1248→0.0947) y el de LightGBM en un 17% (0.1154→0.0954), habilitando el reporte de probabilidades estadísticamente válidas en el tablero de predicciones (campo probability del contrato de API v1.1.0).</w:t>
+        <w:t>Se entrenó adicionalmente un modelo XGBoost con horizonte de dos meses. Sobre el conjunto de prueba restringido a Bucaramanga y Cali, LightGBM obtiene F1 0,920 y detecta 2 de los 3 inicios, y XGBoost obtiene 0,918 y detecta 1, una degradación esperada respecto a T+1 dado el mayor horizonte. Ambos modelos incluyen calibración post-hoc por Platt scaling ajustada sobre el conjunto de validación, lo que habilita reportar probabilidades en el tablero (campo probability del contrato de API).</w:t>
+      </w:r>
+      <w:r>
+        <w:rPr>
+          <w:b w:val="false"/>
+          <w:i w:val="false"/>
+          <w:sz w:val="22"/>
+        </w:rPr>
+      </w:r>
+      <w:r>
+        <w:rPr>
+          <w:b w:val="false"/>
+          <w:i w:val="false"/>
+          <w:sz w:val="22"/>
+        </w:rPr>
       </w:r>
     </w:p>
     <w:p>
@@ -2302,75 +2330,66 @@
           <w:i w:val="false"/>
           <w:sz w:val="22"/>
         </w:rPr>
-        <w:t>La Tabla 1 resume el desempeño de todos los modelos sobre el conjunto de prueba 202</w:t>
-      </w:r>
-      <w:r>
-        <w:rPr>
-          <w:b w:val="false"/>
-          <w:i w:val="false"/>
-          <w:sz w:val="22"/>
-        </w:rPr>
-        <w:t>3</w:t>
-      </w:r>
-      <w:r>
-        <w:rPr>
-          <w:b w:val="false"/>
-          <w:i w:val="false"/>
-          <w:sz w:val="22"/>
-        </w:rPr>
-        <w:t xml:space="preserve">-2025, </w:t>
-      </w:r>
-      <w:r>
-        <w:rPr>
-          <w:b w:val="false"/>
-          <w:i w:val="false"/>
-          <w:sz w:val="22"/>
-        </w:rPr>
-        <w:t xml:space="preserve">restringido a Bucaramanga y Cali, con 70 meses de </w:t>
+        <w:t>La Tabla 1 resume el desempeño de todos los modelos sobre el conjunto de prueba 2023-2025, restringido a Bucaramanga y Cali, con 70 meses de observación, de los cuales 42 están en estado de exceso (brote) y 3 de ellos son inicio de brote.</w:t>
+      </w:r>
+      <w:r>
+        <w:rPr>
+          <w:b w:val="false"/>
+          <w:i w:val="false"/>
+          <w:sz w:val="22"/>
+        </w:rPr>
+      </w:r>
+      <w:r>
+        <w:rPr>
+          <w:b w:val="false"/>
+          <w:i w:val="false"/>
+          <w:sz w:val="22"/>
+        </w:rPr>
+      </w:r>
+      <w:r>
+        <w:rPr>
+          <w:b w:val="false"/>
+          <w:i w:val="false"/>
+          <w:sz w:val="22"/>
+        </w:rPr>
       </w:r>
       <w:r>
         <w:rPr/>
-        <w:t xml:space="preserve">observación, </w:t>
-      </w:r>
-      <w:r>
-        <w:rPr>
-          <w:b w:val="false"/>
-          <w:i w:val="false"/>
-          <w:sz w:val="22"/>
-        </w:rPr>
-        <w:t xml:space="preserve"> de lo</w:t>
-      </w:r>
-      <w:r>
-        <w:rPr>
-          <w:b w:val="false"/>
-          <w:i w:val="false"/>
-          <w:sz w:val="22"/>
-        </w:rPr>
-        <w:t>s</w:t>
-      </w:r>
-      <w:r>
-        <w:rPr>
-          <w:b w:val="false"/>
-          <w:i w:val="false"/>
-          <w:sz w:val="22"/>
-        </w:rPr>
-        <w:t xml:space="preserve"> </w:t>
-      </w:r>
-      <w:r>
-        <w:rPr>
-          <w:b w:val="false"/>
-          <w:i w:val="false"/>
-          <w:sz w:val="22"/>
-        </w:rPr>
-        <w:t>c</w:t>
-      </w:r>
-      <w:r>
-        <w:rPr>
-          <w:b w:val="false"/>
-          <w:i w:val="false"/>
-          <w:sz w:val="22"/>
-        </w:rPr>
-        <w:t>uales 42 en estado de exceso (brote) y de ellos inicio.</w:t>
+      </w:r>
+      <w:r>
+        <w:rPr>
+          <w:b w:val="false"/>
+          <w:i w:val="false"/>
+          <w:sz w:val="22"/>
+        </w:rPr>
+      </w:r>
+      <w:r>
+        <w:rPr>
+          <w:b w:val="false"/>
+          <w:i w:val="false"/>
+          <w:sz w:val="22"/>
+        </w:rPr>
+      </w:r>
+      <w:r>
+        <w:rPr>
+          <w:b w:val="false"/>
+          <w:i w:val="false"/>
+          <w:sz w:val="22"/>
+        </w:rPr>
+      </w:r>
+      <w:r>
+        <w:rPr>
+          <w:b w:val="false"/>
+          <w:i w:val="false"/>
+          <w:sz w:val="22"/>
+        </w:rPr>
+      </w:r>
+      <w:r>
+        <w:rPr>
+          <w:b w:val="false"/>
+          <w:i w:val="false"/>
+          <w:sz w:val="22"/>
+        </w:rPr>
       </w:r>
     </w:p>
     <w:tbl>
@@ -2949,7 +2968,7 @@
                 <w:szCs w:val="22"/>
                 <w:lang w:val="en-US" w:eastAsia="en-US" w:bidi="ar-SA"/>
               </w:rPr>
-              <w:t>C. endemico</w:t>
+              <w:t>Canal endémico</w:t>
             </w:r>
           </w:p>
         </w:tc>
@@ -3317,7 +3336,7 @@
                 <w:szCs w:val="22"/>
                 <w:lang w:val="en-US" w:eastAsia="en-US" w:bidi="ar-SA"/>
               </w:rPr>
-              <w:t>Possion</w:t>
+              <w:t>Poisson</w:t>
             </w:r>
           </w:p>
         </w:tc>
@@ -3668,7 +3687,7 @@
                 <w:szCs w:val="20"/>
                 <w:lang w:val="en-US" w:eastAsia="en-US" w:bidi="ar-SA"/>
               </w:rPr>
-              <w:t>Siempre Alerta</w:t>
+              <w:t>Siempre alerta</w:t>
             </w:r>
           </w:p>
         </w:tc>
@@ -3763,7 +3782,7 @@
                 <w:szCs w:val="22"/>
                 <w:lang w:val="en-US" w:eastAsia="en-US" w:bidi="ar-SA"/>
               </w:rPr>
-              <w:t>3/3 (100)</w:t>
+              <w:t>3/3 (100%)</w:t>
             </w:r>
           </w:p>
         </w:tc>
@@ -3861,155 +3880,6 @@
       <w:r>
         <w:rPr/>
         <w:t>Con tres inicios en dos municipios, cualquier diferencia en esa columna es de un caso, así que el límite está en la cantidad de transiciones del problema y no en la arquitectura del modelo. Para el horizonte T+2: LightGBM 0,920 con 2 de 3 inicios, XGBoost 0,918 con 1 de 3, GAM 0,854 con 0 de 3.</w:t>
-      </w:r>
-    </w:p>
-    <w:p>
-      <w:pPr>
-        <w:pStyle w:val="Normal"/>
-        <w:jc w:val="center"/>
-        <w:rPr/>
-      </w:pPr>
-      <w:r>
-        <w:rPr/>
-        <w:drawing>
-          <wp:inline distT="0" distB="0" distL="0" distR="0">
-            <wp:extent cx="4514215" cy="1839595"/>
-            <wp:effectExtent l="0" t="0" r="0" b="0"/>
-            <wp:docPr id="5" name="Picture 3"/>
-            <wp:cNvGraphicFramePr>
-              <a:graphicFrameLocks xmlns:a="http://schemas.openxmlformats.org/drawingml/2006/main" noChangeAspect="1"/>
-            </wp:cNvGraphicFramePr>
-            <a:graphic xmlns:a="http://schemas.openxmlformats.org/drawingml/2006/main">
-              <a:graphicData uri="http://schemas.openxmlformats.org/drawingml/2006/picture">
-                <pic:pic xmlns:pic="http://schemas.openxmlformats.org/drawingml/2006/picture">
-                  <pic:nvPicPr>
-                    <pic:cNvPr id="5" name="Picture 3"/>
-                    <pic:cNvPicPr>
-                      <a:picLocks noChangeAspect="1" noChangeArrowheads="1"/>
-                    </pic:cNvPicPr>
-                  </pic:nvPicPr>
-                  <pic:blipFill>
-                    <a:blip r:embed="rId6"/>
-                    <a:stretch>
-                      <a:fillRect/>
-                    </a:stretch>
-                  </pic:blipFill>
-                  <pic:spPr bwMode="auto">
-                    <a:xfrm>
-                      <a:off x="0" y="0"/>
-                      <a:ext cx="4514215" cy="1839595"/>
-                    </a:xfrm>
-                    <a:prstGeom prst="rect">
-                      <a:avLst/>
-                    </a:prstGeom>
-                    <a:noFill/>
-                  </pic:spPr>
-                </pic:pic>
-              </a:graphicData>
-            </a:graphic>
-          </wp:inline>
-        </w:drawing>
-      </w:r>
-    </w:p>
-    <w:p>
-      <w:pPr>
-        <w:pStyle w:val="Normal"/>
-        <w:spacing w:before="0" w:after="200"/>
-        <w:jc w:val="center"/>
-        <w:rPr/>
-      </w:pPr>
-      <w:r>
-        <w:rPr>
-          <w:b w:val="false"/>
-          <w:i/>
-          <w:sz w:val="18"/>
-        </w:rPr>
-        <w:t>Figura 3. Curvas ROC (izq.) y Precisión-Recall (der.) para XGBoost y Regresión Logística sobre el conjunto de prueba 2024-2025.</w:t>
-      </w:r>
-    </w:p>
-    <w:p>
-      <w:pPr>
-        <w:pStyle w:val="Normal"/>
-        <w:spacing w:before="0" w:after="120"/>
-        <w:jc w:val="both"/>
-        <w:rPr>
-          <w:rFonts w:ascii="Calibri" w:hAnsi="Calibri"/>
-          <w:b w:val="false"/>
-          <w:i w:val="false"/>
-          <w:sz w:val="22"/>
-        </w:rPr>
-      </w:pPr>
-      <w:r>
-        <w:rPr>
-          <w:b w:val="false"/>
-          <w:i w:val="false"/>
-          <w:sz w:val="22"/>
-        </w:rPr>
-        <w:t>La Figura 4 muestra el hallazgo más relevante desde la perspectiva del negocio: el porcentaje de inicios de brote detectados por cada modelo. La persistencia (práctica actual) detecta 0% de los inicios, ya que por definición solo puede confirmar un brote en curso, nunca anticiparlo. El canal endémico detecta el 18%. XGBoost y LightGBM alcanzan el 32% y 28% respectivamente, casi el doble que la práctica actual. Este es el valor agregado real del modelo: anticipar el inicio de un episodio epidémico con al menos un mes de antelación.</w:t>
-      </w:r>
-    </w:p>
-    <w:p>
-      <w:pPr>
-        <w:pStyle w:val="Normal"/>
-        <w:jc w:val="center"/>
-        <w:rPr/>
-      </w:pPr>
-      <w:r>
-        <w:rPr/>
-        <w:drawing>
-          <wp:inline distT="0" distB="0" distL="0" distR="0">
-            <wp:extent cx="4404360" cy="1957705"/>
-            <wp:effectExtent l="0" t="0" r="0" b="0"/>
-            <wp:docPr id="6" name="Picture 4"/>
-            <wp:cNvGraphicFramePr>
-              <a:graphicFrameLocks xmlns:a="http://schemas.openxmlformats.org/drawingml/2006/main" noChangeAspect="1"/>
-            </wp:cNvGraphicFramePr>
-            <a:graphic xmlns:a="http://schemas.openxmlformats.org/drawingml/2006/main">
-              <a:graphicData uri="http://schemas.openxmlformats.org/drawingml/2006/picture">
-                <pic:pic xmlns:pic="http://schemas.openxmlformats.org/drawingml/2006/picture">
-                  <pic:nvPicPr>
-                    <pic:cNvPr id="6" name="Picture 4"/>
-                    <pic:cNvPicPr>
-                      <a:picLocks noChangeAspect="1" noChangeArrowheads="1"/>
-                    </pic:cNvPicPr>
-                  </pic:nvPicPr>
-                  <pic:blipFill>
-                    <a:blip r:embed="rId7"/>
-                    <a:stretch>
-                      <a:fillRect/>
-                    </a:stretch>
-                  </pic:blipFill>
-                  <pic:spPr bwMode="auto">
-                    <a:xfrm>
-                      <a:off x="0" y="0"/>
-                      <a:ext cx="4404360" cy="1957705"/>
-                    </a:xfrm>
-                    <a:prstGeom prst="rect">
-                      <a:avLst/>
-                    </a:prstGeom>
-                    <a:noFill/>
-                  </pic:spPr>
-                </pic:pic>
-              </a:graphicData>
-            </a:graphic>
-          </wp:inline>
-        </w:drawing>
-      </w:r>
-    </w:p>
-    <w:p>
-      <w:pPr>
-        <w:pStyle w:val="Normal"/>
-        <w:spacing w:before="0" w:after="200"/>
-        <w:jc w:val="center"/>
-        <w:rPr/>
-      </w:pPr>
-      <w:r>
-        <w:rPr>
-          <w:b w:val="false"/>
-          <w:i/>
-          <w:sz w:val="18"/>
-        </w:rPr>
-        <w:t>Figura 4. Porcentaje de meses de inicio de brote (es_inicio=1) detectados por XGBoost y LightGBM (modelos de mayor desempeño) frente al canal endémico y la persistencia (métodos de referencia). Conjunto de prueba 2024-2025.</w:t>
       </w:r>
     </w:p>
     <w:p>
@@ -4078,7 +3948,7 @@
           <w:i/>
           <w:sz w:val="18"/>
         </w:rPr>
-        <w:t>Figura 5. Importancia de features (gain) del modelo XGBoost. Las variables de tendencia reciente dominan, seguidas por el estado del canal endémico y la estacionalidad.</w:t>
+        <w:t>Figura 3. Importancia de features (gain) del modelo XGBoost. Las variables de tendencia reciente dominan, seguidas por el estado del canal endémico y la estacionalidad.</w:t>
       </w:r>
     </w:p>
     <w:p>
@@ -4574,7 +4444,7 @@
           <w:i w:val="false"/>
           <w:sz w:val="22"/>
         </w:rPr>
-        <w:t xml:space="preserve"> XGBoost y LightGBM, con AUROC ≈ 0.90 y métricas casi idénticas. La paridad indica que el techo actual es de información, no de arquitectura: las 39 features (clima ERA5+CHIRPS con 96.3 % de cobertura, estado de brote actual y sus lags, variables del canal endémico) ya capturan casi toda la señal accesible.</w:t>
+        <w:t xml:space="preserve"> XGBoost y LightGBM son los modelos de mejor desempeño y sus métricas son casi idénticas. La paridad indica que el techo actual es de información y no de arquitectura: las 41 predictoras del panel, de las cuales el champion usa 39 (clima ERA5+CHIRPS con 96,3% de cobertura, estado de brote actual y sus rezagos, y variables del canal endémico), ya capturan casi toda la señal accesible.</w:t>
       </w:r>
     </w:p>
     <w:p>
@@ -4604,7 +4474,7 @@
           <w:i w:val="false"/>
           <w:sz w:val="22"/>
         </w:rPr>
-        <w:t xml:space="preserve"> detección de inicios de brote. Sobre 2.329 meses de inicio en el período de prueba, la práctica actual (persistencia) detecta 0 % y XGBoost ≈ 22 % (casi el doble que el canal endémico). En términos operativos: una secretaría de salud podría anticipar cerca de un tercio de los episodios epidémicos antes de que se consoliden, frente a ninguno con la herramienta actual.</w:t>
+        <w:t xml:space="preserve"> de los 3 inicios de brote del conjunto de prueba, XGBoost y LightGBM detectan 2, exactamente los mismos que el canal endémico, que es la herramienta que las secretarías de salud ya usan sin modelo de por medio. La persistencia no detecta ninguno. Los modelos igualan la práctica actual en la métrica que importa para una alerta temprana, pero no la superan. Con solo 3 inicios en dos municipios cualquier diferencia en esa columna es de un caso, así que el límite está en la cantidad de transiciones que tiene el problema a escala mensual y no en la arquitectura del modelo.</w:t>
       </w:r>
     </w:p>
     <w:p>
@@ -4634,7 +4504,7 @@
           <w:i w:val="false"/>
           <w:sz w:val="22"/>
         </w:rPr>
-        <w:t xml:space="preserve"> AUROC 0.871, AP 0.840, F1 0.758 (F1 0.909 en Bucaramanga y en Cali), con degradación aceptable frente a T+1.</w:t>
+        <w:t xml:space="preserve"> LightGBM obtiene F1 0,920 y detecta 2 de los 3 inicios; XGBoost obtiene 0,918 y detecta 1. La degradación frente a T+1 es moderada, lo que sugiere que ampliar el horizonte de anticipación es viable.</w:t>
       </w:r>
     </w:p>
     <w:p>
@@ -4664,39 +4534,35 @@
           <w:i w:val="false"/>
           <w:sz w:val="22"/>
         </w:rPr>
-        <w:t xml:space="preserve"> Granularidad mensual no capta dinámicas intra-mensuales necesarias para respuestas inmediatas; </w:t>
-      </w:r>
-      <w:r>
-        <w:rPr>
-          <w:b w:val="false"/>
-          <w:i w:val="false"/>
-          <w:sz w:val="22"/>
-        </w:rPr>
-        <w:t>e</w:t>
-      </w:r>
-      <w:r>
-        <w:rPr>
-          <w:b w:val="false"/>
-          <w:i w:val="false"/>
-          <w:sz w:val="22"/>
-        </w:rPr>
-        <w:t xml:space="preserve">l clima (ERA5+CHIRPS) no aportó ganancia sustancial en AUROC; la lluvia pesa poco (coeficientes &lt; 0.06 en sus 4 rezagos) y el punto de rocío es la 3.ª variable más importante; </w:t>
-      </w:r>
-      <w:r>
-        <w:rPr>
-          <w:b w:val="false"/>
-          <w:i w:val="false"/>
-          <w:sz w:val="22"/>
-        </w:rPr>
-        <w:t>e</w:t>
-      </w:r>
-      <w:r>
-        <w:rPr>
-          <w:b w:val="false"/>
-          <w:i w:val="false"/>
-          <w:sz w:val="22"/>
-        </w:rPr>
-        <w:t>l período de prueba 2024–2025 tuvo 43 % de tasa de brote (vs. 14–23 % histórico): año epidémico severo que probablemente sesga las métricas de prueba al alza frente a años típicos.</w:t>
+        <w:t xml:space="preserve"> la granularidad mensual no capta dinámicas intra-mensuales necesarias para respuestas inmediatas; el clima aporta por humedad y temperatura pero no por lluvia, cuyos cuatro rezagos tienen coeficientes por debajo de 0,06 mientras el punto de rocío es la tercera variable más importante; y el conjunto de prueba tiene 60% de meses en brote (42 de 70), muy por encima del 14% de la validación, porque 2024 fue epidémico todo el año, lo que probablemente sesga las métricas al alza frente a años típicos.</w:t>
+      </w:r>
+      <w:r>
+        <w:rPr>
+          <w:b w:val="false"/>
+          <w:i w:val="false"/>
+          <w:sz w:val="22"/>
+        </w:rPr>
+      </w:r>
+      <w:r>
+        <w:rPr>
+          <w:b w:val="false"/>
+          <w:i w:val="false"/>
+          <w:sz w:val="22"/>
+        </w:rPr>
+      </w:r>
+      <w:r>
+        <w:rPr>
+          <w:b w:val="false"/>
+          <w:i w:val="false"/>
+          <w:sz w:val="22"/>
+        </w:rPr>
+      </w:r>
+      <w:r>
+        <w:rPr>
+          <w:b w:val="false"/>
+          <w:i w:val="false"/>
+          <w:sz w:val="22"/>
+        </w:rPr>
       </w:r>
     </w:p>
     <w:p>
@@ -4800,7 +4666,7 @@
             </w:pPr>
             <w:r>
               <w:rPr/>
-              <w:t>Stevan Ramírez Cajamarca</w:t>
+              <w:t>Stevan Ramirez Cajamarca</w:t>
             </w:r>
           </w:p>
         </w:tc>
@@ -4826,7 +4692,7 @@
             </w:r>
             <w:r>
               <w:rPr/>
-              <w:t>, baseline y posson, infraestructura ML Flow</w:t>
+              <w:t>, baselines y Poisson, infraestructura MLflow</w:t>
             </w:r>
           </w:p>
         </w:tc>
@@ -4916,7 +4782,7 @@
             </w:pPr>
             <w:r>
               <w:rPr/>
-              <w:t>API FastAPI, tablero y arquitectura de integracion</w:t>
+              <w:t>API FastAPI, tablero y arquitectura de integración</w:t>
             </w:r>
           </w:p>
         </w:tc>

</xml_diff>